<commit_message>
Edits and comments to grant, added papers
</commit_message>
<xml_diff>
--- a/Documents /AlexFisher.2026_Full_Research_Proposal AAV.docx
+++ b/Documents /AlexFisher.2026_Full_Research_Proposal AAV.docx
@@ -34,6 +34,7 @@
           <w:szCs w:val="22"/>
         </w:rPr>
       </w:pPr>
+      <w:proofErr w:type="gramStart"/>
       <w:r>
         <w:rPr>
           <w:rFonts w:eastAsia="Arial"/>
@@ -42,7 +43,18 @@
           <w:sz w:val="22"/>
           <w:szCs w:val="22"/>
         </w:rPr>
-        <w:t>Full  Grant Proposal</w:t>
+        <w:t>Full  Grant</w:t>
+      </w:r>
+      <w:proofErr w:type="gramEnd"/>
+      <w:r>
+        <w:rPr>
+          <w:rFonts w:eastAsia="Arial"/>
+          <w:b/>
+          <w:color w:val="000000"/>
+          <w:sz w:val="22"/>
+          <w:szCs w:val="22"/>
+        </w:rPr>
+        <w:t xml:space="preserve"> Proposal</w:t>
       </w:r>
       <w:r>
         <w:rPr>
@@ -231,6 +243,24 @@
         </w:rPr>
         <w:t xml:space="preserve">roject:  </w:t>
       </w:r>
+      <w:commentRangeStart w:id="0"/>
+      <w:ins w:id="1" w:author="Kelsey McCune" w:date="2026-04-08T10:36:00Z" w16du:dateUtc="2026-04-08T15:36:00Z">
+        <w:r>
+          <w:rPr>
+            <w:bCs/>
+            <w:sz w:val="22"/>
+            <w:szCs w:val="22"/>
+          </w:rPr>
+          <w:t>Testing the role of backyard activities on zoonotic disease in birds</w:t>
+        </w:r>
+        <w:commentRangeEnd w:id="0"/>
+        <w:r>
+          <w:rPr>
+            <w:rStyle w:val="CommentReference"/>
+          </w:rPr>
+          <w:commentReference w:id="0"/>
+        </w:r>
+      </w:ins>
     </w:p>
     <w:p>
       <w:pPr>
@@ -731,20 +761,238 @@
     </w:p>
     <w:p>
       <w:pPr>
-        <w:rPr>
-          <w:sz w:val="22"/>
-          <w:szCs w:val="22"/>
-        </w:rPr>
-      </w:pPr>
-      <w:r>
-        <w:rPr>
-          <w:sz w:val="22"/>
-          <w:szCs w:val="22"/>
-        </w:rPr>
-        <w:t xml:space="preserve">Urbanization and anthropogenic activities continue to change natural landscapes, creating new opportunities for wildlife, people, and domestic animals to interact with one another in proximity.  The human-wildlife interface can be defined as any given space where contact occurs between humans, domestic animals, and wildlife as well as their shared space, resources and diseases (Hassell et al. 2017). As interactions in these interfaces become more frequent, improving our understanding of how anthropogenic change continues to impact the ecological and health dynamics between wildlife and </w:t>
-      </w:r>
-      <w:commentRangeStart w:id="0"/>
-      <w:commentRangeStart w:id="1"/>
+        <w:ind w:firstLine="720"/>
+        <w:rPr>
+          <w:ins w:id="2" w:author="Kelsey McCune" w:date="2026-04-08T10:41:00Z" w16du:dateUtc="2026-04-08T15:41:00Z"/>
+          <w:sz w:val="22"/>
+          <w:szCs w:val="22"/>
+        </w:rPr>
+      </w:pPr>
+      <w:r>
+        <w:rPr>
+          <w:sz w:val="22"/>
+          <w:szCs w:val="22"/>
+        </w:rPr>
+        <w:t>Urbanization and anthropogenic activities continue to change natural landscapes, creating new opportunities for wildlife, people, and domestic animals to interact</w:t>
+      </w:r>
+      <w:del w:id="3" w:author="Kelsey McCune" w:date="2026-04-08T10:37:00Z" w16du:dateUtc="2026-04-08T15:37:00Z">
+        <w:r>
+          <w:rPr>
+            <w:sz w:val="22"/>
+            <w:szCs w:val="22"/>
+          </w:rPr>
+          <w:delText xml:space="preserve"> with one another in proximity</w:delText>
+        </w:r>
+      </w:del>
+      <w:r>
+        <w:rPr>
+          <w:sz w:val="22"/>
+          <w:szCs w:val="22"/>
+        </w:rPr>
+        <w:t xml:space="preserve">. </w:t>
+      </w:r>
+      <w:del w:id="4" w:author="Kelsey McCune" w:date="2026-04-08T10:43:00Z" w16du:dateUtc="2026-04-08T15:43:00Z">
+        <w:r>
+          <w:rPr>
+            <w:sz w:val="22"/>
+            <w:szCs w:val="22"/>
+          </w:rPr>
+          <w:delText xml:space="preserve"> </w:delText>
+        </w:r>
+      </w:del>
+      <w:r>
+        <w:rPr>
+          <w:sz w:val="22"/>
+          <w:szCs w:val="22"/>
+        </w:rPr>
+        <w:t>The human-wildlife interface can be defined as any given space where contact occurs between humans, domestic animals, and wildlife</w:t>
+      </w:r>
+      <w:ins w:id="5" w:author="Kelsey McCune" w:date="2026-04-08T10:50:00Z" w16du:dateUtc="2026-04-08T15:50:00Z">
+        <w:r>
+          <w:rPr>
+            <w:sz w:val="22"/>
+            <w:szCs w:val="22"/>
+          </w:rPr>
+          <w:t>,</w:t>
+        </w:r>
+      </w:ins>
+      <w:r>
+        <w:rPr>
+          <w:sz w:val="22"/>
+          <w:szCs w:val="22"/>
+        </w:rPr>
+        <w:t xml:space="preserve"> </w:t>
+      </w:r>
+      <w:del w:id="6" w:author="Kelsey McCune" w:date="2026-04-08T10:38:00Z" w16du:dateUtc="2026-04-08T15:38:00Z">
+        <w:r>
+          <w:rPr>
+            <w:sz w:val="22"/>
+            <w:szCs w:val="22"/>
+          </w:rPr>
+          <w:delText>as well as</w:delText>
+        </w:r>
+      </w:del>
+      <w:ins w:id="7" w:author="Kelsey McCune" w:date="2026-04-08T10:38:00Z" w16du:dateUtc="2026-04-08T15:38:00Z">
+        <w:r>
+          <w:rPr>
+            <w:sz w:val="22"/>
+            <w:szCs w:val="22"/>
+          </w:rPr>
+          <w:t>including</w:t>
+        </w:r>
+      </w:ins>
+      <w:r>
+        <w:rPr>
+          <w:sz w:val="22"/>
+          <w:szCs w:val="22"/>
+        </w:rPr>
+        <w:t xml:space="preserve"> their shared space</w:t>
+      </w:r>
+      <w:ins w:id="8" w:author="Kelsey McCune" w:date="2026-04-08T10:37:00Z" w16du:dateUtc="2026-04-08T15:37:00Z">
+        <w:r>
+          <w:rPr>
+            <w:sz w:val="22"/>
+            <w:szCs w:val="22"/>
+          </w:rPr>
+          <w:t xml:space="preserve"> and</w:t>
+        </w:r>
+      </w:ins>
+      <w:del w:id="9" w:author="Kelsey McCune" w:date="2026-04-08T10:37:00Z" w16du:dateUtc="2026-04-08T15:37:00Z">
+        <w:r>
+          <w:rPr>
+            <w:sz w:val="22"/>
+            <w:szCs w:val="22"/>
+          </w:rPr>
+          <w:delText>,</w:delText>
+        </w:r>
+      </w:del>
+      <w:r>
+        <w:rPr>
+          <w:sz w:val="22"/>
+          <w:szCs w:val="22"/>
+        </w:rPr>
+        <w:t xml:space="preserve"> resource</w:t>
+      </w:r>
+      <w:ins w:id="10" w:author="Kelsey McCune" w:date="2026-04-08T10:37:00Z" w16du:dateUtc="2026-04-08T15:37:00Z">
+        <w:r>
+          <w:rPr>
+            <w:sz w:val="22"/>
+            <w:szCs w:val="22"/>
+          </w:rPr>
+          <w:t xml:space="preserve"> use,</w:t>
+        </w:r>
+      </w:ins>
+      <w:del w:id="11" w:author="Kelsey McCune" w:date="2026-04-08T10:37:00Z" w16du:dateUtc="2026-04-08T15:37:00Z">
+        <w:r>
+          <w:rPr>
+            <w:sz w:val="22"/>
+            <w:szCs w:val="22"/>
+          </w:rPr>
+          <w:delText>s</w:delText>
+        </w:r>
+      </w:del>
+      <w:r>
+        <w:rPr>
+          <w:sz w:val="22"/>
+          <w:szCs w:val="22"/>
+        </w:rPr>
+        <w:t xml:space="preserve"> </w:t>
+      </w:r>
+      <w:ins w:id="12" w:author="Kelsey McCune" w:date="2026-04-08T10:37:00Z" w16du:dateUtc="2026-04-08T15:37:00Z">
+        <w:r>
+          <w:rPr>
+            <w:sz w:val="22"/>
+            <w:szCs w:val="22"/>
+          </w:rPr>
+          <w:t>or</w:t>
+        </w:r>
+      </w:ins>
+      <w:del w:id="13" w:author="Kelsey McCune" w:date="2026-04-08T10:37:00Z" w16du:dateUtc="2026-04-08T15:37:00Z">
+        <w:r>
+          <w:rPr>
+            <w:sz w:val="22"/>
+            <w:szCs w:val="22"/>
+          </w:rPr>
+          <w:delText>and</w:delText>
+        </w:r>
+      </w:del>
+      <w:r>
+        <w:rPr>
+          <w:sz w:val="22"/>
+          <w:szCs w:val="22"/>
+        </w:rPr>
+        <w:t xml:space="preserve"> diseases (Hassell et al. 2017). </w:t>
+      </w:r>
+      <w:moveToRangeStart w:id="14" w:author="Kelsey McCune" w:date="2026-04-08T10:40:00Z" w:name="move226537267"/>
+      <w:moveTo w:id="15" w:author="Kelsey McCune" w:date="2026-04-08T10:40:00Z" w16du:dateUtc="2026-04-08T15:40:00Z">
+        <w:r>
+          <w:rPr>
+            <w:sz w:val="22"/>
+            <w:szCs w:val="22"/>
+          </w:rPr>
+          <w:t xml:space="preserve">The prevalence and spread of zoonotic diseases, or diseases shared between wildlife and humans, represents one of the most significant effects of growing contact at the human-wildlife interface, with over 70% of current human diseases originating from wildlife (Jones et al. 2008). </w:t>
+        </w:r>
+      </w:moveTo>
+      <w:moveToRangeEnd w:id="14"/>
+      <w:ins w:id="16" w:author="Kelsey McCune" w:date="2026-04-08T10:41:00Z" w16du:dateUtc="2026-04-08T15:41:00Z">
+        <w:r>
+          <w:rPr>
+            <w:sz w:val="22"/>
+            <w:szCs w:val="22"/>
+          </w:rPr>
+          <w:t>Consequently, a</w:t>
+        </w:r>
+      </w:ins>
+      <w:del w:id="17" w:author="Kelsey McCune" w:date="2026-04-08T10:41:00Z" w16du:dateUtc="2026-04-08T15:41:00Z">
+        <w:r>
+          <w:rPr>
+            <w:sz w:val="22"/>
+            <w:szCs w:val="22"/>
+          </w:rPr>
+          <w:delText>A</w:delText>
+        </w:r>
+      </w:del>
+      <w:r>
+        <w:rPr>
+          <w:sz w:val="22"/>
+          <w:szCs w:val="22"/>
+        </w:rPr>
+        <w:t xml:space="preserve">s </w:t>
+      </w:r>
+      <w:ins w:id="18" w:author="Kelsey McCune" w:date="2026-04-08T10:41:00Z" w16du:dateUtc="2026-04-08T15:41:00Z">
+        <w:r>
+          <w:rPr>
+            <w:sz w:val="22"/>
+            <w:szCs w:val="22"/>
+          </w:rPr>
+          <w:t xml:space="preserve">human populations grow and </w:t>
+        </w:r>
+      </w:ins>
+      <w:r>
+        <w:rPr>
+          <w:sz w:val="22"/>
+          <w:szCs w:val="22"/>
+        </w:rPr>
+        <w:t xml:space="preserve">interactions in these interfaces become more frequent, improving our understanding of </w:t>
+      </w:r>
+      <w:del w:id="19" w:author="Kelsey McCune" w:date="2026-04-08T10:39:00Z" w16du:dateUtc="2026-04-08T15:39:00Z">
+        <w:r>
+          <w:rPr>
+            <w:sz w:val="22"/>
+            <w:szCs w:val="22"/>
+          </w:rPr>
+          <w:delText xml:space="preserve">how anthropogenic change continues to impact </w:delText>
+        </w:r>
+      </w:del>
+      <w:r>
+        <w:rPr>
+          <w:sz w:val="22"/>
+          <w:szCs w:val="22"/>
+        </w:rPr>
+        <w:t xml:space="preserve">the ecological and health dynamics between wildlife and </w:t>
+      </w:r>
+      <w:commentRangeStart w:id="20"/>
+      <w:commentRangeStart w:id="21"/>
       <w:r>
         <w:rPr>
           <w:sz w:val="22"/>
@@ -752,84 +1000,677 @@
         </w:rPr>
         <w:t>humans</w:t>
       </w:r>
-      <w:commentRangeEnd w:id="0"/>
+      <w:commentRangeEnd w:id="20"/>
       <w:r>
         <w:rPr>
           <w:rStyle w:val="CommentReference"/>
           <w:sz w:val="22"/>
           <w:szCs w:val="22"/>
         </w:rPr>
-        <w:commentReference w:id="0"/>
-      </w:r>
-      <w:commentRangeEnd w:id="1"/>
+        <w:commentReference w:id="20"/>
+      </w:r>
+      <w:commentRangeEnd w:id="21"/>
       <w:r>
         <w:rPr>
           <w:rStyle w:val="CommentReference"/>
           <w:sz w:val="22"/>
           <w:szCs w:val="22"/>
         </w:rPr>
-        <w:commentReference w:id="1"/>
-      </w:r>
-      <w:r>
-        <w:rPr>
-          <w:sz w:val="22"/>
-          <w:szCs w:val="22"/>
-        </w:rPr>
-        <w:t xml:space="preserve"> grows increasingly necessary. Birds are among the most well-studied and widespread taxa in the animal kingdom, filling critical roles in ecosystems worldwide through mechanisms such as insect control, pollination, seed dispersal and more. While many bird species have adapted to a capacity to survive and even depend on human-modified landscapes, the ecological impacts of these co-adaptations, and how long-term proximity to humans, domestic animals, and shared resources influences pathogen dynamics in wild bird communities remain poorly understood (Bradley and Altizer 2007). </w:t>
-      </w:r>
-    </w:p>
-    <w:p>
-      <w:pPr>
-        <w:rPr>
-          <w:sz w:val="22"/>
-          <w:szCs w:val="22"/>
-        </w:rPr>
-      </w:pPr>
-      <w:r>
-        <w:rPr>
-          <w:sz w:val="22"/>
-          <w:szCs w:val="22"/>
-        </w:rPr>
-        <w:t xml:space="preserve">Small-scale poultry keeping and supplemental bird feeding have grown substantially in popularity across the United States, occurring as backyard activities and encouraging participants to interact more with nature and wildlife. “Small-scale" or "backyard" poultry keeping refers to the practice of homeowners maintaining small flocks of chickens on or around their property for purposes such as egg and meat production, animal husbandry, or participation in sustainable food systems (Nicholson et al. 2020; Kyle and Sutherland 2016). The popularity of backyard poultry keeping is growing in urban and suburban areas in the United States (USDA, 2013), but the practice has been an important part of nutrition and economic stability for centuries in other regions (Alders &amp; Pym, 2009). Backyard bird feeding has similarly been a well-established home activity for decades, allowing homeowners opportunities to connect with nature and wildlife while supplementing the diets of wild birds. The scale of bird feeding in the United States is substantial, with federal surveys estimating that over 50 million Americans participate in feeding wild birds, and hundreds of millions of dollars spent on bird seed annually (USFWS 2022). </w:t>
-      </w:r>
-    </w:p>
-    <w:p>
-      <w:pPr>
-        <w:rPr>
-          <w:sz w:val="22"/>
-          <w:szCs w:val="22"/>
-        </w:rPr>
-      </w:pPr>
-      <w:r>
-        <w:rPr>
-          <w:sz w:val="22"/>
-          <w:szCs w:val="22"/>
-        </w:rPr>
-        <w:t xml:space="preserve">This often creates opportunities for novel contact between wild bird species, chicken flocks, domestic pets and humans as well and can allow for bidirectional transmission (spillover) of select pathogens carried by animals or contracted from the environment. The prevalence and spread of zoonotic diseases, or diseases shared between wildlife and humans, represents one of the most significant effects of growing contact at the human-wildlife interface, with over 70% of current human diseases originating from wildlife (Jones et al. </w:t>
-      </w:r>
-      <w:commentRangeStart w:id="2"/>
-      <w:r>
-        <w:rPr>
-          <w:sz w:val="22"/>
-          <w:szCs w:val="22"/>
-        </w:rPr>
-        <w:t>2008</w:t>
-      </w:r>
-      <w:commentRangeEnd w:id="2"/>
+        <w:commentReference w:id="21"/>
+      </w:r>
+      <w:r>
+        <w:rPr>
+          <w:sz w:val="22"/>
+          <w:szCs w:val="22"/>
+        </w:rPr>
+        <w:t xml:space="preserve"> </w:t>
+      </w:r>
+      <w:ins w:id="22" w:author="Kelsey McCune" w:date="2026-04-08T10:41:00Z" w16du:dateUtc="2026-04-08T15:41:00Z">
+        <w:r>
+          <w:rPr>
+            <w:sz w:val="22"/>
+            <w:szCs w:val="22"/>
+          </w:rPr>
+          <w:t>i</w:t>
+        </w:r>
+      </w:ins>
+      <w:del w:id="23" w:author="Kelsey McCune" w:date="2026-04-08T10:41:00Z" w16du:dateUtc="2026-04-08T15:41:00Z">
+        <w:r>
+          <w:rPr>
+            <w:sz w:val="22"/>
+            <w:szCs w:val="22"/>
+          </w:rPr>
+          <w:delText>grow</w:delText>
+        </w:r>
+      </w:del>
+      <w:r>
+        <w:rPr>
+          <w:sz w:val="22"/>
+          <w:szCs w:val="22"/>
+        </w:rPr>
+        <w:t xml:space="preserve">s increasingly necessary. </w:t>
+      </w:r>
+      <w:ins w:id="24" w:author="Kelsey McCune" w:date="2026-04-08T10:46:00Z" w16du:dateUtc="2026-04-08T15:46:00Z">
+        <w:r>
+          <w:rPr>
+            <w:sz w:val="22"/>
+            <w:szCs w:val="22"/>
+          </w:rPr>
+          <w:t>W</w:t>
+        </w:r>
+      </w:ins>
+      <w:ins w:id="25" w:author="Kelsey McCune" w:date="2026-04-08T10:44:00Z" w16du:dateUtc="2026-04-08T15:44:00Z">
+        <w:r>
+          <w:rPr>
+            <w:sz w:val="22"/>
+            <w:szCs w:val="22"/>
+          </w:rPr>
+          <w:t>e n</w:t>
+        </w:r>
+      </w:ins>
+      <w:ins w:id="26" w:author="Kelsey McCune" w:date="2026-04-08T10:45:00Z" w16du:dateUtc="2026-04-08T15:45:00Z">
+        <w:r>
+          <w:rPr>
+            <w:sz w:val="22"/>
+            <w:szCs w:val="22"/>
+          </w:rPr>
+          <w:t xml:space="preserve">ow recognize </w:t>
+        </w:r>
+      </w:ins>
+      <w:ins w:id="27" w:author="Kelsey McCune" w:date="2026-04-08T10:47:00Z" w16du:dateUtc="2026-04-08T15:47:00Z">
+        <w:r>
+          <w:rPr>
+            <w:sz w:val="22"/>
+            <w:szCs w:val="22"/>
+          </w:rPr>
+          <w:t>a</w:t>
+        </w:r>
+      </w:ins>
+      <w:ins w:id="28" w:author="Kelsey McCune" w:date="2026-04-08T10:43:00Z" w16du:dateUtc="2026-04-08T15:43:00Z">
+        <w:r>
+          <w:rPr>
+            <w:sz w:val="22"/>
+            <w:szCs w:val="22"/>
+          </w:rPr>
+          <w:t xml:space="preserve"> </w:t>
+        </w:r>
+      </w:ins>
+      <w:ins w:id="29" w:author="Kelsey McCune" w:date="2026-04-08T10:45:00Z" w16du:dateUtc="2026-04-08T15:45:00Z">
+        <w:r>
+          <w:rPr>
+            <w:sz w:val="22"/>
+            <w:szCs w:val="22"/>
+          </w:rPr>
+          <w:t>relationship</w:t>
+        </w:r>
+      </w:ins>
+      <w:ins w:id="30" w:author="Kelsey McCune" w:date="2026-04-08T10:43:00Z" w16du:dateUtc="2026-04-08T15:43:00Z">
+        <w:r>
+          <w:rPr>
+            <w:sz w:val="22"/>
+            <w:szCs w:val="22"/>
+          </w:rPr>
+          <w:t xml:space="preserve"> </w:t>
+        </w:r>
+      </w:ins>
+      <w:ins w:id="31" w:author="Kelsey McCune" w:date="2026-04-08T10:44:00Z" w16du:dateUtc="2026-04-08T15:44:00Z">
+        <w:r>
+          <w:rPr>
+            <w:sz w:val="22"/>
+            <w:szCs w:val="22"/>
+          </w:rPr>
+          <w:t>between</w:t>
+        </w:r>
+      </w:ins>
+      <w:ins w:id="32" w:author="Kelsey McCune" w:date="2026-04-08T10:45:00Z" w16du:dateUtc="2026-04-08T15:45:00Z">
+        <w:r>
+          <w:rPr>
+            <w:sz w:val="22"/>
+            <w:szCs w:val="22"/>
+          </w:rPr>
+          <w:t xml:space="preserve"> broad-scale</w:t>
+        </w:r>
+      </w:ins>
+      <w:ins w:id="33" w:author="Kelsey McCune" w:date="2026-04-08T10:44:00Z" w16du:dateUtc="2026-04-08T15:44:00Z">
+        <w:r>
+          <w:rPr>
+            <w:sz w:val="22"/>
+            <w:szCs w:val="22"/>
+          </w:rPr>
+          <w:t xml:space="preserve"> anthropogenic change</w:t>
+        </w:r>
+      </w:ins>
+      <w:ins w:id="34" w:author="Kelsey McCune" w:date="2026-04-08T10:48:00Z" w16du:dateUtc="2026-04-08T15:48:00Z">
+        <w:r>
+          <w:rPr>
+            <w:sz w:val="22"/>
+            <w:szCs w:val="22"/>
+          </w:rPr>
+          <w:t>s</w:t>
+        </w:r>
+      </w:ins>
+      <w:ins w:id="35" w:author="Kelsey McCune" w:date="2026-04-08T10:44:00Z" w16du:dateUtc="2026-04-08T15:44:00Z">
+        <w:r>
+          <w:rPr>
+            <w:sz w:val="22"/>
+            <w:szCs w:val="22"/>
+          </w:rPr>
+          <w:t xml:space="preserve"> and zoonotic disease </w:t>
+        </w:r>
+      </w:ins>
+      <w:ins w:id="36" w:author="Kelsey McCune" w:date="2026-04-08T10:45:00Z" w16du:dateUtc="2026-04-08T15:45:00Z">
+        <w:r>
+          <w:rPr>
+            <w:sz w:val="22"/>
+            <w:szCs w:val="22"/>
+          </w:rPr>
+          <w:t>(e.g.</w:t>
+        </w:r>
+      </w:ins>
+      <w:ins w:id="37" w:author="Kelsey McCune" w:date="2026-04-08T10:59:00Z" w16du:dateUtc="2026-04-08T15:59:00Z">
+        <w:r>
+          <w:rPr>
+            <w:sz w:val="22"/>
+            <w:szCs w:val="22"/>
+          </w:rPr>
+          <w:t xml:space="preserve"> climate change</w:t>
+        </w:r>
+      </w:ins>
+      <w:ins w:id="38" w:author="Kelsey McCune" w:date="2026-04-08T10:45:00Z" w16du:dateUtc="2026-04-08T15:45:00Z">
+        <w:r>
+          <w:rPr>
+            <w:sz w:val="22"/>
+            <w:szCs w:val="22"/>
+          </w:rPr>
+          <w:t xml:space="preserve">, </w:t>
+        </w:r>
+      </w:ins>
+      <w:commentRangeStart w:id="39"/>
+      <w:ins w:id="40" w:author="Kelsey McCune" w:date="2026-04-08T10:59:00Z" w16du:dateUtc="2026-04-08T15:59:00Z">
+        <w:r>
+          <w:rPr>
+            <w:sz w:val="22"/>
+            <w:szCs w:val="22"/>
+          </w:rPr>
+          <w:t>Hall et al., 2021</w:t>
+        </w:r>
+      </w:ins>
+      <w:commentRangeEnd w:id="39"/>
+      <w:ins w:id="41" w:author="Kelsey McCune" w:date="2026-04-08T11:14:00Z" w16du:dateUtc="2026-04-08T16:14:00Z">
+        <w:r>
+          <w:rPr>
+            <w:sz w:val="22"/>
+            <w:szCs w:val="22"/>
+          </w:rPr>
+          <w:t>; land use change, Murray &amp; Hernandez, 2021</w:t>
+        </w:r>
+      </w:ins>
+      <w:ins w:id="42" w:author="Kelsey McCune" w:date="2026-04-08T10:59:00Z" w16du:dateUtc="2026-04-08T15:59:00Z">
+        <w:r>
+          <w:rPr>
+            <w:rStyle w:val="CommentReference"/>
+          </w:rPr>
+          <w:commentReference w:id="39"/>
+        </w:r>
+      </w:ins>
+      <w:ins w:id="43" w:author="Kelsey McCune" w:date="2026-04-08T10:45:00Z" w16du:dateUtc="2026-04-08T15:45:00Z">
+        <w:r>
+          <w:rPr>
+            <w:sz w:val="22"/>
+            <w:szCs w:val="22"/>
+          </w:rPr>
+          <w:t>)</w:t>
+        </w:r>
+      </w:ins>
+      <w:ins w:id="44" w:author="Kelsey McCune" w:date="2026-04-08T10:46:00Z" w16du:dateUtc="2026-04-08T15:46:00Z">
+        <w:r>
+          <w:rPr>
+            <w:sz w:val="22"/>
+            <w:szCs w:val="22"/>
+          </w:rPr>
+          <w:t xml:space="preserve">. However, </w:t>
+        </w:r>
+      </w:ins>
+      <w:ins w:id="45" w:author="Kelsey McCune" w:date="2026-04-08T10:48:00Z" w16du:dateUtc="2026-04-08T15:48:00Z">
+        <w:r>
+          <w:rPr>
+            <w:sz w:val="22"/>
+            <w:szCs w:val="22"/>
+          </w:rPr>
+          <w:t>zoonotic disease outbreaks</w:t>
+        </w:r>
+      </w:ins>
+      <w:ins w:id="46" w:author="Kelsey McCune" w:date="2026-04-08T10:50:00Z" w16du:dateUtc="2026-04-08T15:50:00Z">
+        <w:r>
+          <w:rPr>
+            <w:sz w:val="22"/>
+            <w:szCs w:val="22"/>
+          </w:rPr>
+          <w:t xml:space="preserve"> in people and wildlife</w:t>
+        </w:r>
+      </w:ins>
+      <w:ins w:id="47" w:author="Kelsey McCune" w:date="2026-04-08T10:48:00Z" w16du:dateUtc="2026-04-08T15:48:00Z">
+        <w:r>
+          <w:rPr>
+            <w:sz w:val="22"/>
+            <w:szCs w:val="22"/>
+          </w:rPr>
+          <w:t xml:space="preserve"> start with </w:t>
+        </w:r>
+      </w:ins>
+      <w:ins w:id="48" w:author="Kelsey McCune" w:date="2026-04-08T10:46:00Z" w16du:dateUtc="2026-04-08T15:46:00Z">
+        <w:r>
+          <w:rPr>
+            <w:sz w:val="22"/>
+            <w:szCs w:val="22"/>
+          </w:rPr>
+          <w:t xml:space="preserve">spillover events </w:t>
+        </w:r>
+        <w:proofErr w:type="spellStart"/>
+        <w:r>
+          <w:rPr>
+            <w:sz w:val="22"/>
+            <w:szCs w:val="22"/>
+          </w:rPr>
+          <w:t>occur</w:t>
+        </w:r>
+      </w:ins>
+      <w:ins w:id="49" w:author="Kelsey McCune" w:date="2026-04-08T10:48:00Z" w16du:dateUtc="2026-04-08T15:48:00Z">
+        <w:r>
+          <w:rPr>
+            <w:sz w:val="22"/>
+            <w:szCs w:val="22"/>
+          </w:rPr>
+          <w:t>ing</w:t>
+        </w:r>
+      </w:ins>
+      <w:proofErr w:type="spellEnd"/>
+      <w:ins w:id="50" w:author="Kelsey McCune" w:date="2026-04-08T10:46:00Z" w16du:dateUtc="2026-04-08T15:46:00Z">
+        <w:r>
+          <w:rPr>
+            <w:sz w:val="22"/>
+            <w:szCs w:val="22"/>
+          </w:rPr>
+          <w:t xml:space="preserve"> at a local </w:t>
+        </w:r>
+      </w:ins>
+      <w:ins w:id="51" w:author="Kelsey McCune" w:date="2026-04-08T10:48:00Z" w16du:dateUtc="2026-04-08T15:48:00Z">
+        <w:r>
+          <w:rPr>
+            <w:sz w:val="22"/>
+            <w:szCs w:val="22"/>
+          </w:rPr>
+          <w:t>scale</w:t>
+        </w:r>
+      </w:ins>
+      <w:ins w:id="52" w:author="Kelsey McCune" w:date="2026-04-08T10:50:00Z" w16du:dateUtc="2026-04-08T15:50:00Z">
+        <w:r>
+          <w:rPr>
+            <w:sz w:val="22"/>
+            <w:szCs w:val="22"/>
+          </w:rPr>
+          <w:t>, but</w:t>
+        </w:r>
+      </w:ins>
+      <w:ins w:id="53" w:author="Kelsey McCune" w:date="2026-04-08T10:45:00Z" w16du:dateUtc="2026-04-08T15:45:00Z">
+        <w:r>
+          <w:rPr>
+            <w:sz w:val="22"/>
+            <w:szCs w:val="22"/>
+          </w:rPr>
+          <w:t xml:space="preserve"> the risk related to human activities at </w:t>
+        </w:r>
+      </w:ins>
+      <w:ins w:id="54" w:author="Kelsey McCune" w:date="2026-04-08T10:46:00Z" w16du:dateUtc="2026-04-08T15:46:00Z">
+        <w:r>
+          <w:rPr>
+            <w:sz w:val="22"/>
+            <w:szCs w:val="22"/>
+          </w:rPr>
+          <w:t>th</w:t>
+        </w:r>
+      </w:ins>
+      <w:ins w:id="55" w:author="Kelsey McCune" w:date="2026-04-08T10:51:00Z" w16du:dateUtc="2026-04-08T15:51:00Z">
+        <w:r>
+          <w:rPr>
+            <w:sz w:val="22"/>
+            <w:szCs w:val="22"/>
+          </w:rPr>
+          <w:t>is</w:t>
+        </w:r>
+      </w:ins>
+      <w:ins w:id="56" w:author="Kelsey McCune" w:date="2026-04-08T10:46:00Z" w16du:dateUtc="2026-04-08T15:46:00Z">
+        <w:r>
+          <w:rPr>
+            <w:sz w:val="22"/>
+            <w:szCs w:val="22"/>
+          </w:rPr>
+          <w:t xml:space="preserve"> scale is unknown.</w:t>
+        </w:r>
+      </w:ins>
+    </w:p>
+    <w:p>
+      <w:pPr>
+        <w:ind w:firstLine="720"/>
+        <w:rPr>
+          <w:sz w:val="22"/>
+          <w:szCs w:val="22"/>
+        </w:rPr>
+        <w:pPrChange w:id="57" w:author="Kelsey McCune" w:date="2026-04-08T10:37:00Z" w16du:dateUtc="2026-04-08T15:37:00Z">
+          <w:pPr/>
+        </w:pPrChange>
+      </w:pPr>
+      <w:r>
+        <w:rPr>
+          <w:sz w:val="22"/>
+          <w:szCs w:val="22"/>
+        </w:rPr>
+        <w:t>Birds are among the most well-studied and widespread taxa in the animal kingdom, filling critical roles in ecosystems worldwide through mechanisms such as insect control, pollination, seed dispersal and more</w:t>
+      </w:r>
+      <w:ins w:id="58" w:author="Kelsey McCune" w:date="2026-04-08T11:05:00Z" w16du:dateUtc="2026-04-08T16:05:00Z">
+        <w:r>
+          <w:rPr>
+            <w:sz w:val="22"/>
+            <w:szCs w:val="22"/>
+          </w:rPr>
+          <w:t xml:space="preserve"> (</w:t>
+        </w:r>
+        <w:proofErr w:type="spellStart"/>
+        <w:r>
+          <w:rPr>
+            <w:sz w:val="22"/>
+            <w:szCs w:val="22"/>
+          </w:rPr>
+          <w:t>Sekercioglu</w:t>
+        </w:r>
+        <w:proofErr w:type="spellEnd"/>
+        <w:r>
+          <w:rPr>
+            <w:sz w:val="22"/>
+            <w:szCs w:val="22"/>
+          </w:rPr>
+          <w:t>, 2006)</w:t>
+        </w:r>
+      </w:ins>
+      <w:r>
+        <w:rPr>
+          <w:sz w:val="22"/>
+          <w:szCs w:val="22"/>
+        </w:rPr>
+        <w:t>.</w:t>
+      </w:r>
+      <w:commentRangeStart w:id="59"/>
+      <w:r>
+        <w:rPr>
+          <w:sz w:val="22"/>
+          <w:szCs w:val="22"/>
+        </w:rPr>
+        <w:t xml:space="preserve"> </w:t>
+      </w:r>
+      <w:commentRangeEnd w:id="59"/>
       <w:r>
         <w:rPr>
           <w:rStyle w:val="CommentReference"/>
-          <w:sz w:val="22"/>
-          <w:szCs w:val="22"/>
-        </w:rPr>
-        <w:commentReference w:id="2"/>
-      </w:r>
-      <w:r>
-        <w:rPr>
-          <w:sz w:val="22"/>
-          <w:szCs w:val="22"/>
-        </w:rPr>
-        <w:t xml:space="preserve">). Bird feeders aggregate wild birds at irregular densities, increasing both direct contact rates between individuals and fecal-oral transmission of bacterial pathogens among individuals and </w:t>
+        </w:rPr>
+        <w:commentReference w:id="59"/>
+      </w:r>
+      <w:r>
+        <w:rPr>
+          <w:sz w:val="22"/>
+          <w:szCs w:val="22"/>
+        </w:rPr>
+        <w:t xml:space="preserve">While many </w:t>
+      </w:r>
+      <w:proofErr w:type="gramStart"/>
+      <w:r>
+        <w:rPr>
+          <w:sz w:val="22"/>
+          <w:szCs w:val="22"/>
+        </w:rPr>
+        <w:t>bird</w:t>
+      </w:r>
+      <w:proofErr w:type="gramEnd"/>
+      <w:r>
+        <w:rPr>
+          <w:sz w:val="22"/>
+          <w:szCs w:val="22"/>
+        </w:rPr>
+        <w:t xml:space="preserve"> species have adapted to </w:t>
+      </w:r>
+      <w:del w:id="60" w:author="Kelsey McCune" w:date="2026-04-08T10:52:00Z" w16du:dateUtc="2026-04-08T15:52:00Z">
+        <w:r>
+          <w:rPr>
+            <w:sz w:val="22"/>
+            <w:szCs w:val="22"/>
+          </w:rPr>
+          <w:delText xml:space="preserve">a capacity to </w:delText>
+        </w:r>
+      </w:del>
+      <w:r>
+        <w:rPr>
+          <w:sz w:val="22"/>
+          <w:szCs w:val="22"/>
+        </w:rPr>
+        <w:t>survive and even depend on human-modified landscapes, the ecological impacts of these co-adaptations, and how long-term proximity to humans, domestic animals, and shared resources influence</w:t>
+      </w:r>
+      <w:del w:id="61" w:author="Kelsey McCune" w:date="2026-04-08T11:19:00Z" w16du:dateUtc="2026-04-08T16:19:00Z">
+        <w:r>
+          <w:rPr>
+            <w:sz w:val="22"/>
+            <w:szCs w:val="22"/>
+          </w:rPr>
+          <w:delText>s</w:delText>
+        </w:r>
+      </w:del>
+      <w:r>
+        <w:rPr>
+          <w:sz w:val="22"/>
+          <w:szCs w:val="22"/>
+        </w:rPr>
+        <w:t xml:space="preserve"> pathogen dynamics in wild bird communities remain poorly understood (Bradley and Altizer 2007). </w:t>
+      </w:r>
+    </w:p>
+    <w:p>
+      <w:pPr>
+        <w:ind w:firstLine="720"/>
+        <w:rPr>
+          <w:sz w:val="22"/>
+          <w:szCs w:val="22"/>
+        </w:rPr>
+        <w:pPrChange w:id="62" w:author="Kelsey McCune" w:date="2026-04-08T10:37:00Z" w16du:dateUtc="2026-04-08T15:37:00Z">
+          <w:pPr/>
+        </w:pPrChange>
+      </w:pPr>
+      <w:ins w:id="63" w:author="Kelsey McCune" w:date="2026-04-08T11:21:00Z" w16du:dateUtc="2026-04-08T16:21:00Z">
+        <w:r>
+          <w:rPr>
+            <w:sz w:val="22"/>
+            <w:szCs w:val="22"/>
+          </w:rPr>
+          <w:t xml:space="preserve">Wild and domestic birds also play an important role in human culture and recreation. </w:t>
+        </w:r>
+      </w:ins>
+      <w:r>
+        <w:rPr>
+          <w:sz w:val="22"/>
+          <w:szCs w:val="22"/>
+        </w:rPr>
+        <w:t xml:space="preserve">Small-scale poultry keeping and supplemental bird feeding have grown substantially in popularity across the United States, occurring as backyard activities and encouraging participants to interact more with nature and wildlife. </w:t>
+      </w:r>
+      <w:del w:id="64" w:author="Kelsey McCune" w:date="2026-04-08T11:22:00Z" w16du:dateUtc="2026-04-08T16:22:00Z">
+        <w:r>
+          <w:rPr>
+            <w:sz w:val="22"/>
+            <w:szCs w:val="22"/>
+          </w:rPr>
+          <w:delText xml:space="preserve">“Small-scale" or "backyard" poultry keeping refers to the practice of homeowners maintaining small flocks of chickens on or around their property for purposes such as egg and meat production, animal husbandry, or participation in sustainable food systems (Nicholson et al. 2020; Kyle and Sutherland 2016). </w:delText>
+        </w:r>
+      </w:del>
+      <w:r>
+        <w:rPr>
+          <w:sz w:val="22"/>
+          <w:szCs w:val="22"/>
+        </w:rPr>
+        <w:t xml:space="preserve">The popularity of backyard poultry keeping is growing in urban and suburban areas in the United States (USDA, 2013), but the practice has been an important part of nutrition and economic stability for centuries in other regions (Alders &amp; Pym, 2009). Backyard bird feeding has similarly been a well-established home activity for decades, allowing homeowners opportunities to connect with nature and wildlife while supplementing the diets of wild birds. The scale of bird feeding in the United States is substantial, with federal surveys estimating that over 50 million Americans participate in feeding wild birds, and hundreds of millions of dollars spent on bird seed annually (USFWS 2022). </w:t>
+      </w:r>
+    </w:p>
+    <w:p>
+      <w:pPr>
+        <w:ind w:firstLine="720"/>
+        <w:rPr>
+          <w:sz w:val="22"/>
+          <w:szCs w:val="22"/>
+        </w:rPr>
+        <w:pPrChange w:id="65" w:author="Kelsey McCune" w:date="2026-04-08T10:37:00Z" w16du:dateUtc="2026-04-08T15:37:00Z">
+          <w:pPr/>
+        </w:pPrChange>
+      </w:pPr>
+      <w:r>
+        <w:rPr>
+          <w:sz w:val="22"/>
+          <w:szCs w:val="22"/>
+        </w:rPr>
+        <w:t>Th</w:t>
+      </w:r>
+      <w:ins w:id="66" w:author="Kelsey McCune" w:date="2026-04-08T11:23:00Z" w16du:dateUtc="2026-04-08T16:23:00Z">
+        <w:r>
+          <w:rPr>
+            <w:sz w:val="22"/>
+            <w:szCs w:val="22"/>
+          </w:rPr>
+          <w:t>ese activities</w:t>
+        </w:r>
+      </w:ins>
+      <w:del w:id="67" w:author="Kelsey McCune" w:date="2026-04-08T11:23:00Z" w16du:dateUtc="2026-04-08T16:23:00Z">
+        <w:r>
+          <w:rPr>
+            <w:sz w:val="22"/>
+            <w:szCs w:val="22"/>
+          </w:rPr>
+          <w:delText>is</w:delText>
+        </w:r>
+      </w:del>
+      <w:r>
+        <w:rPr>
+          <w:sz w:val="22"/>
+          <w:szCs w:val="22"/>
+        </w:rPr>
+        <w:t xml:space="preserve"> </w:t>
+      </w:r>
+      <w:del w:id="68" w:author="Kelsey McCune" w:date="2026-04-08T11:23:00Z" w16du:dateUtc="2026-04-08T16:23:00Z">
+        <w:r>
+          <w:rPr>
+            <w:sz w:val="22"/>
+            <w:szCs w:val="22"/>
+          </w:rPr>
+          <w:delText xml:space="preserve">often </w:delText>
+        </w:r>
+      </w:del>
+      <w:r>
+        <w:rPr>
+          <w:sz w:val="22"/>
+          <w:szCs w:val="22"/>
+        </w:rPr>
+        <w:t>create</w:t>
+      </w:r>
+      <w:del w:id="69" w:author="Kelsey McCune" w:date="2026-04-08T11:23:00Z" w16du:dateUtc="2026-04-08T16:23:00Z">
+        <w:r>
+          <w:rPr>
+            <w:sz w:val="22"/>
+            <w:szCs w:val="22"/>
+          </w:rPr>
+          <w:delText>s</w:delText>
+        </w:r>
+      </w:del>
+      <w:r>
+        <w:rPr>
+          <w:sz w:val="22"/>
+          <w:szCs w:val="22"/>
+        </w:rPr>
+        <w:t xml:space="preserve"> opportunities for novel contact between wild bird species, chicken flocks, domestic pets and humans </w:t>
+      </w:r>
+      <w:del w:id="70" w:author="Kelsey McCune" w:date="2026-04-08T11:23:00Z" w16du:dateUtc="2026-04-08T16:23:00Z">
+        <w:r>
+          <w:rPr>
+            <w:sz w:val="22"/>
+            <w:szCs w:val="22"/>
+          </w:rPr>
+          <w:delText>as well and</w:delText>
+        </w:r>
+      </w:del>
+      <w:ins w:id="71" w:author="Kelsey McCune" w:date="2026-04-08T11:23:00Z" w16du:dateUtc="2026-04-08T16:23:00Z">
+        <w:r>
+          <w:rPr>
+            <w:sz w:val="22"/>
+            <w:szCs w:val="22"/>
+          </w:rPr>
+          <w:t>that</w:t>
+        </w:r>
+      </w:ins>
+      <w:r>
+        <w:rPr>
+          <w:sz w:val="22"/>
+          <w:szCs w:val="22"/>
+        </w:rPr>
+        <w:t xml:space="preserve"> can allow for bidirectional transmission (spillover) of select pathogens</w:t>
+      </w:r>
+      <w:del w:id="72" w:author="Kelsey McCune" w:date="2026-04-08T11:24:00Z" w16du:dateUtc="2026-04-08T16:24:00Z">
+        <w:r>
+          <w:rPr>
+            <w:sz w:val="22"/>
+            <w:szCs w:val="22"/>
+          </w:rPr>
+          <w:delText xml:space="preserve"> carried by animals or contracted from the environment</w:delText>
+        </w:r>
+      </w:del>
+      <w:r>
+        <w:rPr>
+          <w:sz w:val="22"/>
+          <w:szCs w:val="22"/>
+        </w:rPr>
+        <w:t xml:space="preserve">. </w:t>
+      </w:r>
+      <w:moveFromRangeStart w:id="73" w:author="Kelsey McCune" w:date="2026-04-08T10:40:00Z" w:name="move226537267"/>
+      <w:moveFrom w:id="74" w:author="Kelsey McCune" w:date="2026-04-08T10:40:00Z" w16du:dateUtc="2026-04-08T15:40:00Z">
+        <w:r>
+          <w:rPr>
+            <w:sz w:val="22"/>
+            <w:szCs w:val="22"/>
+          </w:rPr>
+          <w:t xml:space="preserve">The prevalence and spread of zoonotic diseases, or diseases shared between wildlife and humans, represents one of the most significant effects of growing contact at the human-wildlife interface, with over 70% of current human diseases originating from wildlife (Jones et al. </w:t>
+        </w:r>
+        <w:commentRangeStart w:id="75"/>
+        <w:r>
+          <w:rPr>
+            <w:sz w:val="22"/>
+            <w:szCs w:val="22"/>
+          </w:rPr>
+          <w:t>2008</w:t>
+        </w:r>
+        <w:commentRangeEnd w:id="75"/>
+        <w:r>
+          <w:rPr>
+            <w:rStyle w:val="CommentReference"/>
+            <w:sz w:val="22"/>
+            <w:szCs w:val="22"/>
+          </w:rPr>
+          <w:commentReference w:id="75"/>
+        </w:r>
+        <w:r>
+          <w:rPr>
+            <w:sz w:val="22"/>
+            <w:szCs w:val="22"/>
+          </w:rPr>
+          <w:t xml:space="preserve">). </w:t>
+        </w:r>
+      </w:moveFrom>
+      <w:moveFromRangeEnd w:id="73"/>
+      <w:r>
+        <w:rPr>
+          <w:sz w:val="22"/>
+          <w:szCs w:val="22"/>
+        </w:rPr>
+        <w:t xml:space="preserve">Bird feeders aggregate wild birds </w:t>
       </w:r>
       <w:r>
         <w:rPr>
@@ -837,16 +1678,92 @@
           <w:szCs w:val="22"/>
         </w:rPr>
         <w:lastRenderedPageBreak/>
-        <w:t xml:space="preserve">species (Becker and Hall 2014; Becker et al. 2015). </w:t>
-      </w:r>
-      <w:commentRangeStart w:id="3"/>
-      <w:commentRangeStart w:id="4"/>
-      <w:r>
-        <w:rPr>
-          <w:sz w:val="22"/>
-          <w:szCs w:val="22"/>
-        </w:rPr>
-        <w:t xml:space="preserve">Backyard poultry can further compound this risk, as chickens are known reservoirs for </w:t>
+        <w:t xml:space="preserve">at </w:t>
+      </w:r>
+      <w:del w:id="76" w:author="Kelsey McCune" w:date="2026-04-08T11:24:00Z" w16du:dateUtc="2026-04-08T16:24:00Z">
+        <w:r>
+          <w:rPr>
+            <w:sz w:val="22"/>
+            <w:szCs w:val="22"/>
+          </w:rPr>
+          <w:delText xml:space="preserve">irregular </w:delText>
+        </w:r>
+      </w:del>
+      <w:ins w:id="77" w:author="Kelsey McCune" w:date="2026-04-08T11:24:00Z" w16du:dateUtc="2026-04-08T16:24:00Z">
+        <w:r>
+          <w:rPr>
+            <w:sz w:val="22"/>
+            <w:szCs w:val="22"/>
+          </w:rPr>
+          <w:t>artificially high</w:t>
+        </w:r>
+        <w:r>
+          <w:rPr>
+            <w:sz w:val="22"/>
+            <w:szCs w:val="22"/>
+          </w:rPr>
+          <w:t xml:space="preserve"> </w:t>
+        </w:r>
+      </w:ins>
+      <w:r>
+        <w:rPr>
+          <w:sz w:val="22"/>
+          <w:szCs w:val="22"/>
+        </w:rPr>
+        <w:t xml:space="preserve">densities, increasing both direct contact rates between individuals and fecal-oral transmission of bacterial pathogens among individuals and species (Becker and Hall 2014; Becker et al. 2015). </w:t>
+      </w:r>
+      <w:commentRangeStart w:id="78"/>
+      <w:commentRangeStart w:id="79"/>
+      <w:commentRangeStart w:id="80"/>
+      <w:r>
+        <w:rPr>
+          <w:sz w:val="22"/>
+          <w:szCs w:val="22"/>
+        </w:rPr>
+        <w:t>Backyard poultry can further compound this risk, as chickens are known reservoirs for</w:t>
+      </w:r>
+      <w:ins w:id="81" w:author="Kelsey McCune" w:date="2026-04-08T11:24:00Z" w16du:dateUtc="2026-04-08T16:24:00Z">
+        <w:r>
+          <w:rPr>
+            <w:sz w:val="22"/>
+            <w:szCs w:val="22"/>
+          </w:rPr>
+          <w:t xml:space="preserve"> </w:t>
+        </w:r>
+      </w:ins>
+      <w:ins w:id="82" w:author="Kelsey McCune" w:date="2026-04-08T11:26:00Z" w16du:dateUtc="2026-04-08T16:26:00Z">
+        <w:r>
+          <w:rPr>
+            <w:sz w:val="22"/>
+            <w:szCs w:val="22"/>
+          </w:rPr>
+          <w:t>zoono</w:t>
+        </w:r>
+      </w:ins>
+      <w:ins w:id="83" w:author="Kelsey McCune" w:date="2026-04-08T11:27:00Z" w16du:dateUtc="2026-04-08T16:27:00Z">
+        <w:r>
+          <w:rPr>
+            <w:sz w:val="22"/>
+            <w:szCs w:val="22"/>
+          </w:rPr>
+          <w:t xml:space="preserve">tic </w:t>
+        </w:r>
+      </w:ins>
+      <w:ins w:id="84" w:author="Kelsey McCune" w:date="2026-04-08T11:24:00Z" w16du:dateUtc="2026-04-08T16:24:00Z">
+        <w:r>
+          <w:rPr>
+            <w:sz w:val="22"/>
+            <w:szCs w:val="22"/>
+          </w:rPr>
+          <w:t>bacteria like</w:t>
+        </w:r>
+      </w:ins>
+      <w:r>
+        <w:rPr>
+          <w:sz w:val="22"/>
+          <w:szCs w:val="22"/>
+        </w:rPr>
+        <w:t xml:space="preserve"> </w:t>
       </w:r>
       <w:r>
         <w:rPr>
@@ -856,31 +1773,41 @@
           <w:szCs w:val="22"/>
           <w:highlight w:val="yellow"/>
         </w:rPr>
-        <w:t>S. ente</w:t>
-      </w:r>
+        <w:t>S</w:t>
+      </w:r>
+      <w:ins w:id="85" w:author="Kelsey McCune" w:date="2026-04-08T11:25:00Z" w16du:dateUtc="2026-04-08T16:25:00Z">
+        <w:r>
+          <w:rPr>
+            <w:i/>
+            <w:iCs/>
+            <w:sz w:val="22"/>
+            <w:szCs w:val="22"/>
+            <w:highlight w:val="yellow"/>
+          </w:rPr>
+          <w:t>almonella</w:t>
+        </w:r>
+      </w:ins>
+      <w:del w:id="86" w:author="Kelsey McCune" w:date="2026-04-08T11:25:00Z" w16du:dateUtc="2026-04-08T16:25:00Z">
+        <w:r>
+          <w:rPr>
+            <w:i/>
+            <w:iCs/>
+            <w:sz w:val="22"/>
+            <w:szCs w:val="22"/>
+            <w:highlight w:val="yellow"/>
+          </w:rPr>
+          <w:delText>.</w:delText>
+        </w:r>
+      </w:del>
       <w:r>
         <w:rPr>
           <w:i/>
           <w:iCs/>
           <w:sz w:val="22"/>
           <w:szCs w:val="22"/>
-        </w:rPr>
-        <w:t>rica</w:t>
-      </w:r>
-      <w:r>
-        <w:rPr>
-          <w:sz w:val="22"/>
-          <w:szCs w:val="22"/>
-        </w:rPr>
-        <w:t xml:space="preserve"> </w:t>
-      </w:r>
-      <w:r>
-        <w:rPr>
-          <w:sz w:val="22"/>
-          <w:szCs w:val="22"/>
           <w:highlight w:val="yellow"/>
         </w:rPr>
-        <w:t xml:space="preserve">and </w:t>
+        <w:t xml:space="preserve"> ente</w:t>
       </w:r>
       <w:r>
         <w:rPr>
@@ -888,71 +1815,397 @@
           <w:iCs/>
           <w:sz w:val="22"/>
           <w:szCs w:val="22"/>
-          <w:highlight w:val="yellow"/>
-        </w:rPr>
-        <w:t>E. coli</w:t>
-      </w:r>
-      <w:r>
-        <w:rPr>
-          <w:sz w:val="22"/>
-          <w:szCs w:val="22"/>
-        </w:rPr>
-        <w:t>, and can amplify pathogen persistence in the environment</w:t>
-      </w:r>
-      <w:commentRangeEnd w:id="3"/>
+        </w:rPr>
+        <w:t>rica</w:t>
+      </w:r>
+      <w:r>
+        <w:rPr>
+          <w:sz w:val="22"/>
+          <w:szCs w:val="22"/>
+        </w:rPr>
+        <w:t xml:space="preserve"> </w:t>
+      </w:r>
+      <w:del w:id="87" w:author="Kelsey McCune" w:date="2026-04-08T11:24:00Z" w16du:dateUtc="2026-04-08T16:24:00Z">
+        <w:r>
+          <w:rPr>
+            <w:sz w:val="22"/>
+            <w:szCs w:val="22"/>
+            <w:highlight w:val="yellow"/>
+          </w:rPr>
+          <w:delText xml:space="preserve">and </w:delText>
+        </w:r>
+        <w:r>
+          <w:rPr>
+            <w:i/>
+            <w:iCs/>
+            <w:sz w:val="22"/>
+            <w:szCs w:val="22"/>
+            <w:highlight w:val="yellow"/>
+          </w:rPr>
+          <w:delText>E. coli</w:delText>
+        </w:r>
+        <w:r>
+          <w:rPr>
+            <w:sz w:val="22"/>
+            <w:szCs w:val="22"/>
+          </w:rPr>
+          <w:delText xml:space="preserve">, </w:delText>
+        </w:r>
+      </w:del>
+      <w:r>
+        <w:rPr>
+          <w:sz w:val="22"/>
+          <w:szCs w:val="22"/>
+        </w:rPr>
+        <w:t>and can amplify pathogen persistence in the environment</w:t>
+      </w:r>
+      <w:commentRangeEnd w:id="78"/>
       <w:r>
         <w:rPr>
           <w:rStyle w:val="CommentReference"/>
           <w:sz w:val="22"/>
           <w:szCs w:val="22"/>
         </w:rPr>
-        <w:commentReference w:id="3"/>
-      </w:r>
-      <w:commentRangeEnd w:id="4"/>
+        <w:commentReference w:id="78"/>
+      </w:r>
+      <w:commentRangeEnd w:id="79"/>
       <w:r>
         <w:rPr>
           <w:rStyle w:val="CommentReference"/>
           <w:sz w:val="22"/>
           <w:szCs w:val="22"/>
         </w:rPr>
-        <w:commentReference w:id="4"/>
-      </w:r>
-      <w:r>
-        <w:rPr>
-          <w:sz w:val="22"/>
-          <w:szCs w:val="22"/>
-        </w:rPr>
-        <w:t xml:space="preserve">, </w:t>
-      </w:r>
-      <w:r>
-        <w:rPr>
-          <w:sz w:val="22"/>
-          <w:szCs w:val="22"/>
-        </w:rPr>
-        <w:t>allow</w:t>
-      </w:r>
-      <w:r>
-        <w:rPr>
-          <w:sz w:val="22"/>
-          <w:szCs w:val="22"/>
-        </w:rPr>
-        <w:t>ing</w:t>
-      </w:r>
-      <w:r>
-        <w:rPr>
-          <w:sz w:val="22"/>
-          <w:szCs w:val="22"/>
-        </w:rPr>
-        <w:t xml:space="preserve"> for possible spillover to wild birds, humans, and other domestic animals (Larsen et al. 2022). Salmonellosis is responsible for hundreds of documented wild bird mortality events (Hall and Saito 2008) and has been linked to human illness through contact with contaminated feeders and wild songbirds (Patel et al. 2021), as well as backyard poultry (CDC, 2025). The combined proximity of human dwellings, bird feeders, and chicken housing may render these interacting factors a concern for public and wildlife health. </w:t>
-      </w:r>
-    </w:p>
-    <w:p>
-      <w:pPr>
-        <w:rPr>
-          <w:sz w:val="22"/>
-          <w:szCs w:val="22"/>
-        </w:rPr>
-      </w:pPr>
+        <w:commentReference w:id="79"/>
+      </w:r>
+      <w:commentRangeEnd w:id="80"/>
+      <w:r>
+        <w:rPr>
+          <w:rStyle w:val="CommentReference"/>
+        </w:rPr>
+        <w:commentReference w:id="80"/>
+      </w:r>
+      <w:ins w:id="88" w:author="Kelsey McCune" w:date="2026-04-08T11:25:00Z" w16du:dateUtc="2026-04-08T16:25:00Z">
+        <w:r>
+          <w:rPr>
+            <w:sz w:val="22"/>
+            <w:szCs w:val="22"/>
+          </w:rPr>
+          <w:t>.</w:t>
+        </w:r>
+      </w:ins>
+      <w:del w:id="89" w:author="Kelsey McCune" w:date="2026-04-08T11:25:00Z" w16du:dateUtc="2026-04-08T16:25:00Z">
+        <w:r>
+          <w:rPr>
+            <w:sz w:val="22"/>
+            <w:szCs w:val="22"/>
+          </w:rPr>
+          <w:delText>,</w:delText>
+        </w:r>
+      </w:del>
+      <w:r>
+        <w:rPr>
+          <w:sz w:val="22"/>
+          <w:szCs w:val="22"/>
+        </w:rPr>
+        <w:t xml:space="preserve"> </w:t>
+      </w:r>
+      <w:ins w:id="90" w:author="Kelsey McCune" w:date="2026-04-08T11:25:00Z" w16du:dateUtc="2026-04-08T16:25:00Z">
+        <w:r>
+          <w:rPr>
+            <w:sz w:val="22"/>
+            <w:szCs w:val="22"/>
+          </w:rPr>
+          <w:t>Conseq</w:t>
+        </w:r>
+      </w:ins>
+      <w:ins w:id="91" w:author="Kelsey McCune" w:date="2026-04-08T11:26:00Z" w16du:dateUtc="2026-04-08T16:26:00Z">
+        <w:r>
+          <w:rPr>
+            <w:sz w:val="22"/>
+            <w:szCs w:val="22"/>
+          </w:rPr>
+          <w:t xml:space="preserve">uently, poultry can serve as a bridge, increasing </w:t>
+        </w:r>
+      </w:ins>
+      <w:del w:id="92" w:author="Kelsey McCune" w:date="2026-04-08T11:26:00Z" w16du:dateUtc="2026-04-08T16:26:00Z">
+        <w:r>
+          <w:rPr>
+            <w:sz w:val="22"/>
+            <w:szCs w:val="22"/>
+          </w:rPr>
+          <w:delText>allow</w:delText>
+        </w:r>
+        <w:r>
+          <w:rPr>
+            <w:sz w:val="22"/>
+            <w:szCs w:val="22"/>
+          </w:rPr>
+          <w:delText>ing</w:delText>
+        </w:r>
+        <w:r>
+          <w:rPr>
+            <w:sz w:val="22"/>
+            <w:szCs w:val="22"/>
+          </w:rPr>
+          <w:delText xml:space="preserve"> for possible</w:delText>
+        </w:r>
+      </w:del>
+      <w:ins w:id="93" w:author="Kelsey McCune" w:date="2026-04-08T11:26:00Z" w16du:dateUtc="2026-04-08T16:26:00Z">
+        <w:r>
+          <w:rPr>
+            <w:sz w:val="22"/>
+            <w:szCs w:val="22"/>
+          </w:rPr>
+          <w:t>disease</w:t>
+        </w:r>
+      </w:ins>
+      <w:r>
+        <w:rPr>
+          <w:sz w:val="22"/>
+          <w:szCs w:val="22"/>
+        </w:rPr>
+        <w:t xml:space="preserve"> spillover </w:t>
+      </w:r>
+      <w:ins w:id="94" w:author="Kelsey McCune" w:date="2026-04-08T11:26:00Z" w16du:dateUtc="2026-04-08T16:26:00Z">
+        <w:r>
+          <w:rPr>
+            <w:sz w:val="22"/>
+            <w:szCs w:val="22"/>
+          </w:rPr>
+          <w:t>among</w:t>
+        </w:r>
+      </w:ins>
+      <w:del w:id="95" w:author="Kelsey McCune" w:date="2026-04-08T11:26:00Z" w16du:dateUtc="2026-04-08T16:26:00Z">
+        <w:r>
+          <w:rPr>
+            <w:sz w:val="22"/>
+            <w:szCs w:val="22"/>
+          </w:rPr>
+          <w:delText>to</w:delText>
+        </w:r>
+      </w:del>
+      <w:r>
+        <w:rPr>
+          <w:sz w:val="22"/>
+          <w:szCs w:val="22"/>
+        </w:rPr>
+        <w:t xml:space="preserve"> wild birds, humans, and </w:t>
+      </w:r>
+      <w:del w:id="96" w:author="Kelsey McCune" w:date="2026-04-08T11:26:00Z" w16du:dateUtc="2026-04-08T16:26:00Z">
+        <w:r>
+          <w:rPr>
+            <w:sz w:val="22"/>
+            <w:szCs w:val="22"/>
+          </w:rPr>
+          <w:delText>other domestic animals</w:delText>
+        </w:r>
+      </w:del>
+      <w:ins w:id="97" w:author="Kelsey McCune" w:date="2026-04-08T11:26:00Z" w16du:dateUtc="2026-04-08T16:26:00Z">
+        <w:r>
+          <w:rPr>
+            <w:sz w:val="22"/>
+            <w:szCs w:val="22"/>
+          </w:rPr>
+          <w:t>pets</w:t>
+        </w:r>
+      </w:ins>
+      <w:r>
+        <w:rPr>
+          <w:sz w:val="22"/>
+          <w:szCs w:val="22"/>
+        </w:rPr>
+        <w:t xml:space="preserve"> (Larsen et al. 2022). Salmonellosis is responsible for hundreds of documented wild bird mortality events (Hall and Saito 2008) and has been linked to human illness through contact with contaminated feeders and wild songbirds (Patel et al. 2021)</w:t>
+      </w:r>
+      <w:ins w:id="98" w:author="Kelsey McCune" w:date="2026-04-08T11:27:00Z" w16du:dateUtc="2026-04-08T16:27:00Z">
+        <w:r>
+          <w:rPr>
+            <w:sz w:val="22"/>
+            <w:szCs w:val="22"/>
+          </w:rPr>
+          <w:t xml:space="preserve"> or</w:t>
+        </w:r>
+      </w:ins>
+      <w:del w:id="99" w:author="Kelsey McCune" w:date="2026-04-08T11:27:00Z" w16du:dateUtc="2026-04-08T16:27:00Z">
+        <w:r>
+          <w:rPr>
+            <w:sz w:val="22"/>
+            <w:szCs w:val="22"/>
+          </w:rPr>
+          <w:delText>,</w:delText>
+        </w:r>
+      </w:del>
+      <w:r>
+        <w:rPr>
+          <w:sz w:val="22"/>
+          <w:szCs w:val="22"/>
+        </w:rPr>
+        <w:t xml:space="preserve"> </w:t>
+      </w:r>
+      <w:del w:id="100" w:author="Kelsey McCune" w:date="2026-04-08T11:27:00Z" w16du:dateUtc="2026-04-08T16:27:00Z">
+        <w:r>
+          <w:rPr>
+            <w:sz w:val="22"/>
+            <w:szCs w:val="22"/>
+          </w:rPr>
+          <w:delText xml:space="preserve">as well as </w:delText>
+        </w:r>
+      </w:del>
+      <w:r>
+        <w:rPr>
+          <w:sz w:val="22"/>
+          <w:szCs w:val="22"/>
+        </w:rPr>
+        <w:t xml:space="preserve">backyard poultry (CDC, 2025). The </w:t>
+      </w:r>
+      <w:del w:id="101" w:author="Kelsey McCune" w:date="2026-04-08T11:28:00Z" w16du:dateUtc="2026-04-08T16:28:00Z">
+        <w:r>
+          <w:rPr>
+            <w:sz w:val="22"/>
+            <w:szCs w:val="22"/>
+          </w:rPr>
+          <w:delText>combined proximity</w:delText>
+        </w:r>
+      </w:del>
+      <w:ins w:id="102" w:author="Kelsey McCune" w:date="2026-04-08T11:28:00Z" w16du:dateUtc="2026-04-08T16:28:00Z">
+        <w:r>
+          <w:rPr>
+            <w:sz w:val="22"/>
+            <w:szCs w:val="22"/>
+          </w:rPr>
+          <w:t>inter</w:t>
+        </w:r>
+      </w:ins>
+      <w:ins w:id="103" w:author="Kelsey McCune" w:date="2026-04-08T11:29:00Z" w16du:dateUtc="2026-04-08T16:29:00Z">
+        <w:r>
+          <w:rPr>
+            <w:sz w:val="22"/>
+            <w:szCs w:val="22"/>
+          </w:rPr>
+          <w:t>acting factors</w:t>
+        </w:r>
+      </w:ins>
+      <w:r>
+        <w:rPr>
+          <w:sz w:val="22"/>
+          <w:szCs w:val="22"/>
+        </w:rPr>
+        <w:t xml:space="preserve"> of human </w:t>
+      </w:r>
+      <w:del w:id="104" w:author="Kelsey McCune" w:date="2026-04-08T11:27:00Z" w16du:dateUtc="2026-04-08T16:27:00Z">
+        <w:r>
+          <w:rPr>
+            <w:sz w:val="22"/>
+            <w:szCs w:val="22"/>
+          </w:rPr>
+          <w:delText>dwellings</w:delText>
+        </w:r>
+      </w:del>
+      <w:ins w:id="105" w:author="Kelsey McCune" w:date="2026-04-08T11:27:00Z" w16du:dateUtc="2026-04-08T16:27:00Z">
+        <w:r>
+          <w:rPr>
+            <w:sz w:val="22"/>
+            <w:szCs w:val="22"/>
+          </w:rPr>
+          <w:t>activities</w:t>
+        </w:r>
+      </w:ins>
+      <w:r>
+        <w:rPr>
+          <w:sz w:val="22"/>
+          <w:szCs w:val="22"/>
+        </w:rPr>
+        <w:t xml:space="preserve">, bird feeders, and </w:t>
+      </w:r>
+      <w:del w:id="106" w:author="Kelsey McCune" w:date="2026-04-08T11:28:00Z" w16du:dateUtc="2026-04-08T16:28:00Z">
+        <w:r>
+          <w:rPr>
+            <w:sz w:val="22"/>
+            <w:szCs w:val="22"/>
+          </w:rPr>
+          <w:delText>chicken housing</w:delText>
+        </w:r>
+      </w:del>
+      <w:ins w:id="107" w:author="Kelsey McCune" w:date="2026-04-08T11:28:00Z" w16du:dateUtc="2026-04-08T16:28:00Z">
+        <w:r>
+          <w:rPr>
+            <w:sz w:val="22"/>
+            <w:szCs w:val="22"/>
+          </w:rPr>
+          <w:t>poultry</w:t>
+        </w:r>
+      </w:ins>
+      <w:r>
+        <w:rPr>
+          <w:sz w:val="22"/>
+          <w:szCs w:val="22"/>
+        </w:rPr>
+        <w:t xml:space="preserve"> </w:t>
+      </w:r>
+      <w:del w:id="108" w:author="Kelsey McCune" w:date="2026-04-08T11:29:00Z" w16du:dateUtc="2026-04-08T16:29:00Z">
+        <w:r>
+          <w:rPr>
+            <w:sz w:val="22"/>
+            <w:szCs w:val="22"/>
+          </w:rPr>
+          <w:delText>may render these interacting factors a</w:delText>
+        </w:r>
+      </w:del>
+      <w:ins w:id="109" w:author="Kelsey McCune" w:date="2026-04-08T11:29:00Z" w16du:dateUtc="2026-04-08T16:29:00Z">
+        <w:r>
+          <w:rPr>
+            <w:sz w:val="22"/>
+            <w:szCs w:val="22"/>
+          </w:rPr>
+          <w:t xml:space="preserve">could therefore increase the disease risk for native birds, but this has not yet been </w:t>
+        </w:r>
+      </w:ins>
+      <w:ins w:id="110" w:author="Kelsey McCune" w:date="2026-04-08T11:30:00Z" w16du:dateUtc="2026-04-08T16:30:00Z">
+        <w:r>
+          <w:rPr>
+            <w:sz w:val="22"/>
+            <w:szCs w:val="22"/>
+          </w:rPr>
+          <w:t xml:space="preserve">experimentally </w:t>
+        </w:r>
+      </w:ins>
+      <w:ins w:id="111" w:author="Kelsey McCune" w:date="2026-04-08T11:29:00Z" w16du:dateUtc="2026-04-08T16:29:00Z">
+        <w:r>
+          <w:rPr>
+            <w:sz w:val="22"/>
+            <w:szCs w:val="22"/>
+          </w:rPr>
+          <w:t>tested.</w:t>
+        </w:r>
+      </w:ins>
+      <w:r>
+        <w:rPr>
+          <w:sz w:val="22"/>
+          <w:szCs w:val="22"/>
+        </w:rPr>
+        <w:t xml:space="preserve"> </w:t>
+      </w:r>
+      <w:del w:id="112" w:author="Kelsey McCune" w:date="2026-04-08T11:29:00Z" w16du:dateUtc="2026-04-08T16:29:00Z">
+        <w:r>
+          <w:rPr>
+            <w:sz w:val="22"/>
+            <w:szCs w:val="22"/>
+          </w:rPr>
+          <w:delText xml:space="preserve">concern for public and wildlife health. </w:delText>
+        </w:r>
+      </w:del>
+    </w:p>
+    <w:p>
+      <w:pPr>
+        <w:ind w:firstLine="720"/>
+        <w:rPr>
+          <w:sz w:val="22"/>
+          <w:szCs w:val="22"/>
+        </w:rPr>
+        <w:pPrChange w:id="113" w:author="Kelsey McCune" w:date="2026-04-08T10:39:00Z" w16du:dateUtc="2026-04-08T15:39:00Z">
+          <w:pPr/>
+        </w:pPrChange>
+      </w:pPr>
+      <w:commentRangeStart w:id="114"/>
       <w:r>
         <w:rPr>
           <w:sz w:val="22"/>
@@ -1008,153 +2261,177 @@
         </w:rPr>
         <w:t xml:space="preserve"> and other pathogens was considerably lower, and the majority reported allowing visitors access to their animals with no biosecurity precautions required (Nicholson et al. 2020). Additionally, residential settings receive little outreach or oversight, and current studies may suggest that targeted education and risk mitigation practices can significantly reduce pathogen detection and contact rates at small-scale animal-keeping sites (Marín-Rojo et al. 2025; Kyle and Sutherland 2016). How those who participate in bird feeding respond to these same risks remains poorly documented, and understanding these responses is critical for evaluating the trade-offs between the potential risks and benefits that define these activities. </w:t>
       </w:r>
-    </w:p>
-    <w:p>
-      <w:pPr>
-        <w:rPr>
-          <w:sz w:val="22"/>
-          <w:szCs w:val="22"/>
-        </w:rPr>
-      </w:pPr>
-      <w:r>
-        <w:rPr>
-          <w:sz w:val="22"/>
-          <w:szCs w:val="22"/>
-        </w:rPr>
-        <w:t>The risk of disease spillover through bird feeding and backyard poultry keeping is potentially balanced by the benefits for the people who participate. Current research has shown that interacting with birds and nature can strengthen mental health through effects like reduced stress and anxiety, improved mood, cognitive restoration, and feelings of connection to the natural world (Cox and Gaston 2016; Pocock et al. 2023)</w:t>
-      </w:r>
-      <w:r>
-        <w:rPr>
-          <w:sz w:val="22"/>
-          <w:szCs w:val="22"/>
-        </w:rPr>
-        <w:t>.</w:t>
-      </w:r>
-      <w:r>
-        <w:rPr>
-          <w:sz w:val="22"/>
-          <w:szCs w:val="22"/>
-        </w:rPr>
-        <w:t xml:space="preserve"> For many people, maintaining a bird feeder provides the only daily form of accessible, low-cost interaction with wildlife. Studies have found that even brief exposure to birds in residential settings contributes positively to personal wellbeing, consistent with broader studies linking nature contact to psychological relief and stress recovery (Dayer et al. 2019)</w:t>
-      </w:r>
-      <w:r>
-        <w:rPr>
-          <w:sz w:val="22"/>
-          <w:szCs w:val="22"/>
-        </w:rPr>
-        <w:t>.</w:t>
-      </w:r>
-      <w:r>
-        <w:rPr>
-          <w:sz w:val="22"/>
-          <w:szCs w:val="22"/>
-        </w:rPr>
-        <w:t xml:space="preserve"> Small-scale poultry keeping is similarly associated with feelings of self-sufficiency, fulfillment, and stewardship, particularly among urban and suburban residents seeking engagement with food systems and animal care (Kyle and Sutherland 2016; Nicholson et al. 2020)</w:t>
-      </w:r>
-      <w:r>
-        <w:rPr>
-          <w:sz w:val="22"/>
-          <w:szCs w:val="22"/>
-        </w:rPr>
-        <w:t>.</w:t>
-      </w:r>
-      <w:r>
-        <w:rPr>
-          <w:sz w:val="22"/>
-          <w:szCs w:val="22"/>
-        </w:rPr>
-        <w:t xml:space="preserve"> Households with children may additionally benefit from the educational value of these activities by incorporating an early interest in wildlife, ecology, and sustainable food production. Engagement with backyard wildlife activities may also go beyond personal satisfaction to encourage broader conservation behaviors. Research has shown that people who feed and observe birds are more likely to engage in pro-conservation actions such as habitat stewardship, conservation donations, and advocacy for wildlife-friendly policies, suggesting that these activities may provide a link to broader environmental stewardship (Dayer et al. 2019; Pocock et al. 2023; Barbett et al. 2020). Understanding the conservation attitudes of participants in these backyard activities will be valuable for finding opportunities to promote evidence-based biosecurity guidelines to the public. The psychological and conservation benefits of backyard wildlife activities are important factors that must be weighed parallel to any relevant risks to health, wildlife, and environment when discussing activities such as bird feeding and small-scale poultry. </w:t>
-      </w:r>
-    </w:p>
-    <w:p>
-      <w:pPr>
+      <w:commentRangeEnd w:id="114"/>
+      <w:r>
+        <w:rPr>
+          <w:rStyle w:val="CommentReference"/>
+        </w:rPr>
+        <w:commentReference w:id="114"/>
+      </w:r>
+    </w:p>
+    <w:p>
+      <w:pPr>
+        <w:ind w:firstLine="720"/>
+        <w:rPr>
+          <w:moveFrom w:id="115" w:author="Kelsey McCune" w:date="2026-04-08T11:39:00Z" w16du:dateUtc="2026-04-08T16:39:00Z"/>
+          <w:sz w:val="22"/>
+          <w:szCs w:val="22"/>
+        </w:rPr>
+        <w:pPrChange w:id="116" w:author="Kelsey McCune" w:date="2026-04-08T10:39:00Z" w16du:dateUtc="2026-04-08T15:39:00Z">
+          <w:pPr/>
+        </w:pPrChange>
+      </w:pPr>
+      <w:moveFromRangeStart w:id="117" w:author="Kelsey McCune" w:date="2026-04-08T11:39:00Z" w:name="move226540801"/>
+      <w:moveFrom w:id="118" w:author="Kelsey McCune" w:date="2026-04-08T11:39:00Z" w16du:dateUtc="2026-04-08T16:39:00Z">
+        <w:r>
+          <w:rPr>
+            <w:sz w:val="22"/>
+            <w:szCs w:val="22"/>
+          </w:rPr>
+          <w:t xml:space="preserve">The risk of disease spillover through bird feeding and backyard poultry keeping is potentially balanced by the benefits for the people who participate. Current research has shown that interacting with birds and nature can strengthen mental health through effects like reduced stress and anxiety, improved mood, cognitive restoration, and feelings of connection to the natural world (Cox and Gaston 2016; Pocock et al. 2023). For many people, maintaining a bird feeder provides the only daily form of accessible, low-cost interaction with wildlife. Studies have found that even brief exposure to birds in residential settings contributes positively to personal wellbeing, consistent with broader studies linking nature contact to psychological relief and stress recovery (Dayer et al. 2019). Small-scale poultry keeping is similarly associated with feelings of self-sufficiency, fulfillment, and stewardship, particularly among urban and suburban residents seeking engagement with food systems and animal care (Kyle and Sutherland 2016; Nicholson et al. 2020). Households with children may additionally benefit from the educational value of these activities by incorporating an early interest in wildlife, ecology, and sustainable food production. Engagement with backyard wildlife activities may also go beyond personal satisfaction to encourage broader conservation behaviors. Research has shown that people who feed and observe birds are more likely to engage in pro-conservation actions such as habitat stewardship, conservation donations, and advocacy for wildlife-friendly policies, suggesting that these activities may provide a link to broader environmental stewardship (Dayer et al. 2019; Pocock et al. 2023; Barbett et al. 2020). Understanding the conservation attitudes of participants in these backyard activities will be valuable for finding opportunities to promote evidence-based biosecurity guidelines to the public. The psychological and conservation benefits of backyard wildlife activities are important factors that must be weighed parallel to any relevant risks to health, wildlife, and environment when discussing activities such as bird feeding and small-scale poultry. </w:t>
+        </w:r>
+      </w:moveFrom>
+    </w:p>
+    <w:moveFromRangeEnd w:id="117"/>
+    <w:p>
+      <w:pPr>
+        <w:ind w:firstLine="720"/>
+        <w:rPr>
+          <w:ins w:id="119" w:author="Kelsey McCune" w:date="2026-04-08T11:44:00Z" w16du:dateUtc="2026-04-08T16:44:00Z"/>
+          <w:sz w:val="22"/>
+          <w:szCs w:val="22"/>
+        </w:rPr>
+      </w:pPr>
+      <w:del w:id="120" w:author="Kelsey McCune" w:date="2026-04-08T15:28:00Z" w16du:dateUtc="2026-04-08T20:28:00Z">
+        <w:r>
+          <w:rPr>
+            <w:sz w:val="22"/>
+            <w:szCs w:val="22"/>
+          </w:rPr>
+          <w:delText xml:space="preserve">Most existing research on backyard wildlife activities and disease risk addresses bird feeding and small-scale poultry keeping in isolation, and few studies have examined disease ecology or spillover prevalence at residential sites where feeders and chickens are both present. </w:delText>
+        </w:r>
+      </w:del>
+      <w:commentRangeStart w:id="121"/>
+      <w:commentRangeStart w:id="122"/>
+      <w:r>
+        <w:rPr>
+          <w:sz w:val="22"/>
+          <w:szCs w:val="22"/>
+        </w:rPr>
+        <w:t xml:space="preserve">Even at feeder-present sites, little is known about how individual variation in feeder visitation frequency among wild birds may influence infection risk at the individual level, as individuals that visit food sources more frequently may experience greater exposure to environmental pathogens. </w:t>
+      </w:r>
+      <w:commentRangeEnd w:id="121"/>
+      <w:r>
+        <w:rPr>
+          <w:rStyle w:val="CommentReference"/>
+          <w:sz w:val="22"/>
+          <w:szCs w:val="22"/>
+        </w:rPr>
+        <w:commentReference w:id="121"/>
+      </w:r>
+      <w:commentRangeEnd w:id="122"/>
+      <w:r>
+        <w:rPr>
+          <w:rStyle w:val="CommentReference"/>
+        </w:rPr>
+        <w:commentReference w:id="122"/>
+      </w:r>
+      <w:del w:id="123" w:author="Kelsey McCune" w:date="2026-04-08T15:30:00Z" w16du:dateUtc="2026-04-08T20:30:00Z">
+        <w:r>
+          <w:rPr>
+            <w:sz w:val="22"/>
+            <w:szCs w:val="22"/>
+          </w:rPr>
+          <w:delText>This gap remains relevant in the southeastern United States, where suburban sprawl continues to expand the human-wildlife interface, seasonal variation in temperature and humidity creates year-round conditions for environmental pathogen persistence, and large agricultural presence encourages small-scale animal keeping</w:delText>
+        </w:r>
+      </w:del>
+      <w:del w:id="124" w:author="Kelsey McCune" w:date="2026-04-08T11:42:00Z" w16du:dateUtc="2026-04-08T16:42:00Z">
+        <w:r>
+          <w:rPr>
+            <w:sz w:val="22"/>
+            <w:szCs w:val="22"/>
+          </w:rPr>
+          <w:delText>,</w:delText>
+        </w:r>
+      </w:del>
+      <w:del w:id="125" w:author="Kelsey McCune" w:date="2026-04-08T15:30:00Z" w16du:dateUtc="2026-04-08T20:30:00Z">
+        <w:r>
+          <w:rPr>
+            <w:sz w:val="22"/>
+            <w:szCs w:val="22"/>
+          </w:rPr>
+          <w:delText xml:space="preserve"> </w:delText>
+        </w:r>
+      </w:del>
+      <w:del w:id="126" w:author="Kelsey McCune" w:date="2026-04-08T11:42:00Z" w16du:dateUtc="2026-04-08T16:42:00Z">
+        <w:r>
+          <w:rPr>
+            <w:sz w:val="22"/>
+            <w:szCs w:val="22"/>
+          </w:rPr>
+          <w:delText xml:space="preserve">and </w:delText>
+        </w:r>
+      </w:del>
+      <w:del w:id="127" w:author="Kelsey McCune" w:date="2026-04-08T15:30:00Z" w16du:dateUtc="2026-04-08T20:30:00Z">
+        <w:r>
+          <w:rPr>
+            <w:sz w:val="22"/>
+            <w:szCs w:val="22"/>
+          </w:rPr>
+          <w:delText>wildlife watching participation, including bird feeding, is among the highest of any region in the country, with the East South Central states reporting the highest residential wildlife watching rates nationally (USFWS 2022).</w:delText>
+        </w:r>
+      </w:del>
+      <w:r>
+        <w:rPr>
+          <w:sz w:val="22"/>
+          <w:szCs w:val="22"/>
+        </w:rPr>
+        <w:t xml:space="preserve"> </w:t>
+      </w:r>
+    </w:p>
+    <w:p>
+      <w:pPr>
+        <w:ind w:firstLine="720"/>
         <w:rPr>
           <w:sz w:val="13"/>
           <w:szCs w:val="13"/>
         </w:rPr>
-      </w:pPr>
-      <w:commentRangeStart w:id="5"/>
-      <w:commentRangeStart w:id="6"/>
-      <w:r>
-        <w:rPr>
-          <w:sz w:val="22"/>
-          <w:szCs w:val="22"/>
-        </w:rPr>
-        <w:t xml:space="preserve">Most existing research </w:t>
-      </w:r>
-      <w:commentRangeEnd w:id="5"/>
+        <w:pPrChange w:id="128" w:author="Kelsey McCune" w:date="2026-04-08T10:39:00Z" w16du:dateUtc="2026-04-08T15:39:00Z">
+          <w:pPr/>
+        </w:pPrChange>
+      </w:pPr>
+      <w:moveFromRangeStart w:id="129" w:author="Kelsey McCune" w:date="2026-04-08T11:44:00Z" w:name="move226541072"/>
+      <w:commentRangeStart w:id="130"/>
+      <w:moveFrom w:id="131" w:author="Kelsey McCune" w:date="2026-04-08T11:44:00Z" w16du:dateUtc="2026-04-08T16:44:00Z">
+        <w:r>
+          <w:rPr>
+            <w:sz w:val="22"/>
+            <w:szCs w:val="22"/>
+          </w:rPr>
+          <w:t xml:space="preserve">The degree to which participants in these activities perceive disease risks, engage in biosecurity practices such as feeder cleaning and personal hygiene, and are willing to modify their behaviors in response to evidence-based recommendations remains poorly characterized, particularly in the southeastern United States where both activities are prevalent. </w:t>
+        </w:r>
+      </w:moveFrom>
+      <w:moveFromRangeEnd w:id="129"/>
+      <w:r>
+        <w:rPr>
+          <w:sz w:val="22"/>
+          <w:szCs w:val="22"/>
+        </w:rPr>
+        <w:t>Recordin</w:t>
+      </w:r>
+      <w:commentRangeEnd w:id="130"/>
       <w:r>
         <w:rPr>
           <w:rStyle w:val="CommentReference"/>
-          <w:sz w:val="22"/>
-          <w:szCs w:val="22"/>
-        </w:rPr>
-        <w:commentReference w:id="5"/>
-      </w:r>
-      <w:commentRangeEnd w:id="6"/>
-      <w:r>
-        <w:rPr>
-          <w:rStyle w:val="CommentReference"/>
-          <w:sz w:val="22"/>
-          <w:szCs w:val="22"/>
-        </w:rPr>
-        <w:commentReference w:id="6"/>
-      </w:r>
-      <w:r>
-        <w:rPr>
-          <w:sz w:val="22"/>
-          <w:szCs w:val="22"/>
-        </w:rPr>
-        <w:t xml:space="preserve">on backyard wildlife activities and disease risk addresses bird feeding and small-scale poultry keeping in isolation, and few studies have examined disease ecology or spillover prevalence at residential sites where feeders and chickens are both present. </w:t>
-      </w:r>
-      <w:commentRangeStart w:id="7"/>
-      <w:r>
-        <w:rPr>
-          <w:sz w:val="22"/>
-          <w:szCs w:val="22"/>
-        </w:rPr>
-        <w:t xml:space="preserve">Even at feeder-present sites, little is known about how individual variation in feeder visitation frequency among wild birds may influence infection risk at the individual level, as individuals that visit food sources more frequently may experience greater exposure to environmental pathogens. </w:t>
-      </w:r>
-      <w:commentRangeEnd w:id="7"/>
-      <w:r>
-        <w:rPr>
-          <w:rStyle w:val="CommentReference"/>
-          <w:sz w:val="22"/>
-          <w:szCs w:val="22"/>
-        </w:rPr>
-        <w:commentReference w:id="7"/>
-      </w:r>
-      <w:commentRangeStart w:id="8"/>
-      <w:r>
-        <w:rPr>
-          <w:sz w:val="22"/>
-          <w:szCs w:val="22"/>
-        </w:rPr>
-        <w:t>This gap remains relevant in the southeastern United States, where suburban sprawl continues to expand the human-wildlife interface, seasonal variation in temperature and humidity creates year-round conditions for environmental pathogen persistence, and large agricultural presence encourages small-scale animal keeping, and wildlife watching participation, including bird</w:t>
-      </w:r>
-      <w:commentRangeEnd w:id="8"/>
-      <w:r>
-        <w:rPr>
-          <w:rStyle w:val="CommentReference"/>
-          <w:sz w:val="22"/>
-          <w:szCs w:val="22"/>
-        </w:rPr>
-        <w:commentReference w:id="8"/>
-      </w:r>
-      <w:r>
-        <w:rPr>
-          <w:sz w:val="22"/>
-          <w:szCs w:val="22"/>
-        </w:rPr>
-        <w:t xml:space="preserve"> feeding, is among the highest of any region in the country, with the East South Central states reporting the highest residential wildlife watching rates nationally (USFWS 2022). The degree to which participants in these activities perceive disease risks, engage in biosecurity practices such as feeder cleaning and personal hygiene, and are willing to modify their behaviors in response to evidence-based recommendations remains poorly characterized, particularly in the southeastern United States where both activities are prevalent. </w:t>
-      </w:r>
-      <w:commentRangeStart w:id="9"/>
-      <w:r>
-        <w:rPr>
-          <w:sz w:val="22"/>
-          <w:szCs w:val="22"/>
-        </w:rPr>
-        <w:t>Recording</w:t>
+        </w:rPr>
+        <w:commentReference w:id="130"/>
+      </w:r>
+      <w:r>
+        <w:rPr>
+          <w:sz w:val="22"/>
+          <w:szCs w:val="22"/>
+        </w:rPr>
+        <w:t>g</w:t>
       </w:r>
       <w:r>
         <w:rPr>
@@ -1189,23 +2466,7 @@
           <w:sz w:val="22"/>
           <w:szCs w:val="22"/>
         </w:rPr>
-        <w:t xml:space="preserve"> pathogen prevalence data and linking ecological findings to participant behavior and risk perception</w:t>
-      </w:r>
-      <w:commentRangeEnd w:id="9"/>
-      <w:r>
-        <w:rPr>
-          <w:rStyle w:val="CommentReference"/>
-          <w:sz w:val="22"/>
-          <w:szCs w:val="22"/>
-        </w:rPr>
-        <w:commentReference w:id="9"/>
-      </w:r>
-      <w:r>
-        <w:rPr>
-          <w:sz w:val="22"/>
-          <w:szCs w:val="22"/>
-        </w:rPr>
-        <w:t>.</w:t>
+        <w:t xml:space="preserve"> pathogen prevalence data and linking ecological findings to participant behavior and risk perception.</w:t>
       </w:r>
       <w:r>
         <w:rPr>
@@ -1219,32 +2480,7 @@
           <w:sz w:val="22"/>
           <w:szCs w:val="22"/>
         </w:rPr>
-        <w:t xml:space="preserve">Closing these knowledge gaps is critical for developing evidence-based </w:t>
-      </w:r>
-      <w:r>
-        <w:rPr>
-          <w:sz w:val="22"/>
-          <w:szCs w:val="22"/>
-        </w:rPr>
-        <w:lastRenderedPageBreak/>
-        <w:t xml:space="preserve">guidelines that allow people to enjoy the benefits of backyard activities while reducing risk to wild birds, domestic animals, and </w:t>
-      </w:r>
-      <w:commentRangeStart w:id="10"/>
-      <w:r>
-        <w:rPr>
-          <w:sz w:val="22"/>
-          <w:szCs w:val="22"/>
-        </w:rPr>
-        <w:t>human health.</w:t>
-      </w:r>
-      <w:commentRangeEnd w:id="10"/>
-      <w:r>
-        <w:rPr>
-          <w:rStyle w:val="CommentReference"/>
-          <w:sz w:val="13"/>
-          <w:szCs w:val="13"/>
-        </w:rPr>
-        <w:commentReference w:id="10"/>
+        <w:t>Closing these knowledge gaps is critical for developing evidence-based guidelines that allow people to enjoy the benefits of backyard activities while reducing risk to wild birds, domestic animals, and human health.</w:t>
       </w:r>
     </w:p>
     <w:p/>
@@ -1356,7 +2592,291 @@
           <w:sz w:val="22"/>
           <w:szCs w:val="22"/>
         </w:rPr>
-        <w:t xml:space="preserve">This study is conducted along an urban-to-rural gradient in central Alabama. Twelve sites are sampled monthly, categorized into four treatment types: control sites with no feeders or poultry (n = 4), backyard bird feeder-only sites (n = 4), backyard chicken-only sites (n = 2), and backyard sites with both bird feeders and chickens (n = 2). Sites were selected to best represent the gradient of forested to rural habitat to capture pathogen dynamics at the human-wildlife interface. A standardized site entry questionnaire is administered to record factors such as feeder type and placement, poultry housing, current cleaning practices, and </w:t>
+        <w:t xml:space="preserve">This study </w:t>
+      </w:r>
+      <w:ins w:id="132" w:author="Kelsey McCune" w:date="2026-04-08T15:44:00Z" w16du:dateUtc="2026-04-08T20:44:00Z">
+        <w:r>
+          <w:rPr>
+            <w:sz w:val="22"/>
+            <w:szCs w:val="22"/>
+          </w:rPr>
+          <w:t xml:space="preserve">will occur across </w:t>
+        </w:r>
+      </w:ins>
+      <w:del w:id="133" w:author="Kelsey McCune" w:date="2026-04-08T15:44:00Z" w16du:dateUtc="2026-04-08T20:44:00Z">
+        <w:r>
+          <w:rPr>
+            <w:sz w:val="22"/>
+            <w:szCs w:val="22"/>
+          </w:rPr>
+          <w:delText xml:space="preserve">is conducted along an urban-to-rural gradient in central Alabama. </w:delText>
+        </w:r>
+      </w:del>
+      <w:ins w:id="134" w:author="Kelsey McCune" w:date="2026-04-08T15:44:00Z" w16du:dateUtc="2026-04-08T20:44:00Z">
+        <w:r>
+          <w:rPr>
+            <w:sz w:val="22"/>
+            <w:szCs w:val="22"/>
+          </w:rPr>
+          <w:t>t</w:t>
+        </w:r>
+      </w:ins>
+      <w:del w:id="135" w:author="Kelsey McCune" w:date="2026-04-08T15:44:00Z" w16du:dateUtc="2026-04-08T20:44:00Z">
+        <w:r>
+          <w:rPr>
+            <w:sz w:val="22"/>
+            <w:szCs w:val="22"/>
+          </w:rPr>
+          <w:delText>T</w:delText>
+        </w:r>
+      </w:del>
+      <w:r>
+        <w:rPr>
+          <w:sz w:val="22"/>
+          <w:szCs w:val="22"/>
+        </w:rPr>
+        <w:t>welve sites</w:t>
+      </w:r>
+      <w:ins w:id="136" w:author="Kelsey McCune" w:date="2026-04-08T15:54:00Z" w16du:dateUtc="2026-04-08T20:54:00Z">
+        <w:r>
+          <w:rPr>
+            <w:sz w:val="22"/>
+            <w:szCs w:val="22"/>
+          </w:rPr>
+          <w:t xml:space="preserve"> across east-central A</w:t>
+        </w:r>
+      </w:ins>
+      <w:ins w:id="137" w:author="Kelsey McCune" w:date="2026-04-08T15:55:00Z" w16du:dateUtc="2026-04-08T20:55:00Z">
+        <w:r>
+          <w:rPr>
+            <w:sz w:val="22"/>
+            <w:szCs w:val="22"/>
+          </w:rPr>
+          <w:t>labama</w:t>
+        </w:r>
+      </w:ins>
+      <w:r>
+        <w:rPr>
+          <w:sz w:val="22"/>
+          <w:szCs w:val="22"/>
+        </w:rPr>
+        <w:t xml:space="preserve"> </w:t>
+      </w:r>
+      <w:del w:id="138" w:author="Kelsey McCune" w:date="2026-04-08T15:44:00Z" w16du:dateUtc="2026-04-08T20:44:00Z">
+        <w:r>
+          <w:rPr>
+            <w:sz w:val="22"/>
+            <w:szCs w:val="22"/>
+          </w:rPr>
+          <w:delText xml:space="preserve">are sampled monthly, </w:delText>
+        </w:r>
+      </w:del>
+      <w:r>
+        <w:rPr>
+          <w:sz w:val="22"/>
+          <w:szCs w:val="22"/>
+        </w:rPr>
+        <w:t xml:space="preserve">categorized into four treatment types: control sites with no feeders or poultry (n = 4), backyard bird feeder-only sites (n = 4), backyard chicken-only sites (n = </w:t>
+      </w:r>
+      <w:ins w:id="139" w:author="Kelsey McCune" w:date="2026-04-08T15:48:00Z" w16du:dateUtc="2026-04-08T20:48:00Z">
+        <w:r>
+          <w:rPr>
+            <w:sz w:val="22"/>
+            <w:szCs w:val="22"/>
+          </w:rPr>
+          <w:t>4</w:t>
+        </w:r>
+      </w:ins>
+      <w:del w:id="140" w:author="Kelsey McCune" w:date="2026-04-08T15:48:00Z" w16du:dateUtc="2026-04-08T20:48:00Z">
+        <w:r>
+          <w:rPr>
+            <w:sz w:val="22"/>
+            <w:szCs w:val="22"/>
+          </w:rPr>
+          <w:delText>2</w:delText>
+        </w:r>
+      </w:del>
+      <w:r>
+        <w:rPr>
+          <w:sz w:val="22"/>
+          <w:szCs w:val="22"/>
+        </w:rPr>
+        <w:t xml:space="preserve">), and backyard sites with both bird feeders and chickens (n = </w:t>
+      </w:r>
+      <w:ins w:id="141" w:author="Kelsey McCune" w:date="2026-04-08T15:45:00Z" w16du:dateUtc="2026-04-08T20:45:00Z">
+        <w:r>
+          <w:rPr>
+            <w:sz w:val="22"/>
+            <w:szCs w:val="22"/>
+          </w:rPr>
+          <w:t>4</w:t>
+        </w:r>
+      </w:ins>
+      <w:del w:id="142" w:author="Kelsey McCune" w:date="2026-04-08T15:45:00Z" w16du:dateUtc="2026-04-08T20:45:00Z">
+        <w:r>
+          <w:rPr>
+            <w:sz w:val="22"/>
+            <w:szCs w:val="22"/>
+          </w:rPr>
+          <w:delText>2</w:delText>
+        </w:r>
+      </w:del>
+      <w:r>
+        <w:rPr>
+          <w:sz w:val="22"/>
+          <w:szCs w:val="22"/>
+        </w:rPr>
+        <w:t>).</w:t>
+      </w:r>
+      <w:del w:id="143" w:author="Kelsey McCune" w:date="2026-04-08T15:45:00Z" w16du:dateUtc="2026-04-08T20:45:00Z">
+        <w:r>
+          <w:rPr>
+            <w:sz w:val="22"/>
+            <w:szCs w:val="22"/>
+          </w:rPr>
+          <w:delText xml:space="preserve"> </w:delText>
+        </w:r>
+      </w:del>
+      <w:ins w:id="144" w:author="Kelsey McCune" w:date="2026-04-08T15:45:00Z" w16du:dateUtc="2026-04-08T20:45:00Z">
+        <w:r>
+          <w:rPr>
+            <w:sz w:val="22"/>
+            <w:szCs w:val="22"/>
+          </w:rPr>
+          <w:t xml:space="preserve"> </w:t>
+        </w:r>
+      </w:ins>
+      <w:ins w:id="145" w:author="Kelsey McCune" w:date="2026-04-08T15:47:00Z" w16du:dateUtc="2026-04-08T20:47:00Z">
+        <w:r>
+          <w:rPr>
+            <w:sz w:val="22"/>
+            <w:szCs w:val="22"/>
+          </w:rPr>
+          <w:t>I selected s</w:t>
+        </w:r>
+      </w:ins>
+      <w:del w:id="146" w:author="Kelsey McCune" w:date="2026-04-08T15:47:00Z" w16du:dateUtc="2026-04-08T20:47:00Z">
+        <w:r>
+          <w:rPr>
+            <w:sz w:val="22"/>
+            <w:szCs w:val="22"/>
+          </w:rPr>
+          <w:delText>S</w:delText>
+        </w:r>
+      </w:del>
+      <w:r>
+        <w:rPr>
+          <w:sz w:val="22"/>
+          <w:szCs w:val="22"/>
+        </w:rPr>
+        <w:t xml:space="preserve">ites </w:t>
+      </w:r>
+      <w:del w:id="147" w:author="Kelsey McCune" w:date="2026-04-08T15:48:00Z" w16du:dateUtc="2026-04-08T20:48:00Z">
+        <w:r>
+          <w:rPr>
+            <w:sz w:val="22"/>
+            <w:szCs w:val="22"/>
+          </w:rPr>
+          <w:delText>were selected to best represent the</w:delText>
+        </w:r>
+      </w:del>
+      <w:ins w:id="148" w:author="Kelsey McCune" w:date="2026-04-08T15:48:00Z" w16du:dateUtc="2026-04-08T20:48:00Z">
+        <w:r>
+          <w:rPr>
+            <w:sz w:val="22"/>
+            <w:szCs w:val="22"/>
+          </w:rPr>
+          <w:t>that had a baseline number of trees a</w:t>
+        </w:r>
+      </w:ins>
+      <w:ins w:id="149" w:author="Kelsey McCune" w:date="2026-04-08T15:49:00Z" w16du:dateUtc="2026-04-08T20:49:00Z">
+        <w:r>
+          <w:rPr>
+            <w:sz w:val="22"/>
+            <w:szCs w:val="22"/>
+          </w:rPr>
+          <w:t>nd shrubs to insure bird habitat is present</w:t>
+        </w:r>
+      </w:ins>
+      <w:del w:id="150" w:author="Kelsey McCune" w:date="2026-04-08T15:48:00Z" w16du:dateUtc="2026-04-08T20:48:00Z">
+        <w:r>
+          <w:rPr>
+            <w:sz w:val="22"/>
+            <w:szCs w:val="22"/>
+          </w:rPr>
+          <w:delText xml:space="preserve"> gradient of forested to rural habitat to capture pathogen dynamics at the human-wildlife interface</w:delText>
+        </w:r>
+      </w:del>
+      <w:r>
+        <w:rPr>
+          <w:sz w:val="22"/>
+          <w:szCs w:val="22"/>
+        </w:rPr>
+        <w:t>. A</w:t>
+      </w:r>
+      <w:ins w:id="151" w:author="Kelsey McCune" w:date="2026-04-08T15:53:00Z" w16du:dateUtc="2026-04-08T20:53:00Z">
+        <w:r>
+          <w:rPr>
+            <w:sz w:val="22"/>
+            <w:szCs w:val="22"/>
+          </w:rPr>
+          <w:t>fter selecting a site, I asked homeowners to complete a</w:t>
+        </w:r>
+      </w:ins>
+      <w:r>
+        <w:rPr>
+          <w:sz w:val="22"/>
+          <w:szCs w:val="22"/>
+        </w:rPr>
+        <w:t xml:space="preserve"> standardized</w:t>
+      </w:r>
+      <w:del w:id="152" w:author="Kelsey McCune" w:date="2026-04-08T15:53:00Z" w16du:dateUtc="2026-04-08T20:53:00Z">
+        <w:r>
+          <w:rPr>
+            <w:sz w:val="22"/>
+            <w:szCs w:val="22"/>
+          </w:rPr>
+          <w:delText xml:space="preserve"> site entry</w:delText>
+        </w:r>
+      </w:del>
+      <w:r>
+        <w:rPr>
+          <w:sz w:val="22"/>
+          <w:szCs w:val="22"/>
+        </w:rPr>
+        <w:t xml:space="preserve"> questionnaire</w:t>
+      </w:r>
+      <w:del w:id="153" w:author="Kelsey McCune" w:date="2026-04-08T15:54:00Z" w16du:dateUtc="2026-04-08T20:54:00Z">
+        <w:r>
+          <w:rPr>
+            <w:sz w:val="22"/>
+            <w:szCs w:val="22"/>
+          </w:rPr>
+          <w:delText xml:space="preserve"> is administered</w:delText>
+        </w:r>
+      </w:del>
+      <w:r>
+        <w:rPr>
+          <w:sz w:val="22"/>
+          <w:szCs w:val="22"/>
+        </w:rPr>
+        <w:t xml:space="preserve"> to record factors such as feeder type and placement, poultry housing, current cleaning practices,</w:t>
+      </w:r>
+      <w:ins w:id="154" w:author="Kelsey McCune" w:date="2026-04-08T15:54:00Z" w16du:dateUtc="2026-04-08T20:54:00Z">
+        <w:r>
+          <w:rPr>
+            <w:sz w:val="22"/>
+            <w:szCs w:val="22"/>
+          </w:rPr>
+          <w:t xml:space="preserve"> presence of pets</w:t>
+        </w:r>
+      </w:ins>
+      <w:r>
+        <w:rPr>
+          <w:sz w:val="22"/>
+          <w:szCs w:val="22"/>
+        </w:rPr>
+        <w:t xml:space="preserve"> and </w:t>
       </w:r>
       <w:r>
         <w:rPr>
@@ -1411,7 +2931,182 @@
           <w:sz w:val="22"/>
           <w:szCs w:val="22"/>
         </w:rPr>
-        <w:t xml:space="preserve">Field sampling began in summer 2024 and continues through 2027, with monthly visits to each site. To date, over 230 wild songbirds have been captured using mist nets deployed near feeders, coops, or comparable areas at control sites. Each bird is identified to species-level and sexed, when possible, measured for body mass, wing chord, tarsus length, and bill and skull dimensions. All individuals receive a sequentially numbered USGS </w:t>
+        <w:t>Field sampling began in summer 2024 and continues through 2027</w:t>
+      </w:r>
+      <w:del w:id="155" w:author="Kelsey McCune" w:date="2026-04-08T15:46:00Z" w16du:dateUtc="2026-04-08T20:46:00Z">
+        <w:r>
+          <w:rPr>
+            <w:sz w:val="22"/>
+            <w:szCs w:val="22"/>
+          </w:rPr>
+          <w:delText>, with monthly visits to each site</w:delText>
+        </w:r>
+      </w:del>
+      <w:r>
+        <w:rPr>
+          <w:sz w:val="22"/>
+          <w:szCs w:val="22"/>
+        </w:rPr>
+        <w:t>.</w:t>
+      </w:r>
+      <w:ins w:id="156" w:author="Kelsey McCune" w:date="2026-04-08T15:46:00Z" w16du:dateUtc="2026-04-08T20:46:00Z">
+        <w:r>
+          <w:rPr>
+            <w:sz w:val="22"/>
+            <w:szCs w:val="22"/>
+          </w:rPr>
+          <w:t xml:space="preserve"> </w:t>
+        </w:r>
+        <w:r>
+          <w:rPr>
+            <w:sz w:val="22"/>
+            <w:szCs w:val="22"/>
+          </w:rPr>
+          <w:t>I visit each site once a month to sample wild birds and chickens (if present).</w:t>
+        </w:r>
+      </w:ins>
+      <w:r>
+        <w:rPr>
+          <w:sz w:val="22"/>
+          <w:szCs w:val="22"/>
+        </w:rPr>
+        <w:t xml:space="preserve"> To date, over 230 wild songbirds have been captured using mist nets deployed near feeders, </w:t>
+      </w:r>
+      <w:ins w:id="157" w:author="Kelsey McCune" w:date="2026-04-08T15:55:00Z" w16du:dateUtc="2026-04-08T20:55:00Z">
+        <w:r>
+          <w:rPr>
+            <w:sz w:val="22"/>
+            <w:szCs w:val="22"/>
+          </w:rPr>
+          <w:t xml:space="preserve">chicken </w:t>
+        </w:r>
+      </w:ins>
+      <w:r>
+        <w:rPr>
+          <w:sz w:val="22"/>
+          <w:szCs w:val="22"/>
+        </w:rPr>
+        <w:t>coops, or comparable areas at control sites. Each bird is identified to species-level</w:t>
+      </w:r>
+      <w:del w:id="158" w:author="Kelsey McCune" w:date="2026-04-08T15:56:00Z" w16du:dateUtc="2026-04-08T20:56:00Z">
+        <w:r>
+          <w:rPr>
+            <w:sz w:val="22"/>
+            <w:szCs w:val="22"/>
+          </w:rPr>
+          <w:delText xml:space="preserve"> and sexed, when possible</w:delText>
+        </w:r>
+      </w:del>
+      <w:ins w:id="159" w:author="Kelsey McCune" w:date="2026-04-08T15:56:00Z" w16du:dateUtc="2026-04-08T20:56:00Z">
+        <w:r>
+          <w:rPr>
+            <w:sz w:val="22"/>
+            <w:szCs w:val="22"/>
+          </w:rPr>
+          <w:t xml:space="preserve"> and</w:t>
+        </w:r>
+      </w:ins>
+      <w:del w:id="160" w:author="Kelsey McCune" w:date="2026-04-08T15:56:00Z" w16du:dateUtc="2026-04-08T20:56:00Z">
+        <w:r>
+          <w:rPr>
+            <w:sz w:val="22"/>
+            <w:szCs w:val="22"/>
+          </w:rPr>
+          <w:delText>,</w:delText>
+        </w:r>
+      </w:del>
+      <w:r>
+        <w:rPr>
+          <w:sz w:val="22"/>
+          <w:szCs w:val="22"/>
+        </w:rPr>
+        <w:t xml:space="preserve"> measured for body </w:t>
+      </w:r>
+      <w:del w:id="161" w:author="Kelsey McCune" w:date="2026-04-08T15:56:00Z" w16du:dateUtc="2026-04-08T20:56:00Z">
+        <w:r>
+          <w:rPr>
+            <w:sz w:val="22"/>
+            <w:szCs w:val="22"/>
+          </w:rPr>
+          <w:delText>mass, wing chord, tarsus length, and bill and skull dimensions</w:delText>
+        </w:r>
+      </w:del>
+      <w:ins w:id="162" w:author="Kelsey McCune" w:date="2026-04-08T15:56:00Z" w16du:dateUtc="2026-04-08T20:56:00Z">
+        <w:r>
+          <w:rPr>
+            <w:sz w:val="22"/>
+            <w:szCs w:val="22"/>
+          </w:rPr>
+          <w:t>condition</w:t>
+        </w:r>
+      </w:ins>
+      <w:r>
+        <w:rPr>
+          <w:sz w:val="22"/>
+          <w:szCs w:val="22"/>
+        </w:rPr>
+        <w:t xml:space="preserve">. All individuals receive a sequentially numbered USGS </w:t>
+      </w:r>
+      <w:r>
+        <w:rPr>
+          <w:sz w:val="22"/>
+          <w:szCs w:val="22"/>
+          <w:rPrChange w:id="163" w:author="Kelsey McCune" w:date="2026-04-08T15:56:00Z" w16du:dateUtc="2026-04-08T20:56:00Z">
+            <w:rPr>
+              <w:sz w:val="22"/>
+              <w:szCs w:val="22"/>
+              <w:highlight w:val="red"/>
+            </w:rPr>
+          </w:rPrChange>
+        </w:rPr>
+        <w:t>aluminum</w:t>
+      </w:r>
+      <w:del w:id="164" w:author="Kelsey McCune" w:date="2026-04-08T15:56:00Z" w16du:dateUtc="2026-04-08T20:56:00Z">
+        <w:r>
+          <w:rPr>
+            <w:sz w:val="22"/>
+            <w:szCs w:val="22"/>
+            <w:rPrChange w:id="165" w:author="Kelsey McCune" w:date="2026-04-08T15:56:00Z" w16du:dateUtc="2026-04-08T20:56:00Z">
+              <w:rPr>
+                <w:sz w:val="22"/>
+                <w:szCs w:val="22"/>
+                <w:highlight w:val="red"/>
+              </w:rPr>
+            </w:rPrChange>
+          </w:rPr>
+          <w:delText>?</w:delText>
+        </w:r>
+      </w:del>
+      <w:r>
+        <w:rPr>
+          <w:sz w:val="22"/>
+          <w:szCs w:val="22"/>
+        </w:rPr>
+        <w:t xml:space="preserve"> leg band. </w:t>
+      </w:r>
+      <w:commentRangeStart w:id="166"/>
+      <w:r>
+        <w:rPr>
+          <w:sz w:val="22"/>
+          <w:szCs w:val="22"/>
+        </w:rPr>
+        <w:t>A subset of common resident species including Carolina Chickadee, Tufted Titmouse, Carolina Wren, Blue Jay, Downy Woodpecker, House Finch, and Northern Cardinal</w:t>
+      </w:r>
+      <w:del w:id="167" w:author="Kelsey McCune" w:date="2026-04-08T15:57:00Z" w16du:dateUtc="2026-04-08T20:57:00Z">
+        <w:r>
+          <w:rPr>
+            <w:sz w:val="22"/>
+            <w:szCs w:val="22"/>
+          </w:rPr>
+          <w:delText>-</w:delText>
+        </w:r>
+      </w:del>
+      <w:r>
+        <w:rPr>
+          <w:sz w:val="22"/>
+          <w:szCs w:val="22"/>
+        </w:rPr>
+        <w:t xml:space="preserve"> receive passive integrated transponder (PIT) leg bands </w:t>
       </w:r>
       <w:r>
         <w:rPr>
@@ -1419,21 +3114,6 @@
           <w:szCs w:val="22"/>
           <w:highlight w:val="red"/>
         </w:rPr>
-        <w:t>aluminum?</w:t>
-      </w:r>
-      <w:r>
-        <w:rPr>
-          <w:sz w:val="22"/>
-          <w:szCs w:val="22"/>
-        </w:rPr>
-        <w:t xml:space="preserve"> leg band. A subset of common resident species including Carolina Chickadee, Tufted Titmouse, Carolina Wren, Blue Jay, Downy Woodpecker, House Finch, and Northern Cardinal- receive passive integrated transponder (PIT) leg bands </w:t>
-      </w:r>
-      <w:r>
-        <w:rPr>
-          <w:sz w:val="22"/>
-          <w:szCs w:val="22"/>
-          <w:highlight w:val="red"/>
-        </w:rPr>
         <w:t>(Cite- Collins?).</w:t>
       </w:r>
       <w:r>
@@ -1443,20 +3123,62 @@
         </w:rPr>
         <w:t xml:space="preserve"> Radio-frequency identification (RFID) antennas installed at feeders, inside coops, and on perches at control sites record date- and time-stamped visits from PIT-tagged individuals. Migratory and unlisted species do not receive PIT tags.</w:t>
       </w:r>
-    </w:p>
-    <w:p>
-      <w:pPr>
-        <w:rPr>
-          <w:sz w:val="22"/>
-          <w:szCs w:val="22"/>
-        </w:rPr>
-      </w:pPr>
-      <w:r>
-        <w:rPr>
-          <w:sz w:val="22"/>
-          <w:szCs w:val="22"/>
-        </w:rPr>
-        <w:t>Fecal samples are collected from each captured bird via cloacal swab or from fresh droppings on clean surfaces. Backyard chicken fecal samples and soil/surface swabs from feeder and coop areas are also collected to characterize environmental pathogen reservoirs. All samples are transported on ice and stored at -80°C until processing.</w:t>
+      <w:commentRangeEnd w:id="166"/>
+      <w:r>
+        <w:rPr>
+          <w:rStyle w:val="CommentReference"/>
+        </w:rPr>
+        <w:commentReference w:id="166"/>
+      </w:r>
+    </w:p>
+    <w:p>
+      <w:pPr>
+        <w:rPr>
+          <w:sz w:val="22"/>
+          <w:szCs w:val="22"/>
+        </w:rPr>
+      </w:pPr>
+      <w:ins w:id="168" w:author="Kelsey McCune" w:date="2026-04-08T15:59:00Z" w16du:dateUtc="2026-04-08T20:59:00Z">
+        <w:r>
+          <w:rPr>
+            <w:sz w:val="22"/>
+            <w:szCs w:val="22"/>
+          </w:rPr>
+          <w:lastRenderedPageBreak/>
+          <w:t>I collected fecal</w:t>
+        </w:r>
+      </w:ins>
+      <w:del w:id="169" w:author="Kelsey McCune" w:date="2026-04-08T15:59:00Z" w16du:dateUtc="2026-04-08T20:59:00Z">
+        <w:r>
+          <w:rPr>
+            <w:sz w:val="22"/>
+            <w:szCs w:val="22"/>
+          </w:rPr>
+          <w:delText>Fecal</w:delText>
+        </w:r>
+      </w:del>
+      <w:r>
+        <w:rPr>
+          <w:sz w:val="22"/>
+          <w:szCs w:val="22"/>
+        </w:rPr>
+        <w:t xml:space="preserve"> samples </w:t>
+      </w:r>
+      <w:del w:id="170" w:author="Kelsey McCune" w:date="2026-04-08T15:59:00Z" w16du:dateUtc="2026-04-08T20:59:00Z">
+        <w:r>
+          <w:rPr>
+            <w:sz w:val="22"/>
+            <w:szCs w:val="22"/>
+          </w:rPr>
+          <w:delText xml:space="preserve">are collected </w:delText>
+        </w:r>
+      </w:del>
+      <w:r>
+        <w:rPr>
+          <w:sz w:val="22"/>
+          <w:szCs w:val="22"/>
+        </w:rPr>
+        <w:t>from each captured bird via cloacal swab or from fresh droppings on clean surfaces. Backyard chicken fecal samples and soil/surface swabs from feeder and coop areas are also collected to characterize environmental pathogen reservoirs. All samples are transported on ice and stored at -80°C until processing.</w:t>
       </w:r>
     </w:p>
     <w:p>
@@ -1506,7 +3228,32 @@
           <w:sz w:val="22"/>
           <w:szCs w:val="22"/>
         </w:rPr>
-        <w:t xml:space="preserve"> detection. Presumptive colonies are confirmed using </w:t>
+        <w:t xml:space="preserve"> detection. Presumptive colonies </w:t>
+      </w:r>
+      <w:ins w:id="171" w:author="Kelsey McCune" w:date="2026-04-08T16:00:00Z" w16du:dateUtc="2026-04-08T21:00:00Z">
+        <w:r>
+          <w:rPr>
+            <w:sz w:val="22"/>
+            <w:szCs w:val="22"/>
+          </w:rPr>
+          <w:t>will be</w:t>
+        </w:r>
+      </w:ins>
+      <w:del w:id="172" w:author="Kelsey McCune" w:date="2026-04-08T16:00:00Z" w16du:dateUtc="2026-04-08T21:00:00Z">
+        <w:r>
+          <w:rPr>
+            <w:sz w:val="22"/>
+            <w:szCs w:val="22"/>
+          </w:rPr>
+          <w:delText>are</w:delText>
+        </w:r>
+      </w:del>
+      <w:r>
+        <w:rPr>
+          <w:sz w:val="22"/>
+          <w:szCs w:val="22"/>
+        </w:rPr>
+        <w:t xml:space="preserve"> confirmed using </w:t>
       </w:r>
       <w:r>
         <w:rPr>
@@ -1521,59 +3268,152 @@
           <w:sz w:val="22"/>
           <w:szCs w:val="22"/>
         </w:rPr>
-        <w:t xml:space="preserve"> Confirmed isolates are archived for potential serotyping or whole-genome sequencing.</w:t>
-      </w:r>
-    </w:p>
-    <w:p>
-      <w:pPr>
-        <w:rPr>
+        <w:t xml:space="preserve"> </w:t>
+      </w:r>
+      <w:ins w:id="173" w:author="Kelsey McCune" w:date="2026-04-08T16:01:00Z" w16du:dateUtc="2026-04-08T21:01:00Z">
+        <w:r>
+          <w:rPr>
+            <w:sz w:val="22"/>
+            <w:szCs w:val="22"/>
+          </w:rPr>
+          <w:t xml:space="preserve">We will then </w:t>
+        </w:r>
+        <w:commentRangeStart w:id="174"/>
+        <w:r>
+          <w:rPr>
+            <w:sz w:val="22"/>
+            <w:szCs w:val="22"/>
+          </w:rPr>
+          <w:t xml:space="preserve">serotype and conduct whole genome sequencing </w:t>
+        </w:r>
+      </w:ins>
+      <w:commentRangeEnd w:id="174"/>
+      <w:ins w:id="175" w:author="Kelsey McCune" w:date="2026-04-08T16:02:00Z" w16du:dateUtc="2026-04-08T21:02:00Z">
+        <w:r>
+          <w:rPr>
+            <w:rStyle w:val="CommentReference"/>
+          </w:rPr>
+          <w:commentReference w:id="174"/>
+        </w:r>
+      </w:ins>
+      <w:ins w:id="176" w:author="Kelsey McCune" w:date="2026-04-08T16:01:00Z" w16du:dateUtc="2026-04-08T21:01:00Z">
+        <w:r>
+          <w:rPr>
+            <w:sz w:val="22"/>
+            <w:szCs w:val="22"/>
+          </w:rPr>
+          <w:t>on c</w:t>
+        </w:r>
+      </w:ins>
+      <w:del w:id="177" w:author="Kelsey McCune" w:date="2026-04-08T16:01:00Z" w16du:dateUtc="2026-04-08T21:01:00Z">
+        <w:r>
+          <w:rPr>
+            <w:sz w:val="22"/>
+            <w:szCs w:val="22"/>
+          </w:rPr>
+          <w:delText>C</w:delText>
+        </w:r>
+      </w:del>
+      <w:r>
+        <w:rPr>
+          <w:sz w:val="22"/>
+          <w:szCs w:val="22"/>
+        </w:rPr>
+        <w:t>onfirmed isolates</w:t>
+      </w:r>
+      <w:ins w:id="178" w:author="Kelsey McCune" w:date="2026-04-08T16:01:00Z" w16du:dateUtc="2026-04-08T21:01:00Z">
+        <w:r>
+          <w:rPr>
+            <w:sz w:val="22"/>
+            <w:szCs w:val="22"/>
+          </w:rPr>
+          <w:t>.</w:t>
+        </w:r>
+      </w:ins>
+      <w:del w:id="179" w:author="Kelsey McCune" w:date="2026-04-08T16:01:00Z" w16du:dateUtc="2026-04-08T21:01:00Z">
+        <w:r>
+          <w:rPr>
+            <w:sz w:val="22"/>
+            <w:szCs w:val="22"/>
+          </w:rPr>
+          <w:delText xml:space="preserve"> </w:delText>
+        </w:r>
+      </w:del>
+      <w:del w:id="180" w:author="Kelsey McCune" w:date="2026-04-08T16:00:00Z" w16du:dateUtc="2026-04-08T21:00:00Z">
+        <w:r>
+          <w:rPr>
+            <w:sz w:val="22"/>
+            <w:szCs w:val="22"/>
+          </w:rPr>
+          <w:delText>are archived for potential</w:delText>
+        </w:r>
+      </w:del>
+      <w:del w:id="181" w:author="Kelsey McCune" w:date="2026-04-08T16:01:00Z" w16du:dateUtc="2026-04-08T21:01:00Z">
+        <w:r>
+          <w:rPr>
+            <w:sz w:val="22"/>
+            <w:szCs w:val="22"/>
+          </w:rPr>
+          <w:delText xml:space="preserve"> serotyping or whole-genome sequencing.</w:delText>
+        </w:r>
+      </w:del>
+    </w:p>
+    <w:p>
+      <w:pPr>
+        <w:rPr>
+          <w:del w:id="182" w:author="Kelsey McCune" w:date="2026-04-08T15:36:00Z" w16du:dateUtc="2026-04-08T20:36:00Z"/>
           <w:b/>
           <w:bCs/>
           <w:sz w:val="22"/>
           <w:szCs w:val="22"/>
         </w:rPr>
       </w:pPr>
-      <w:r>
+      <w:del w:id="183" w:author="Kelsey McCune" w:date="2026-04-08T15:36:00Z" w16du:dateUtc="2026-04-08T20:36:00Z">
+        <w:r>
+          <w:rPr>
+            <w:b/>
+            <w:bCs/>
+            <w:sz w:val="22"/>
+            <w:szCs w:val="22"/>
+          </w:rPr>
+          <w:delText>Human Participant Surveys</w:delText>
+        </w:r>
+      </w:del>
+    </w:p>
+    <w:p>
+      <w:pPr>
+        <w:rPr>
+          <w:del w:id="184" w:author="Kelsey McCune" w:date="2026-04-08T15:36:00Z" w16du:dateUtc="2026-04-08T20:36:00Z"/>
+          <w:sz w:val="22"/>
+          <w:szCs w:val="22"/>
+        </w:rPr>
+      </w:pPr>
+      <w:del w:id="185" w:author="Kelsey McCune" w:date="2026-04-08T15:36:00Z" w16du:dateUtc="2026-04-08T20:36:00Z">
+        <w:r>
+          <w:rPr>
+            <w:sz w:val="22"/>
+            <w:szCs w:val="22"/>
+          </w:rPr>
+          <w:delText xml:space="preserve">During the latter half of the study timeline (2026–2027), voluntary surveys will be administered to participants at bird feeding and/or poultry-keeping sites. Developed from peer-reviewed instruments, the survey assesses disease knowledge and risk perception (Leiserowitz 2006), feeder and coop maintenance practices, pro-conservation attitudes (Barbett et al. 2020), place attachment (Boley et al. 2021), and willingness to adopt biosecurity recommendations. Survey data will be linked to site-level characteristics to evaluate effectiveness and predictability of disease risk perception and knowledge on management decisions, conservation-related behaviors, and site pathogen prevalence. </w:delText>
+        </w:r>
+      </w:del>
+    </w:p>
+    <w:p>
+      <w:pPr>
         <w:rPr>
           <w:b/>
           <w:bCs/>
           <w:sz w:val="22"/>
           <w:szCs w:val="22"/>
         </w:rPr>
-        <w:t>Human Participant Surveys</w:t>
-      </w:r>
-    </w:p>
-    <w:p>
-      <w:pPr>
-        <w:rPr>
-          <w:sz w:val="22"/>
-          <w:szCs w:val="22"/>
-        </w:rPr>
-      </w:pPr>
-      <w:r>
-        <w:rPr>
-          <w:sz w:val="22"/>
-          <w:szCs w:val="22"/>
-        </w:rPr>
-        <w:t xml:space="preserve">During the latter half of the study timeline (2026–2027), voluntary surveys will be administered to participants at bird feeding and/or poultry-keeping sites. Developed from peer-reviewed instruments, the survey assesses disease knowledge and risk perception (Leiserowitz 2006), feeder and coop maintenance practices, pro-conservation attitudes (Barbett et al. 2020), place attachment (Boley et al. 2021), and willingness to adopt biosecurity recommendations. Survey data will be linked to site-level characteristics to evaluate effectiveness and predictability of disease risk perception and knowledge on management decisions, conservation-related behaviors, and site pathogen prevalence. </w:t>
-      </w:r>
-    </w:p>
-    <w:p>
-      <w:pPr>
+      </w:pPr>
+      <w:r>
         <w:rPr>
           <w:b/>
           <w:bCs/>
           <w:sz w:val="22"/>
           <w:szCs w:val="22"/>
         </w:rPr>
-      </w:pPr>
-      <w:r>
-        <w:rPr>
-          <w:b/>
-          <w:bCs/>
-          <w:sz w:val="22"/>
-          <w:szCs w:val="22"/>
-        </w:rPr>
         <w:t>Data Analysis</w:t>
       </w:r>
     </w:p>
@@ -1584,12 +3424,216 @@
           <w:szCs w:val="22"/>
         </w:rPr>
       </w:pPr>
-      <w:r>
-        <w:rPr>
-          <w:sz w:val="22"/>
-          <w:szCs w:val="22"/>
-        </w:rPr>
-        <w:t>Generalized linear mixed models (GLMMs) with binomial error distributions will quantify infection status as a function of site treatment type, species, and feeder visitation frequency. Species will be included as a random effect, with site identity and individual bird identity to be considered as random effects as multi-season data accumulate. Survey responses will be analyzed using descriptive statistics and regression models to examine predictors of risk perception and pro-conservation behavior. All analyses will be conducted in R (R Core Team 2024).</w:t>
+      <w:ins w:id="186" w:author="Kelsey McCune" w:date="2026-04-08T15:41:00Z" w16du:dateUtc="2026-04-08T20:41:00Z">
+        <w:r>
+          <w:rPr>
+            <w:sz w:val="22"/>
+            <w:szCs w:val="22"/>
+          </w:rPr>
+          <w:t>I</w:t>
+        </w:r>
+      </w:ins>
+      <w:ins w:id="187" w:author="Kelsey McCune" w:date="2026-04-08T15:37:00Z" w16du:dateUtc="2026-04-08T20:37:00Z">
+        <w:r>
+          <w:rPr>
+            <w:sz w:val="22"/>
+            <w:szCs w:val="22"/>
+          </w:rPr>
+          <w:t xml:space="preserve"> will use g</w:t>
+        </w:r>
+      </w:ins>
+      <w:del w:id="188" w:author="Kelsey McCune" w:date="2026-04-08T15:37:00Z" w16du:dateUtc="2026-04-08T20:37:00Z">
+        <w:r>
+          <w:rPr>
+            <w:sz w:val="22"/>
+            <w:szCs w:val="22"/>
+          </w:rPr>
+          <w:delText>G</w:delText>
+        </w:r>
+      </w:del>
+      <w:r>
+        <w:rPr>
+          <w:sz w:val="22"/>
+          <w:szCs w:val="22"/>
+        </w:rPr>
+        <w:t xml:space="preserve">eneralized linear mixed models (GLMMs) with binomial error distributions </w:t>
+      </w:r>
+      <w:ins w:id="189" w:author="Kelsey McCune" w:date="2026-04-08T15:37:00Z" w16du:dateUtc="2026-04-08T20:37:00Z">
+        <w:r>
+          <w:rPr>
+            <w:sz w:val="22"/>
+            <w:szCs w:val="22"/>
+          </w:rPr>
+          <w:t>to</w:t>
+        </w:r>
+      </w:ins>
+      <w:del w:id="190" w:author="Kelsey McCune" w:date="2026-04-08T15:37:00Z" w16du:dateUtc="2026-04-08T20:37:00Z">
+        <w:r>
+          <w:rPr>
+            <w:sz w:val="22"/>
+            <w:szCs w:val="22"/>
+          </w:rPr>
+          <w:delText>will</w:delText>
+        </w:r>
+      </w:del>
+      <w:r>
+        <w:rPr>
+          <w:sz w:val="22"/>
+          <w:szCs w:val="22"/>
+        </w:rPr>
+        <w:t xml:space="preserve"> quantify</w:t>
+      </w:r>
+      <w:ins w:id="191" w:author="Kelsey McCune" w:date="2026-04-08T15:37:00Z" w16du:dateUtc="2026-04-08T20:37:00Z">
+        <w:r>
+          <w:rPr>
+            <w:sz w:val="22"/>
+            <w:szCs w:val="22"/>
+          </w:rPr>
+          <w:t xml:space="preserve"> the probability </w:t>
+        </w:r>
+      </w:ins>
+      <w:ins w:id="192" w:author="Kelsey McCune" w:date="2026-04-08T15:38:00Z" w16du:dateUtc="2026-04-08T20:38:00Z">
+        <w:r>
+          <w:rPr>
+            <w:sz w:val="22"/>
+            <w:szCs w:val="22"/>
+          </w:rPr>
+          <w:t>that a bird is</w:t>
+        </w:r>
+      </w:ins>
+      <w:r>
+        <w:rPr>
+          <w:sz w:val="22"/>
+          <w:szCs w:val="22"/>
+        </w:rPr>
+        <w:t xml:space="preserve"> infect</w:t>
+      </w:r>
+      <w:ins w:id="193" w:author="Kelsey McCune" w:date="2026-04-08T15:38:00Z" w16du:dateUtc="2026-04-08T20:38:00Z">
+        <w:r>
+          <w:rPr>
+            <w:sz w:val="22"/>
+            <w:szCs w:val="22"/>
+          </w:rPr>
+          <w:t>ed</w:t>
+        </w:r>
+      </w:ins>
+      <w:del w:id="194" w:author="Kelsey McCune" w:date="2026-04-08T15:38:00Z" w16du:dateUtc="2026-04-08T20:38:00Z">
+        <w:r>
+          <w:rPr>
+            <w:sz w:val="22"/>
+            <w:szCs w:val="22"/>
+          </w:rPr>
+          <w:delText>ion status</w:delText>
+        </w:r>
+      </w:del>
+      <w:r>
+        <w:rPr>
+          <w:sz w:val="22"/>
+          <w:szCs w:val="22"/>
+        </w:rPr>
+        <w:t xml:space="preserve"> as a function of site treatment type, species, and </w:t>
+      </w:r>
+      <w:del w:id="195" w:author="Kelsey McCune" w:date="2026-04-08T15:39:00Z" w16du:dateUtc="2026-04-08T20:39:00Z">
+        <w:r>
+          <w:rPr>
+            <w:sz w:val="22"/>
+            <w:szCs w:val="22"/>
+          </w:rPr>
+          <w:delText>feeder visitation frequency</w:delText>
+        </w:r>
+      </w:del>
+      <w:ins w:id="196" w:author="Kelsey McCune" w:date="2026-04-08T15:39:00Z" w16du:dateUtc="2026-04-08T20:39:00Z">
+        <w:r>
+          <w:rPr>
+            <w:sz w:val="22"/>
+            <w:szCs w:val="22"/>
+          </w:rPr>
+          <w:t>season</w:t>
+        </w:r>
+      </w:ins>
+      <w:r>
+        <w:rPr>
+          <w:sz w:val="22"/>
+          <w:szCs w:val="22"/>
+        </w:rPr>
+        <w:t xml:space="preserve">. </w:t>
+      </w:r>
+      <w:ins w:id="197" w:author="Kelsey McCune" w:date="2026-04-08T15:42:00Z" w16du:dateUtc="2026-04-08T20:42:00Z">
+        <w:r>
+          <w:rPr>
+            <w:sz w:val="22"/>
+            <w:szCs w:val="22"/>
+          </w:rPr>
+          <w:t xml:space="preserve">The model will also include </w:t>
+        </w:r>
+      </w:ins>
+      <w:del w:id="198" w:author="Kelsey McCune" w:date="2026-04-08T15:42:00Z" w16du:dateUtc="2026-04-08T20:42:00Z">
+        <w:r>
+          <w:rPr>
+            <w:sz w:val="22"/>
+            <w:szCs w:val="22"/>
+          </w:rPr>
+          <w:delText>Species will be included as a random effect, with site identity and individual bird identity to be considered as random effects as multi-season data accumulate</w:delText>
+        </w:r>
+      </w:del>
+      <w:ins w:id="199" w:author="Kelsey McCune" w:date="2026-04-08T15:42:00Z" w16du:dateUtc="2026-04-08T20:42:00Z">
+        <w:r>
+          <w:rPr>
+            <w:sz w:val="22"/>
+            <w:szCs w:val="22"/>
+          </w:rPr>
+          <w:t>a random effect for species to account for</w:t>
+        </w:r>
+      </w:ins>
+      <w:ins w:id="200" w:author="Kelsey McCune" w:date="2026-04-08T15:43:00Z" w16du:dateUtc="2026-04-08T20:43:00Z">
+        <w:r>
+          <w:rPr>
+            <w:sz w:val="22"/>
+            <w:szCs w:val="22"/>
+          </w:rPr>
+          <w:t xml:space="preserve"> correlation in the data due to</w:t>
+        </w:r>
+      </w:ins>
+      <w:ins w:id="201" w:author="Kelsey McCune" w:date="2026-04-08T15:42:00Z" w16du:dateUtc="2026-04-08T20:42:00Z">
+        <w:r>
+          <w:rPr>
+            <w:sz w:val="22"/>
+            <w:szCs w:val="22"/>
+          </w:rPr>
+          <w:t xml:space="preserve"> species-specific imm</w:t>
+        </w:r>
+      </w:ins>
+      <w:ins w:id="202" w:author="Kelsey McCune" w:date="2026-04-08T15:43:00Z" w16du:dateUtc="2026-04-08T20:43:00Z">
+        <w:r>
+          <w:rPr>
+            <w:sz w:val="22"/>
+            <w:szCs w:val="22"/>
+          </w:rPr>
+          <w:t>une capacity</w:t>
+        </w:r>
+      </w:ins>
+      <w:r>
+        <w:rPr>
+          <w:sz w:val="22"/>
+          <w:szCs w:val="22"/>
+        </w:rPr>
+        <w:t xml:space="preserve">. </w:t>
+      </w:r>
+      <w:del w:id="203" w:author="Kelsey McCune" w:date="2026-04-08T15:43:00Z" w16du:dateUtc="2026-04-08T20:43:00Z">
+        <w:r>
+          <w:rPr>
+            <w:sz w:val="22"/>
+            <w:szCs w:val="22"/>
+          </w:rPr>
+          <w:delText xml:space="preserve">Survey responses will be analyzed using descriptive statistics and regression models to examine predictors of risk perception and pro-conservation behavior. </w:delText>
+        </w:r>
+      </w:del>
+      <w:r>
+        <w:rPr>
+          <w:sz w:val="22"/>
+          <w:szCs w:val="22"/>
+        </w:rPr>
+        <w:t>All analyses will be conducted in R (R Core Team 2024).</w:t>
       </w:r>
     </w:p>
     <w:p>
@@ -1610,6 +3654,7 @@
     <w:p>
       <w:pPr>
         <w:rPr>
+          <w:ins w:id="204" w:author="Kelsey McCune" w:date="2026-04-08T16:02:00Z" w16du:dateUtc="2026-04-08T21:02:00Z"/>
           <w:sz w:val="22"/>
           <w:szCs w:val="22"/>
         </w:rPr>
@@ -1630,36 +3675,300 @@
           <w:szCs w:val="22"/>
         </w:rPr>
       </w:pPr>
-      <w:r>
-        <w:rPr>
-          <w:sz w:val="22"/>
-          <w:szCs w:val="22"/>
-        </w:rPr>
-        <w:t>By study completion in 2027, we expect a total dataset of approximately 350 wild bird captures across 15 sites, with associated fecal, blood, viral, morphometric and RFID visitation data collected monthly over three field seasons. Preliminary results from summer 2024 through early 2026 provide an early basis for interpreting predicted patterns and analytical findings.</w:t>
-      </w:r>
-    </w:p>
-    <w:p>
-      <w:pPr>
-        <w:rPr>
-          <w:sz w:val="22"/>
-          <w:szCs w:val="22"/>
-        </w:rPr>
-      </w:pPr>
-      <w:r>
-        <w:rPr>
-          <w:sz w:val="22"/>
-          <w:szCs w:val="22"/>
-        </w:rPr>
-        <w:t xml:space="preserve">Preliminary data show that control sites display significantly higher bacterial infection prevalence in wild birds relative to feeder and combined feeder-chicken sites (p = 0.017, p = 0.05). This pattern may imply a nutritional buffering effect, consistent with evidence that supplemental food can improve immune function in wild passerines (Owen et al. 2021). As sampling expands across additional seasons and sites, we expect greater statistical power to interpret whether this pattern </w:t>
-      </w:r>
-      <w:r>
-        <w:rPr>
-          <w:sz w:val="22"/>
-          <w:szCs w:val="22"/>
-        </w:rPr>
-        <w:lastRenderedPageBreak/>
-        <w:t>holds consistently or rather supports variation in community composition and host condition. With only two chicken-only and two combined sites currently active, chicken-keeping households remain lacking. Additional replication at these treatment types is a priority for the remaining study period and is expected to clarify the role of poultry as environmental pathogen reservoirs.</w:t>
-      </w:r>
+    </w:p>
+    <w:p>
+      <w:pPr>
+        <w:rPr>
+          <w:del w:id="205" w:author="Kelsey McCune" w:date="2026-04-08T16:06:00Z" w16du:dateUtc="2026-04-08T21:06:00Z"/>
+          <w:sz w:val="22"/>
+          <w:szCs w:val="22"/>
+        </w:rPr>
+      </w:pPr>
+      <w:moveFromRangeStart w:id="206" w:author="Kelsey McCune" w:date="2026-04-08T16:03:00Z" w:name="move226556635"/>
+      <w:moveFrom w:id="207" w:author="Kelsey McCune" w:date="2026-04-08T16:03:00Z" w16du:dateUtc="2026-04-08T21:03:00Z">
+        <w:r>
+          <w:rPr>
+            <w:sz w:val="22"/>
+            <w:szCs w:val="22"/>
+          </w:rPr>
+          <w:t xml:space="preserve">By study completion in 2027, we expect a total dataset of approximately 350 wild bird captures across 15 sites, with associated fecal, blood, viral, morphometric and RFID visitation data collected monthly over three field seasons. </w:t>
+        </w:r>
+      </w:moveFrom>
+      <w:moveFromRangeEnd w:id="206"/>
+      <w:r>
+        <w:rPr>
+          <w:sz w:val="22"/>
+          <w:szCs w:val="22"/>
+        </w:rPr>
+        <w:t>Preliminary results from summer 2024 through early 2026 provide an early basis for interpreting predicted patterns and analytical findings.</w:t>
+      </w:r>
+      <w:ins w:id="208" w:author="Kelsey McCune" w:date="2026-04-08T16:04:00Z" w16du:dateUtc="2026-04-08T21:04:00Z">
+        <w:r>
+          <w:rPr>
+            <w:sz w:val="22"/>
+            <w:szCs w:val="22"/>
+          </w:rPr>
+          <w:t xml:space="preserve"> I captured XX birds at XX sites of each </w:t>
+        </w:r>
+        <w:proofErr w:type="spellStart"/>
+        <w:r>
+          <w:rPr>
+            <w:sz w:val="22"/>
+            <w:szCs w:val="22"/>
+          </w:rPr>
+          <w:t>treatement</w:t>
+        </w:r>
+        <w:proofErr w:type="spellEnd"/>
+        <w:r>
+          <w:rPr>
+            <w:sz w:val="22"/>
+            <w:szCs w:val="22"/>
+          </w:rPr>
+          <w:t xml:space="preserve"> type. </w:t>
+        </w:r>
+      </w:ins>
+      <w:ins w:id="209" w:author="Kelsey McCune" w:date="2026-04-08T16:05:00Z" w16du:dateUtc="2026-04-08T21:05:00Z">
+        <w:r>
+          <w:rPr>
+            <w:sz w:val="22"/>
+            <w:szCs w:val="22"/>
+          </w:rPr>
+          <w:t>In addition, I collected XX environmental and chicken fecal samples, resulting in a total of XX samples.</w:t>
+        </w:r>
+      </w:ins>
+      <w:ins w:id="210" w:author="Kelsey McCune" w:date="2026-04-08T16:06:00Z" w16du:dateUtc="2026-04-08T21:06:00Z">
+        <w:r>
+          <w:rPr>
+            <w:sz w:val="22"/>
+            <w:szCs w:val="22"/>
+          </w:rPr>
+          <w:t xml:space="preserve"> </w:t>
+        </w:r>
+      </w:ins>
+      <w:proofErr w:type="spellStart"/>
+      <w:ins w:id="211" w:author="Kelsey McCune" w:date="2026-04-08T16:04:00Z" w16du:dateUtc="2026-04-08T21:04:00Z">
+        <w:r>
+          <w:rPr>
+            <w:sz w:val="22"/>
+            <w:szCs w:val="22"/>
+          </w:rPr>
+          <w:t>Preliminary</w:t>
+        </w:r>
+        <w:proofErr w:type="spellEnd"/>
+        <w:r>
+          <w:rPr>
+            <w:sz w:val="22"/>
+            <w:szCs w:val="22"/>
+          </w:rPr>
+          <w:t xml:space="preserve"> culturing resul</w:t>
+        </w:r>
+      </w:ins>
+      <w:ins w:id="212" w:author="Kelsey McCune" w:date="2026-04-08T16:05:00Z" w16du:dateUtc="2026-04-08T21:05:00Z">
+        <w:r>
+          <w:rPr>
+            <w:sz w:val="22"/>
+            <w:szCs w:val="22"/>
+          </w:rPr>
+          <w:t xml:space="preserve">ted in approximately 14% of samples developed </w:t>
+        </w:r>
+        <w:r>
+          <w:rPr>
+            <w:i/>
+            <w:iCs/>
+            <w:sz w:val="22"/>
+            <w:szCs w:val="22"/>
+          </w:rPr>
+          <w:t xml:space="preserve">Salmonella </w:t>
+        </w:r>
+        <w:r>
+          <w:rPr>
+            <w:sz w:val="22"/>
+            <w:szCs w:val="22"/>
+          </w:rPr>
+          <w:t>colonies.</w:t>
+        </w:r>
+      </w:ins>
+      <w:ins w:id="213" w:author="Kelsey McCune" w:date="2026-04-08T16:06:00Z" w16du:dateUtc="2026-04-08T21:06:00Z">
+        <w:r>
+          <w:rPr>
+            <w:sz w:val="22"/>
+            <w:szCs w:val="22"/>
+          </w:rPr>
+          <w:t xml:space="preserve"> </w:t>
+        </w:r>
+      </w:ins>
+    </w:p>
+    <w:p>
+      <w:pPr>
+        <w:rPr>
+          <w:ins w:id="214" w:author="Kelsey McCune" w:date="2026-04-08T16:08:00Z" w16du:dateUtc="2026-04-08T21:08:00Z"/>
+          <w:sz w:val="22"/>
+          <w:szCs w:val="22"/>
+        </w:rPr>
+      </w:pPr>
+      <w:r>
+        <w:rPr>
+          <w:sz w:val="22"/>
+          <w:szCs w:val="22"/>
+        </w:rPr>
+        <w:t xml:space="preserve">Preliminary </w:t>
+      </w:r>
+      <w:ins w:id="215" w:author="Kelsey McCune" w:date="2026-04-08T16:06:00Z" w16du:dateUtc="2026-04-08T21:06:00Z">
+        <w:r>
+          <w:rPr>
+            <w:sz w:val="22"/>
+            <w:szCs w:val="22"/>
+          </w:rPr>
+          <w:t>analyses</w:t>
+        </w:r>
+      </w:ins>
+      <w:del w:id="216" w:author="Kelsey McCune" w:date="2026-04-08T16:06:00Z" w16du:dateUtc="2026-04-08T21:06:00Z">
+        <w:r>
+          <w:rPr>
+            <w:sz w:val="22"/>
+            <w:szCs w:val="22"/>
+          </w:rPr>
+          <w:delText>data</w:delText>
+        </w:r>
+      </w:del>
+      <w:r>
+        <w:rPr>
+          <w:sz w:val="22"/>
+          <w:szCs w:val="22"/>
+        </w:rPr>
+        <w:t xml:space="preserve"> show that control sites display significantly higher bacterial infection prevalence in wild birds relative to </w:t>
+      </w:r>
+      <w:ins w:id="217" w:author="Kelsey McCune" w:date="2026-04-08T16:06:00Z" w16du:dateUtc="2026-04-08T21:06:00Z">
+        <w:r>
+          <w:rPr>
+            <w:sz w:val="22"/>
+            <w:szCs w:val="22"/>
+          </w:rPr>
+          <w:t xml:space="preserve">bird </w:t>
+        </w:r>
+      </w:ins>
+      <w:r>
+        <w:rPr>
+          <w:sz w:val="22"/>
+          <w:szCs w:val="22"/>
+        </w:rPr>
+        <w:t xml:space="preserve">feeder and combined feeder-chicken sites (p = 0.017, p = 0.05). This pattern may imply a nutritional buffering effect, consistent with evidence that supplemental food can improve immune function in wild passerines (Owen et al. 2021). </w:t>
+      </w:r>
+      <w:ins w:id="218" w:author="Kelsey McCune" w:date="2026-04-08T16:07:00Z" w16du:dateUtc="2026-04-08T21:07:00Z">
+        <w:r>
+          <w:rPr>
+            <w:sz w:val="22"/>
+            <w:szCs w:val="22"/>
+          </w:rPr>
+          <w:t xml:space="preserve">However, I am limited in the conclusions I can make from </w:t>
+        </w:r>
+      </w:ins>
+      <w:ins w:id="219" w:author="Kelsey McCune" w:date="2026-04-08T16:08:00Z" w16du:dateUtc="2026-04-08T21:08:00Z">
+        <w:r>
+          <w:rPr>
+            <w:sz w:val="22"/>
+            <w:szCs w:val="22"/>
+          </w:rPr>
+          <w:t xml:space="preserve">these </w:t>
+        </w:r>
+      </w:ins>
+      <w:ins w:id="220" w:author="Kelsey McCune" w:date="2026-04-08T16:07:00Z" w16du:dateUtc="2026-04-08T21:07:00Z">
+        <w:r>
+          <w:rPr>
+            <w:sz w:val="22"/>
+            <w:szCs w:val="22"/>
+          </w:rPr>
+          <w:t xml:space="preserve">preliminary culturing </w:t>
+        </w:r>
+      </w:ins>
+      <w:ins w:id="221" w:author="Kelsey McCune" w:date="2026-04-08T16:08:00Z" w16du:dateUtc="2026-04-08T21:08:00Z">
+        <w:r>
+          <w:rPr>
+            <w:sz w:val="22"/>
+            <w:szCs w:val="22"/>
+          </w:rPr>
+          <w:t xml:space="preserve">methods </w:t>
+        </w:r>
+      </w:ins>
+      <w:ins w:id="222" w:author="Kelsey McCune" w:date="2026-04-08T16:07:00Z" w16du:dateUtc="2026-04-08T21:07:00Z">
+        <w:r>
+          <w:rPr>
+            <w:sz w:val="22"/>
+            <w:szCs w:val="22"/>
+          </w:rPr>
+          <w:t xml:space="preserve">because </w:t>
+        </w:r>
+      </w:ins>
+      <w:ins w:id="223" w:author="Kelsey McCune" w:date="2026-04-08T16:08:00Z" w16du:dateUtc="2026-04-08T21:08:00Z">
+        <w:r>
+          <w:rPr>
+            <w:sz w:val="22"/>
+            <w:szCs w:val="22"/>
+          </w:rPr>
+          <w:t>I lack the funds to conduct additional lab processing to determine …</w:t>
+        </w:r>
+      </w:ins>
+    </w:p>
+    <w:p>
+      <w:pPr>
+        <w:rPr>
+          <w:sz w:val="22"/>
+          <w:szCs w:val="22"/>
+        </w:rPr>
+      </w:pPr>
+      <w:del w:id="224" w:author="Kelsey McCune" w:date="2026-04-08T16:08:00Z" w16du:dateUtc="2026-04-08T21:08:00Z">
+        <w:r>
+          <w:rPr>
+            <w:sz w:val="22"/>
+            <w:szCs w:val="22"/>
+          </w:rPr>
+          <w:delText xml:space="preserve">As sampling expands across additional seasons and sites, we expect greater statistical power to interpret whether this pattern holds consistently or rather supports variation in community composition and host condition. </w:delText>
+        </w:r>
+      </w:del>
+      <w:del w:id="225" w:author="Kelsey McCune" w:date="2026-04-08T16:09:00Z" w16du:dateUtc="2026-04-08T21:09:00Z">
+        <w:r>
+          <w:rPr>
+            <w:sz w:val="22"/>
+            <w:szCs w:val="22"/>
+          </w:rPr>
+          <w:delText>With only two chicken-only and two combined sites currently active, chicken-keeping households remain lacking. Additional replication at these treatment types is a priority for the remaining study period and is expected to clarify the role of poultry as environmental pathogen reservoirs.</w:delText>
+        </w:r>
+      </w:del>
+      <w:moveToRangeStart w:id="226" w:author="Kelsey McCune" w:date="2026-04-08T16:03:00Z" w:name="move226556635"/>
+      <w:moveTo w:id="227" w:author="Kelsey McCune" w:date="2026-04-08T16:03:00Z" w16du:dateUtc="2026-04-08T21:03:00Z">
+        <w:r>
+          <w:rPr>
+            <w:sz w:val="22"/>
+            <w:szCs w:val="22"/>
+          </w:rPr>
+          <w:t xml:space="preserve">By study completion in 2027, we expect a total dataset of approximately 350 wild bird captures </w:t>
+        </w:r>
+        <w:commentRangeStart w:id="228"/>
+        <w:r>
+          <w:rPr>
+            <w:sz w:val="22"/>
+            <w:szCs w:val="22"/>
+          </w:rPr>
+          <w:t xml:space="preserve">across 15 sites, </w:t>
+        </w:r>
+      </w:moveTo>
+      <w:commentRangeEnd w:id="228"/>
+      <w:r>
+        <w:rPr>
+          <w:rStyle w:val="CommentReference"/>
+        </w:rPr>
+        <w:commentReference w:id="228"/>
+      </w:r>
+      <w:moveTo w:id="229" w:author="Kelsey McCune" w:date="2026-04-08T16:03:00Z" w16du:dateUtc="2026-04-08T21:03:00Z">
+        <w:r>
+          <w:rPr>
+            <w:sz w:val="22"/>
+            <w:szCs w:val="22"/>
+          </w:rPr>
+          <w:t>with associated fecal, blood, viral, morphometric and RFID visitation data collected monthly over three field seasons.</w:t>
+        </w:r>
+      </w:moveTo>
+      <w:moveToRangeEnd w:id="226"/>
     </w:p>
     <w:p>
       <w:pPr>
@@ -1740,17 +4049,210 @@
     <w:p>
       <w:pPr>
         <w:rPr>
-          <w:sz w:val="22"/>
-          <w:szCs w:val="22"/>
-        </w:rPr>
-      </w:pPr>
-      <w:r>
-        <w:rPr>
-          <w:sz w:val="22"/>
-          <w:szCs w:val="22"/>
-        </w:rPr>
-        <w:t>Summary of the Impacts of this Study:</w:t>
-      </w:r>
+          <w:ins w:id="230" w:author="Kelsey McCune" w:date="2026-04-08T11:39:00Z" w16du:dateUtc="2026-04-08T16:39:00Z"/>
+          <w:sz w:val="22"/>
+          <w:szCs w:val="22"/>
+        </w:rPr>
+      </w:pPr>
+      <w:commentRangeStart w:id="231"/>
+      <w:r>
+        <w:rPr>
+          <w:sz w:val="22"/>
+          <w:szCs w:val="22"/>
+        </w:rPr>
+        <w:t>Summary of the Impacts of this Study</w:t>
+      </w:r>
+      <w:commentRangeEnd w:id="231"/>
+      <w:r>
+        <w:rPr>
+          <w:rStyle w:val="CommentReference"/>
+        </w:rPr>
+        <w:commentReference w:id="231"/>
+      </w:r>
+      <w:r>
+        <w:rPr>
+          <w:sz w:val="22"/>
+          <w:szCs w:val="22"/>
+        </w:rPr>
+        <w:t>:</w:t>
+      </w:r>
+    </w:p>
+    <w:p>
+      <w:pPr>
+        <w:ind w:firstLine="720"/>
+        <w:rPr>
+          <w:moveTo w:id="232" w:author="Kelsey McCune" w:date="2026-04-08T11:39:00Z" w16du:dateUtc="2026-04-08T16:39:00Z"/>
+          <w:sz w:val="22"/>
+          <w:szCs w:val="22"/>
+        </w:rPr>
+      </w:pPr>
+      <w:moveToRangeStart w:id="233" w:author="Kelsey McCune" w:date="2026-04-08T11:39:00Z" w:name="move226540801"/>
+      <w:moveTo w:id="234" w:author="Kelsey McCune" w:date="2026-04-08T11:39:00Z" w16du:dateUtc="2026-04-08T16:39:00Z">
+        <w:r>
+          <w:rPr>
+            <w:sz w:val="22"/>
+            <w:szCs w:val="22"/>
+          </w:rPr>
+          <w:t>The risk of disease spillover through bird feeding and backyard poultry keeping is potentially balanced by the benefits for the people who participate. Current research has shown that interacting with birds and nature can strengthen mental health through effects like reduced stress and anxiety, improved mood, cognitive restoration, and feelings of connection to the natural world (Cox and Gaston 2016; Pocock et al. 2023)</w:t>
+        </w:r>
+        <w:r>
+          <w:rPr>
+            <w:sz w:val="22"/>
+            <w:szCs w:val="22"/>
+          </w:rPr>
+          <w:t>.</w:t>
+        </w:r>
+        <w:r>
+          <w:rPr>
+            <w:sz w:val="22"/>
+            <w:szCs w:val="22"/>
+          </w:rPr>
+          <w:t xml:space="preserve"> For many people, maintaining a bird feeder provides the only daily form of accessible, low-cost interaction with wildlife. Studies have found that even brief exposure to birds in residential settings contributes positively to personal wellbeing, consistent with broader studies linking nature contact to psychological relief and stress recovery (Dayer et al. 2019)</w:t>
+        </w:r>
+        <w:r>
+          <w:rPr>
+            <w:sz w:val="22"/>
+            <w:szCs w:val="22"/>
+          </w:rPr>
+          <w:t>.</w:t>
+        </w:r>
+        <w:r>
+          <w:rPr>
+            <w:sz w:val="22"/>
+            <w:szCs w:val="22"/>
+          </w:rPr>
+          <w:t xml:space="preserve"> Small-scale poultry keeping is similarly associated with feelings of self-sufficiency, fulfillment, and stewardship, particularly among urban and suburban residents seeking engagement with food systems and animal care (Kyle and Sutherland 2016; Nicholson et al. 2020)</w:t>
+        </w:r>
+        <w:r>
+          <w:rPr>
+            <w:sz w:val="22"/>
+            <w:szCs w:val="22"/>
+          </w:rPr>
+          <w:t>.</w:t>
+        </w:r>
+        <w:r>
+          <w:rPr>
+            <w:sz w:val="22"/>
+            <w:szCs w:val="22"/>
+          </w:rPr>
+          <w:t xml:space="preserve"> Households with children may additionally benefit from the educational value of these activities by incorporating an early interest in wildlife, ecology, and sustainable food production. Engagement with backyard wildlife activities may also go beyond personal satisfaction to encourage broader conservation behaviors. Research has shown that people who feed and observe birds are more likely to engage in pro-conservation actions such as habitat stewardship, conservation donations, and advocacy for wildlife-friendly policies, suggesting that these activities may provide a link to broader environmental stewardship (Dayer et al. 2019; Pocock et al. 2023; Barbett et al. 2020). Understanding the conservation attitudes of participants in these backyard activities will be valuable for finding opportunities to promote evidence-based biosecurity guidelines to the public. The psychological and conservation benefits of backyard wildlife activities are important factors that must be weighed parallel to any relevant risks to health, wildlife, and environment when discussing activities such as bird feeding and small-scale poultry. </w:t>
+        </w:r>
+      </w:moveTo>
+    </w:p>
+    <w:moveToRangeEnd w:id="233"/>
+    <w:p>
+      <w:pPr>
+        <w:rPr>
+          <w:ins w:id="235" w:author="Kelsey McCune" w:date="2026-04-08T11:44:00Z" w16du:dateUtc="2026-04-08T16:44:00Z"/>
+          <w:sz w:val="22"/>
+          <w:szCs w:val="22"/>
+        </w:rPr>
+      </w:pPr>
+    </w:p>
+    <w:p>
+      <w:pPr>
+        <w:rPr>
+          <w:sz w:val="22"/>
+          <w:szCs w:val="22"/>
+        </w:rPr>
+      </w:pPr>
+      <w:moveToRangeStart w:id="236" w:author="Kelsey McCune" w:date="2026-04-08T11:44:00Z" w:name="move226541072"/>
+      <w:moveTo w:id="237" w:author="Kelsey McCune" w:date="2026-04-08T11:44:00Z" w16du:dateUtc="2026-04-08T16:44:00Z">
+        <w:r>
+          <w:rPr>
+            <w:sz w:val="22"/>
+            <w:szCs w:val="22"/>
+          </w:rPr>
+          <w:lastRenderedPageBreak/>
+          <w:t>The degree to which participants in these activities perceive disease risks, engage in biosecurity practices such as feeder cleaning and personal hygiene, and are willing to modify their behaviors in response to evidence-based recommendations remains poorly characterized, particularly in the southeastern United States where both activities are prevalent.</w:t>
+        </w:r>
+      </w:moveTo>
+      <w:moveToRangeEnd w:id="236"/>
+    </w:p>
+    <w:p>
+      <w:pPr>
+        <w:rPr>
+          <w:ins w:id="238" w:author="Kelsey McCune" w:date="2026-04-08T15:30:00Z" w16du:dateUtc="2026-04-08T20:30:00Z"/>
+          <w:sz w:val="22"/>
+          <w:szCs w:val="22"/>
+        </w:rPr>
+      </w:pPr>
+    </w:p>
+    <w:p>
+      <w:pPr>
+        <w:rPr>
+          <w:ins w:id="239" w:author="Kelsey McCune" w:date="2026-04-08T15:30:00Z" w16du:dateUtc="2026-04-08T20:30:00Z"/>
+          <w:sz w:val="22"/>
+          <w:szCs w:val="22"/>
+        </w:rPr>
+      </w:pPr>
+      <w:ins w:id="240" w:author="Kelsey McCune" w:date="2026-04-08T15:30:00Z" w16du:dateUtc="2026-04-08T20:30:00Z">
+        <w:r>
+          <w:rPr>
+            <w:sz w:val="22"/>
+            <w:szCs w:val="22"/>
+          </w:rPr>
+          <w:t>This gap remains relevant in the southeastern United States, where suburban sprawl continues to expand the human-wildlife interface, seasonal variation in temperature and humidity creates year-round conditions for environmental pathogen persistence, and large agricultural presence encourages small-scale animal keeping</w:t>
+        </w:r>
+        <w:r>
+          <w:rPr>
+            <w:sz w:val="22"/>
+            <w:szCs w:val="22"/>
+          </w:rPr>
+          <w:t>.</w:t>
+        </w:r>
+        <w:r>
+          <w:rPr>
+            <w:sz w:val="22"/>
+            <w:szCs w:val="22"/>
+          </w:rPr>
+          <w:t xml:space="preserve"> </w:t>
+        </w:r>
+        <w:r>
+          <w:rPr>
+            <w:sz w:val="22"/>
+            <w:szCs w:val="22"/>
+          </w:rPr>
+          <w:t xml:space="preserve">Moreover, </w:t>
+        </w:r>
+        <w:r>
+          <w:rPr>
+            <w:sz w:val="22"/>
+            <w:szCs w:val="22"/>
+          </w:rPr>
+          <w:t>wildlife watching participation, including bird feeding,</w:t>
+        </w:r>
+        <w:r>
+          <w:rPr>
+            <w:sz w:val="22"/>
+            <w:szCs w:val="22"/>
+          </w:rPr>
+          <w:t xml:space="preserve"> in Alabama</w:t>
+        </w:r>
+        <w:r>
+          <w:rPr>
+            <w:sz w:val="22"/>
+            <w:szCs w:val="22"/>
+          </w:rPr>
+          <w:t xml:space="preserve"> is among the highest of any region in the country, with the East </w:t>
+        </w:r>
+        <w:proofErr w:type="gramStart"/>
+        <w:r>
+          <w:rPr>
+            <w:sz w:val="22"/>
+            <w:szCs w:val="22"/>
+          </w:rPr>
+          <w:t>South Central</w:t>
+        </w:r>
+        <w:proofErr w:type="gramEnd"/>
+        <w:r>
+          <w:rPr>
+            <w:sz w:val="22"/>
+            <w:szCs w:val="22"/>
+          </w:rPr>
+          <w:t xml:space="preserve"> states reporting the highest residential wildlife watching rates nationally (USFWS 2022).</w:t>
+        </w:r>
+      </w:ins>
     </w:p>
     <w:p>
       <w:pPr>
@@ -2387,7 +4889,23 @@
           <w:sz w:val="22"/>
           <w:szCs w:val="22"/>
         </w:rPr>
-        <w:t>$360 per month of SVDL Lab processing + $15 per seryotyped Salm. Sample</w:t>
+        <w:t xml:space="preserve">$360 per month of SVDL Lab processing + $15 per </w:t>
+      </w:r>
+      <w:proofErr w:type="spellStart"/>
+      <w:r>
+        <w:rPr>
+          <w:sz w:val="22"/>
+          <w:szCs w:val="22"/>
+        </w:rPr>
+        <w:t>seryotyped</w:t>
+      </w:r>
+      <w:proofErr w:type="spellEnd"/>
+      <w:r>
+        <w:rPr>
+          <w:sz w:val="22"/>
+          <w:szCs w:val="22"/>
+        </w:rPr>
+        <w:t xml:space="preserve"> Salm. Sample</w:t>
       </w:r>
     </w:p>
     <w:p>
@@ -2504,7 +5022,25 @@
           <w:szCs w:val="22"/>
           <w:highlight w:val="yellow"/>
         </w:rPr>
-        <w:t>Info. about how the rest of my project is already supported by collaborators or pre-existing funding: field supplies, intital lab processing, etc.</w:t>
+        <w:t xml:space="preserve">Info. about how the rest of my project is already supported by collaborators or pre-existing funding: field supplies, </w:t>
+      </w:r>
+      <w:proofErr w:type="spellStart"/>
+      <w:r>
+        <w:rPr>
+          <w:sz w:val="22"/>
+          <w:szCs w:val="22"/>
+          <w:highlight w:val="yellow"/>
+        </w:rPr>
+        <w:t>intital</w:t>
+      </w:r>
+      <w:proofErr w:type="spellEnd"/>
+      <w:r>
+        <w:rPr>
+          <w:sz w:val="22"/>
+          <w:szCs w:val="22"/>
+          <w:highlight w:val="yellow"/>
+        </w:rPr>
+        <w:t xml:space="preserve"> lab processing, etc.</w:t>
       </w:r>
       <w:r>
         <w:rPr>
@@ -2557,24 +5093,10 @@
           <w:sz w:val="22"/>
           <w:szCs w:val="22"/>
         </w:rPr>
-        <w:t>Projects that are large often have multiple sources of funding. If anything, in the last few years, having other sources of funding for parts of a project has worked to the advantage of researches, as the committee often decides to partner on projects that already have one source of funding.</w:t>
-      </w:r>
-    </w:p>
-    <w:p>
-      <w:pPr>
-        <w:widowControl w:val="0"/>
-        <w:jc w:val="both"/>
-        <w:rPr>
-          <w:color w:val="FF0000"/>
-          <w:sz w:val="22"/>
-          <w:szCs w:val="22"/>
-        </w:rPr>
-      </w:pPr>
-    </w:p>
-    <w:p>
-      <w:pPr>
-        <w:widowControl w:val="0"/>
-        <w:jc w:val="both"/>
+        <w:t xml:space="preserve">Projects that are large often have multiple sources of funding. If anything, in the last few years, having other sources of funding for parts of a project has worked to the advantage of </w:t>
+      </w:r>
+      <w:proofErr w:type="gramStart"/>
+      <w:r>
         <w:rPr>
           <w:i/>
           <w:iCs/>
@@ -2582,7 +5104,9 @@
           <w:sz w:val="22"/>
           <w:szCs w:val="22"/>
         </w:rPr>
-      </w:pPr>
+        <w:t>researches</w:t>
+      </w:r>
+      <w:proofErr w:type="gramEnd"/>
       <w:r>
         <w:rPr>
           <w:i/>
@@ -2591,9 +5115,24 @@
           <w:sz w:val="22"/>
           <w:szCs w:val="22"/>
         </w:rPr>
-        <w:t>If this proposal is comin</w:t>
-      </w:r>
-      <w:r>
+        <w:t>, as the committee often decides to partner on projects that already have one source of funding.</w:t>
+      </w:r>
+    </w:p>
+    <w:p>
+      <w:pPr>
+        <w:widowControl w:val="0"/>
+        <w:jc w:val="both"/>
+        <w:rPr>
+          <w:color w:val="FF0000"/>
+          <w:sz w:val="22"/>
+          <w:szCs w:val="22"/>
+        </w:rPr>
+      </w:pPr>
+    </w:p>
+    <w:p>
+      <w:pPr>
+        <w:widowControl w:val="0"/>
+        <w:jc w:val="both"/>
         <w:rPr>
           <w:i/>
           <w:iCs/>
@@ -2601,8 +5140,7 @@
           <w:sz w:val="22"/>
           <w:szCs w:val="22"/>
         </w:rPr>
-        <w:t>g from outside the United States</w:t>
-      </w:r>
+      </w:pPr>
       <w:r>
         <w:rPr>
           <w:i/>
@@ -2611,7 +5149,7 @@
           <w:sz w:val="22"/>
           <w:szCs w:val="22"/>
         </w:rPr>
-        <w:t xml:space="preserve">, then provide information on the legal obligations in your country </w:t>
+        <w:t>If this proposal is comin</w:t>
       </w:r>
       <w:r>
         <w:rPr>
@@ -2621,8 +5159,17 @@
           <w:sz w:val="22"/>
           <w:szCs w:val="22"/>
         </w:rPr>
-        <w:lastRenderedPageBreak/>
-        <w:t xml:space="preserve">for doing animal research. We would need to see copies of your approval forms from your in-country animal welfare agency before awarding any grant. </w:t>
+        <w:t>g from outside the United States</w:t>
+      </w:r>
+      <w:r>
+        <w:rPr>
+          <w:i/>
+          <w:iCs/>
+          <w:color w:val="FF0000"/>
+          <w:sz w:val="22"/>
+          <w:szCs w:val="22"/>
+        </w:rPr>
+        <w:t xml:space="preserve">, then provide information on the legal obligations in your country for doing animal research. We would need to see copies of your approval forms from your in-country animal welfare agency before awarding any grant. </w:t>
       </w:r>
     </w:p>
     <w:p>
@@ -3112,7 +5659,23 @@
           <w:sz w:val="22"/>
           <w:szCs w:val="22"/>
         </w:rPr>
-        <w:t xml:space="preserve">This study involves breeding birds.  List number of breeding adults used and estimated number of chicks produced each year, and describe how the birds are expected to be allocated to the subsequent experiment(s). </w:t>
+        <w:t xml:space="preserve">This study involves breeding birds.  List number of breeding adults used and estimated number of chicks produced each </w:t>
+      </w:r>
+      <w:proofErr w:type="gramStart"/>
+      <w:r>
+        <w:rPr>
+          <w:sz w:val="22"/>
+          <w:szCs w:val="22"/>
+        </w:rPr>
+        <w:t>year, and</w:t>
+      </w:r>
+      <w:proofErr w:type="gramEnd"/>
+      <w:r>
+        <w:rPr>
+          <w:sz w:val="22"/>
+          <w:szCs w:val="22"/>
+        </w:rPr>
+        <w:t xml:space="preserve"> describe how the birds are expected to be allocated to the subsequent experiment(s). </w:t>
       </w:r>
     </w:p>
     <w:p>
@@ -3154,7 +5717,23 @@
           <w:sz w:val="22"/>
           <w:szCs w:val="22"/>
         </w:rPr>
-        <w:t>This is an observational, non-manipulative study in which birds will not be captured or their behavior will not be interfered with and animal numbers cannot be predicted.</w:t>
+        <w:t xml:space="preserve">This is an observational, non-manipulative study in which birds will not be </w:t>
+      </w:r>
+      <w:proofErr w:type="gramStart"/>
+      <w:r>
+        <w:rPr>
+          <w:sz w:val="22"/>
+          <w:szCs w:val="22"/>
+        </w:rPr>
+        <w:t>captured</w:t>
+      </w:r>
+      <w:proofErr w:type="gramEnd"/>
+      <w:r>
+        <w:rPr>
+          <w:sz w:val="22"/>
+          <w:szCs w:val="22"/>
+        </w:rPr>
+        <w:t xml:space="preserve"> or their behavior will not be interfered with and animal numbers cannot be predicted.</w:t>
       </w:r>
     </w:p>
     <w:p>
@@ -3280,7 +5859,15 @@
           <w:sz w:val="22"/>
           <w:szCs w:val="22"/>
         </w:rPr>
-        <w:t>In order to encourage AAV Avian Research awardees to present their work in a forum that will benefit avian practitioners, the AAV requests that investigators submitting a full research proposal agree to the following should their proposal be selected for funding:</w:t>
+        <w:t xml:space="preserve">In order to encourage AAV Avian Research awardees to present their work in a forum that will benefit avian practitioners, </w:t>
+      </w:r>
+      <w:r>
+        <w:rPr>
+          <w:sz w:val="22"/>
+          <w:szCs w:val="22"/>
+        </w:rPr>
+        <w:lastRenderedPageBreak/>
+        <w:t>the AAV requests that investigators submitting a full research proposal agree to the following should their proposal be selected for funding:</w:t>
       </w:r>
     </w:p>
     <w:p>
@@ -3646,7 +6233,7 @@
 
 <file path=word/comments.xml><?xml version="1.0" encoding="utf-8"?>
 <w:comments xmlns:wpc="http://schemas.microsoft.com/office/word/2010/wordprocessingCanvas" xmlns:cx="http://schemas.microsoft.com/office/drawing/2014/chartex" xmlns:cx1="http://schemas.microsoft.com/office/drawing/2015/9/8/chartex" xmlns:cx2="http://schemas.microsoft.com/office/drawing/2015/10/21/chartex" xmlns:cx3="http://schemas.microsoft.com/office/drawing/2016/5/9/chartex" xmlns:cx4="http://schemas.microsoft.com/office/drawing/2016/5/10/chartex" xmlns:cx5="http://schemas.microsoft.com/office/drawing/2016/5/11/chartex" xmlns:cx6="http://schemas.microsoft.com/office/drawing/2016/5/12/chartex" xmlns:cx7="http://schemas.microsoft.com/office/drawing/2016/5/13/chartex" xmlns:cx8="http://schemas.microsoft.com/office/drawing/2016/5/14/chartex" xmlns:mc="http://schemas.openxmlformats.org/markup-compatibility/2006" xmlns:aink="http://schemas.microsoft.com/office/drawing/2016/ink" xmlns:am3d="http://schemas.microsoft.com/office/drawing/2017/model3d" xmlns:o="urn:schemas-microsoft-com:office:office" xmlns:oel="http://schemas.microsoft.com/office/2019/extlst" xmlns:r="http://schemas.openxmlformats.org/officeDocument/2006/relationships" xmlns:m="http://schemas.openxmlformats.org/officeDocument/2006/math" xmlns:v="urn:schemas-microsoft-com:vml" xmlns:wp14="http://schemas.microsoft.com/office/word/2010/wordprocessingDrawing" xmlns:wp="http://schemas.openxmlformats.org/drawingml/2006/wordprocessingDrawing" xmlns:w10="urn:schemas-microsoft-com:office:word" xmlns:w="http://schemas.openxmlformats.org/wordprocessingml/2006/main" xmlns:w14="http://schemas.microsoft.com/office/word/2010/wordml" xmlns:w15="http://schemas.microsoft.com/office/word/2012/wordml" xmlns:w16cex="http://schemas.microsoft.com/office/word/2018/wordml/cex" xmlns:w16cid="http://schemas.microsoft.com/office/word/2016/wordml/cid" xmlns:w16="http://schemas.microsoft.com/office/word/2018/wordml" xmlns:w16du="http://schemas.microsoft.com/office/word/2023/wordml/word16du" xmlns:w16sdtdh="http://schemas.microsoft.com/office/word/2020/wordml/sdtdatahash" xmlns:w16sdtfl="http://schemas.microsoft.com/office/word/2024/wordml/sdtformatlock" xmlns:w16se="http://schemas.microsoft.com/office/word/2015/wordml/symex" xmlns:wpg="http://schemas.microsoft.com/office/word/2010/wordprocessingGroup" xmlns:wpi="http://schemas.microsoft.com/office/word/2010/wordprocessingInk" xmlns:wne="http://schemas.microsoft.com/office/word/2006/wordml" xmlns:wps="http://schemas.microsoft.com/office/word/2010/wordprocessingShape" mc:Ignorable="w14 w15 w16se w16cid w16 w16cex w16sdtdh w16sdtfl w16du wp14">
-  <w:comment w:id="0" w:author="Alex Fisher" w:date="2026-03-31T12:18:00Z" w:initials="AF">
+  <w:comment w:id="0" w:author="Kelsey McCune" w:date="2026-04-08T10:36:00Z" w:initials="KBM">
     <w:p>
       <w:r>
         <w:rPr>
@@ -3659,11 +6246,11 @@
           <w:sz w:val="20"/>
           <w:szCs w:val="20"/>
         </w:rPr>
-        <w:t>Not sure if I should say birds or wildlife as a whole right here?</w:t>
+        <w:t>One suggestion for a title.</w:t>
       </w:r>
     </w:p>
   </w:comment>
-  <w:comment w:id="1" w:author="Kelsey McCune" w:date="2026-04-01T09:17:00Z" w:initials="KBM">
+  <w:comment w:id="20" w:author="Alex Fisher" w:date="2026-03-31T12:18:00Z" w:initials="AF">
     <w:p>
       <w:r>
         <w:rPr>
@@ -3676,11 +6263,11 @@
           <w:sz w:val="20"/>
           <w:szCs w:val="20"/>
         </w:rPr>
-        <w:t>Good point, I flipped the first sentence to the last so it is going more from broad concept to narrower focal taxa.</w:t>
+        <w:t>Not sure if I should say birds or wildlife as a whole right here?</w:t>
       </w:r>
     </w:p>
   </w:comment>
-  <w:comment w:id="2" w:author="Kelsey McCune" w:date="2026-04-01T10:45:00Z" w:initials="KBM">
+  <w:comment w:id="21" w:author="Kelsey McCune" w:date="2026-04-01T09:17:00Z" w:initials="KBM">
     <w:p>
       <w:r>
         <w:rPr>
@@ -3693,11 +6280,11 @@
           <w:sz w:val="20"/>
           <w:szCs w:val="20"/>
         </w:rPr>
-        <w:t>There is a lot of good content in this section that I think would be better as more developed separate paragraphs.</w:t>
+        <w:t>Good point, I flipped the first sentence to the last so it is going more from broad concept to narrower focal taxa.</w:t>
       </w:r>
     </w:p>
   </w:comment>
-  <w:comment w:id="3" w:author="Kelsey McCune" w:date="2026-04-01T09:59:00Z" w:initials="KBM">
+  <w:comment w:id="39" w:author="Kelsey McCune" w:date="2026-04-08T10:59:00Z" w:initials="KBM">
     <w:p>
       <w:r>
         <w:rPr>
@@ -3710,11 +6297,11 @@
           <w:sz w:val="20"/>
           <w:szCs w:val="20"/>
         </w:rPr>
-        <w:t>I think an important way to frame the risk of chickens (and other domestic animals) is that they are a bridge species for zoonotic disease between wildlife and humans. Check out the Gamble et al., 2023 &amp; Hassel et al., 2017 papers I added to your GitHub</w:t>
+        <w:t>I added these paper to your github</w:t>
       </w:r>
     </w:p>
   </w:comment>
-  <w:comment w:id="4" w:author="Alex Fisher" w:date="2026-04-06T21:04:00Z" w:initials="AF">
+  <w:comment w:id="59" w:author="Kelsey McCune" w:date="2026-04-08T10:59:00Z" w:initials="KBM">
     <w:p>
       <w:r>
         <w:rPr>
@@ -3727,12 +6314,63 @@
           <w:sz w:val="20"/>
           <w:szCs w:val="20"/>
         </w:rPr>
+        <w:t>Add sentence here about the potential severe impacts of disease on bird populations. I added to your Github some papers by Kilpatrick on WNV impacts on birds. Also a paper by Lees about State off the World's Birds that has a section on disease.</w:t>
+      </w:r>
+    </w:p>
+  </w:comment>
+  <w:comment w:id="75" w:author="Kelsey McCune" w:date="2026-04-01T10:45:00Z" w:initials="KBM">
+    <w:p>
+      <w:r>
+        <w:rPr>
+          <w:rStyle w:val="CommentReference"/>
+        </w:rPr>
+        <w:annotationRef/>
+      </w:r>
+      <w:r>
+        <w:rPr>
+          <w:sz w:val="20"/>
+          <w:szCs w:val="20"/>
+        </w:rPr>
+        <w:t>There is a lot of good content in this section that I think would be better as more developed separate paragraphs.</w:t>
+      </w:r>
+    </w:p>
+  </w:comment>
+  <w:comment w:id="78" w:author="Kelsey McCune" w:date="2026-04-01T09:59:00Z" w:initials="KBM">
+    <w:p>
+      <w:r>
+        <w:rPr>
+          <w:rStyle w:val="CommentReference"/>
+        </w:rPr>
+        <w:annotationRef/>
+      </w:r>
+      <w:r>
+        <w:rPr>
+          <w:sz w:val="20"/>
+          <w:szCs w:val="20"/>
+        </w:rPr>
+        <w:t>I think an important way to frame the risk of chickens (and other domestic animals) is that they are a bridge species for zoonotic disease between wildlife and humans. Check out the Gamble et al., 2023 &amp; Hassel et al., 2017 papers I added to your GitHub</w:t>
+      </w:r>
+    </w:p>
+  </w:comment>
+  <w:comment w:id="79" w:author="Alex Fisher" w:date="2026-04-06T21:04:00Z" w:initials="AF">
+    <w:p>
+      <w:r>
+        <w:rPr>
+          <w:rStyle w:val="CommentReference"/>
+        </w:rPr>
+        <w:annotationRef/>
+      </w:r>
+      <w:r>
+        <w:rPr>
+          <w:sz w:val="20"/>
+          <w:szCs w:val="20"/>
+        </w:rPr>
         <w:t>Do I still want to mention E. coli?</w:t>
       </w:r>
     </w:p>
     <w:p/>
   </w:comment>
-  <w:comment w:id="5" w:author="Kelsey McCune" w:date="2026-03-24T09:01:00Z" w:initials="KBM">
+  <w:comment w:id="80" w:author="Kelsey McCune" w:date="2026-04-08T11:25:00Z" w:initials="KBM">
     <w:p>
       <w:r>
         <w:rPr>
@@ -3745,11 +6383,11 @@
           <w:sz w:val="20"/>
           <w:szCs w:val="20"/>
         </w:rPr>
-        <w:t xml:space="preserve">Yes, this is the general content that is needed for the last paragraph. We will tweak this paragraph more as we refine the rest of the intro, but one thing to think about is why is the southeastern US the right place to fill this gap in knowledge? </w:t>
+        <w:t>Let's leave e. coli out of this grant proposal.</w:t>
       </w:r>
     </w:p>
   </w:comment>
-  <w:comment w:id="6" w:author="Alex Fisher" w:date="2026-03-24T11:25:00Z" w:initials="AF">
+  <w:comment w:id="114" w:author="Kelsey McCune" w:date="2026-04-08T11:31:00Z" w:initials="KBM">
     <w:p>
       <w:r>
         <w:rPr>
@@ -3762,11 +6400,11 @@
           <w:sz w:val="20"/>
           <w:szCs w:val="20"/>
         </w:rPr>
-        <w:t xml:space="preserve">high seasonal condition variation, lots of agriculture, wildlife interest groups and suburban sprawl. </w:t>
+        <w:t>Let's delete this content on the human dimensions aspect as not relevant for this grant proposal.</w:t>
       </w:r>
     </w:p>
   </w:comment>
-  <w:comment w:id="7" w:author="Kelsey McCune" w:date="2026-04-01T10:44:00Z" w:initials="KBM">
+  <w:comment w:id="121" w:author="Kelsey McCune" w:date="2026-04-01T10:44:00Z" w:initials="KBM">
     <w:p>
       <w:r>
         <w:rPr>
@@ -3783,7 +6421,7 @@
       </w:r>
     </w:p>
   </w:comment>
-  <w:comment w:id="8" w:author="Kelsey McCune" w:date="2026-04-01T11:08:00Z" w:initials="KBM">
+  <w:comment w:id="122" w:author="Kelsey McCune" w:date="2026-04-08T11:41:00Z" w:initials="KBM">
     <w:p>
       <w:r>
         <w:rPr>
@@ -3796,11 +6434,11 @@
           <w:sz w:val="20"/>
           <w:szCs w:val="20"/>
         </w:rPr>
-        <w:t>Awesome, this is all great support for why the southeast is an ideal focal region. I think you should break this up into multiple sentences though and provide citations for each.  You can use the Welch et al 2019 salmonella paper that I added to your GitHub. I also added one (Harrigan et al 2014) on WNV and predicted climate change because it shows AL getting warmer, which according to the Welch paper will also help salmonella persist.</w:t>
+        <w:t>We actually don't need this content in the grant proposal because we are not talking about/asking for funding for the RFID setup.</w:t>
       </w:r>
     </w:p>
   </w:comment>
-  <w:comment w:id="9" w:author="Alex Fisher" w:date="2026-04-06T21:07:00Z" w:initials="AF">
+  <w:comment w:id="130" w:author="Kelsey McCune" w:date="2026-04-08T15:33:00Z" w:initials="KBM">
     <w:p>
       <w:r>
         <w:rPr>
@@ -3813,11 +6451,11 @@
           <w:sz w:val="20"/>
           <w:szCs w:val="20"/>
         </w:rPr>
-        <w:t xml:space="preserve">Added this sentence to introduce the parameters of the entry survey </w:t>
+        <w:t>I think this last paragraph of the background literature section should say what you plan to do to address the gap in knowledge you describe from the literature.</w:t>
       </w:r>
     </w:p>
   </w:comment>
-  <w:comment w:id="10" w:author="Kelsey McCune" w:date="2026-03-24T09:02:00Z" w:initials="KBM">
+  <w:comment w:id="166" w:author="Kelsey McCune" w:date="2026-04-08T15:58:00Z" w:initials="KBM">
     <w:p>
       <w:r>
         <w:rPr>
@@ -3830,7 +6468,58 @@
           <w:sz w:val="20"/>
           <w:szCs w:val="20"/>
         </w:rPr>
-        <w:t xml:space="preserve">Now at the end of the intro consider whether you have given enough information to set up all aspects of your research? </w:t>
+        <w:t>Not sure we need to include this.</w:t>
+      </w:r>
+    </w:p>
+  </w:comment>
+  <w:comment w:id="174" w:author="Kelsey McCune" w:date="2026-04-08T16:02:00Z" w:initials="KBM">
+    <w:p>
+      <w:r>
+        <w:rPr>
+          <w:rStyle w:val="CommentReference"/>
+        </w:rPr>
+        <w:annotationRef/>
+      </w:r>
+      <w:r>
+        <w:rPr>
+          <w:sz w:val="20"/>
+          <w:szCs w:val="20"/>
+        </w:rPr>
+        <w:t>Add details for these methods.</w:t>
+      </w:r>
+    </w:p>
+  </w:comment>
+  <w:comment w:id="228" w:author="Kelsey McCune" w:date="2026-04-08T16:09:00Z" w:initials="KBM">
+    <w:p>
+      <w:r>
+        <w:rPr>
+          <w:rStyle w:val="CommentReference"/>
+        </w:rPr>
+        <w:annotationRef/>
+      </w:r>
+      <w:r>
+        <w:rPr>
+          <w:sz w:val="20"/>
+          <w:szCs w:val="20"/>
+        </w:rPr>
+        <w:t>Not 12?</w:t>
+      </w:r>
+    </w:p>
+  </w:comment>
+  <w:comment w:id="231" w:author="Kelsey McCune" w:date="2026-04-08T15:31:00Z" w:initials="KBM">
+    <w:p>
+      <w:r>
+        <w:rPr>
+          <w:rStyle w:val="CommentReference"/>
+        </w:rPr>
+        <w:annotationRef/>
+      </w:r>
+      <w:r>
+        <w:rPr>
+          <w:sz w:val="20"/>
+          <w:szCs w:val="20"/>
+        </w:rPr>
+        <w:t>I moved some text from the background literature section to here. We will still need to edit this, but I think the content about the human dimensions and benefits of birds/wildlife watching would go well here.</w:t>
       </w:r>
     </w:p>
   </w:comment>
@@ -3839,49 +6528,67 @@
 
 <file path=word/commentsExtended.xml><?xml version="1.0" encoding="utf-8"?>
 <w15:commentsEx xmlns:wpc="http://schemas.microsoft.com/office/word/2010/wordprocessingCanvas" xmlns:cx="http://schemas.microsoft.com/office/drawing/2014/chartex" xmlns:cx1="http://schemas.microsoft.com/office/drawing/2015/9/8/chartex" xmlns:cx2="http://schemas.microsoft.com/office/drawing/2015/10/21/chartex" xmlns:cx3="http://schemas.microsoft.com/office/drawing/2016/5/9/chartex" xmlns:cx4="http://schemas.microsoft.com/office/drawing/2016/5/10/chartex" xmlns:cx5="http://schemas.microsoft.com/office/drawing/2016/5/11/chartex" xmlns:cx6="http://schemas.microsoft.com/office/drawing/2016/5/12/chartex" xmlns:cx7="http://schemas.microsoft.com/office/drawing/2016/5/13/chartex" xmlns:cx8="http://schemas.microsoft.com/office/drawing/2016/5/14/chartex" xmlns:mc="http://schemas.openxmlformats.org/markup-compatibility/2006" xmlns:aink="http://schemas.microsoft.com/office/drawing/2016/ink" xmlns:am3d="http://schemas.microsoft.com/office/drawing/2017/model3d" xmlns:o="urn:schemas-microsoft-com:office:office" xmlns:oel="http://schemas.microsoft.com/office/2019/extlst" xmlns:r="http://schemas.openxmlformats.org/officeDocument/2006/relationships" xmlns:m="http://schemas.openxmlformats.org/officeDocument/2006/math" xmlns:v="urn:schemas-microsoft-com:vml" xmlns:wp14="http://schemas.microsoft.com/office/word/2010/wordprocessingDrawing" xmlns:wp="http://schemas.openxmlformats.org/drawingml/2006/wordprocessingDrawing" xmlns:w10="urn:schemas-microsoft-com:office:word" xmlns:w="http://schemas.openxmlformats.org/wordprocessingml/2006/main" xmlns:w14="http://schemas.microsoft.com/office/word/2010/wordml" xmlns:w15="http://schemas.microsoft.com/office/word/2012/wordml" xmlns:w16cex="http://schemas.microsoft.com/office/word/2018/wordml/cex" xmlns:w16cid="http://schemas.microsoft.com/office/word/2016/wordml/cid" xmlns:w16="http://schemas.microsoft.com/office/word/2018/wordml" xmlns:w16du="http://schemas.microsoft.com/office/word/2023/wordml/word16du" xmlns:w16sdtdh="http://schemas.microsoft.com/office/word/2020/wordml/sdtdatahash" xmlns:w16sdtfl="http://schemas.microsoft.com/office/word/2024/wordml/sdtformatlock" xmlns:w16se="http://schemas.microsoft.com/office/word/2015/wordml/symex" xmlns:wpg="http://schemas.microsoft.com/office/word/2010/wordprocessingGroup" xmlns:wpi="http://schemas.microsoft.com/office/word/2010/wordprocessingInk" xmlns:wne="http://schemas.microsoft.com/office/word/2006/wordml" xmlns:wps="http://schemas.microsoft.com/office/word/2010/wordprocessingShape" mc:Ignorable="w14 w15 w16se w16cid w16 w16cex w16sdtdh w16sdtfl w16du wp14">
+  <w15:commentEx w15:paraId="4E5EDC12" w15:done="0"/>
   <w15:commentEx w15:paraId="0DF033E9" w15:done="0"/>
   <w15:commentEx w15:paraId="53043B99" w15:paraIdParent="0DF033E9" w15:done="0"/>
+  <w15:commentEx w15:paraId="6AD9E0AF" w15:done="0"/>
+  <w15:commentEx w15:paraId="39D0AD00" w15:done="0"/>
   <w15:commentEx w15:paraId="646F4122" w15:done="0"/>
   <w15:commentEx w15:paraId="1B22AC6A" w15:done="0"/>
   <w15:commentEx w15:paraId="74980A83" w15:paraIdParent="1B22AC6A" w15:done="0"/>
-  <w15:commentEx w15:paraId="1C3D2A0A" w15:done="0"/>
-  <w15:commentEx w15:paraId="718278B4" w15:paraIdParent="1C3D2A0A" w15:done="0"/>
+  <w15:commentEx w15:paraId="4411D633" w15:paraIdParent="1B22AC6A" w15:done="0"/>
+  <w15:commentEx w15:paraId="18303980" w15:done="0"/>
   <w15:commentEx w15:paraId="355D7EA3" w15:done="0"/>
-  <w15:commentEx w15:paraId="5ED0069C" w15:done="0"/>
-  <w15:commentEx w15:paraId="722814D3" w15:done="0"/>
-  <w15:commentEx w15:paraId="6D9A6EE1" w15:done="0"/>
+  <w15:commentEx w15:paraId="58F21617" w15:paraIdParent="355D7EA3" w15:done="0"/>
+  <w15:commentEx w15:paraId="224448C2" w15:done="0"/>
+  <w15:commentEx w15:paraId="2BA825D7" w15:done="0"/>
+  <w15:commentEx w15:paraId="6E680B7D" w15:done="0"/>
+  <w15:commentEx w15:paraId="37A303D0" w15:done="0"/>
+  <w15:commentEx w15:paraId="7CDF3A25" w15:done="0"/>
 </w15:commentsEx>
 </file>
 
 <file path=word/commentsExtensible.xml><?xml version="1.0" encoding="utf-8"?>
 <w16cex:commentsExtensible xmlns:wpc="http://schemas.microsoft.com/office/word/2010/wordprocessingCanvas" xmlns:cx="http://schemas.microsoft.com/office/drawing/2014/chartex" xmlns:cx1="http://schemas.microsoft.com/office/drawing/2015/9/8/chartex" xmlns:cx2="http://schemas.microsoft.com/office/drawing/2015/10/21/chartex" xmlns:cx3="http://schemas.microsoft.com/office/drawing/2016/5/9/chartex" xmlns:cx4="http://schemas.microsoft.com/office/drawing/2016/5/10/chartex" xmlns:cx5="http://schemas.microsoft.com/office/drawing/2016/5/11/chartex" xmlns:cx6="http://schemas.microsoft.com/office/drawing/2016/5/12/chartex" xmlns:cx7="http://schemas.microsoft.com/office/drawing/2016/5/13/chartex" xmlns:cx8="http://schemas.microsoft.com/office/drawing/2016/5/14/chartex" xmlns:cr="http://schemas.microsoft.com/office/comments/2020/reactions" xmlns:mc="http://schemas.openxmlformats.org/markup-compatibility/2006" xmlns:aink="http://schemas.microsoft.com/office/drawing/2016/ink" xmlns:am3d="http://schemas.microsoft.com/office/drawing/2017/model3d" xmlns:o="urn:schemas-microsoft-com:office:office" xmlns:oel="http://schemas.microsoft.com/office/2019/extlst" xmlns:r="http://schemas.openxmlformats.org/officeDocument/2006/relationships" xmlns:m="http://schemas.openxmlformats.org/officeDocument/2006/math" xmlns:v="urn:schemas-microsoft-com:vml" xmlns:wp14="http://schemas.microsoft.com/office/word/2010/wordprocessingDrawing" xmlns:wp="http://schemas.openxmlformats.org/drawingml/2006/wordprocessingDrawing" xmlns:w10="urn:schemas-microsoft-com:office:word" xmlns:w="http://schemas.openxmlformats.org/wordprocessingml/2006/main" xmlns:w14="http://schemas.microsoft.com/office/word/2010/wordml" xmlns:w15="http://schemas.microsoft.com/office/word/2012/wordml" xmlns:w16cex="http://schemas.microsoft.com/office/word/2018/wordml/cex" xmlns:w16cid="http://schemas.microsoft.com/office/word/2016/wordml/cid" xmlns:w16="http://schemas.microsoft.com/office/word/2018/wordml" xmlns:w16du="http://schemas.microsoft.com/office/word/2023/wordml/word16du" xmlns:w16sdtdh="http://schemas.microsoft.com/office/word/2020/wordml/sdtdatahash" xmlns:w16sdtfl="http://schemas.microsoft.com/office/word/2024/wordml/sdtformatlock" xmlns:w16se="http://schemas.microsoft.com/office/word/2015/wordml/symex" xmlns:wpg="http://schemas.microsoft.com/office/word/2010/wordprocessingGroup" xmlns:wpi="http://schemas.microsoft.com/office/word/2010/wordprocessingInk" xmlns:wne="http://schemas.microsoft.com/office/word/2006/wordml" xmlns:wps="http://schemas.microsoft.com/office/word/2010/wordprocessingShape" mc:Ignorable="w14 w15 w16se w16cid w16 w16cex w16sdtdh w16sdtfl cr w16du wp14">
+  <w16cex:commentExtensible w16cex:durableId="3AE90DB4" w16cex:dateUtc="2026-04-08T15:36:00Z"/>
   <w16cex:commentExtensible w16cex:durableId="00F6496F" w16cex:dateUtc="2026-03-31T17:18:00Z"/>
   <w16cex:commentExtensible w16cex:durableId="4AF9A8E3" w16cex:dateUtc="2026-04-01T14:17:00Z"/>
+  <w16cex:commentExtensible w16cex:durableId="1544030D" w16cex:dateUtc="2026-04-08T15:59:00Z"/>
+  <w16cex:commentExtensible w16cex:durableId="43DE5E3E" w16cex:dateUtc="2026-04-08T15:59:00Z"/>
   <w16cex:commentExtensible w16cex:durableId="5246D4EC" w16cex:dateUtc="2026-04-01T15:45:00Z"/>
   <w16cex:commentExtensible w16cex:durableId="181327B7" w16cex:dateUtc="2026-04-01T14:59:00Z"/>
   <w16cex:commentExtensible w16cex:durableId="70187797" w16cex:dateUtc="2026-04-07T02:04:00Z"/>
-  <w16cex:commentExtensible w16cex:durableId="5441F447" w16cex:dateUtc="2026-03-24T14:01:00Z"/>
-  <w16cex:commentExtensible w16cex:durableId="2129AE12" w16cex:dateUtc="2026-03-24T16:25:00Z"/>
+  <w16cex:commentExtensible w16cex:durableId="0658C33A" w16cex:dateUtc="2026-04-08T16:25:00Z"/>
+  <w16cex:commentExtensible w16cex:durableId="18BAC34D" w16cex:dateUtc="2026-04-08T16:31:00Z"/>
   <w16cex:commentExtensible w16cex:durableId="24163507" w16cex:dateUtc="2026-04-01T15:44:00Z"/>
-  <w16cex:commentExtensible w16cex:durableId="4643176E" w16cex:dateUtc="2026-04-01T16:08:00Z"/>
-  <w16cex:commentExtensible w16cex:durableId="03622969" w16cex:dateUtc="2026-04-07T02:07:00Z"/>
-  <w16cex:commentExtensible w16cex:durableId="6D1D4A8C" w16cex:dateUtc="2026-03-24T14:02:00Z"/>
+  <w16cex:commentExtensible w16cex:durableId="24E83D0C" w16cex:dateUtc="2026-04-08T16:41:00Z"/>
+  <w16cex:commentExtensible w16cex:durableId="7DCA3C0F" w16cex:dateUtc="2026-04-08T20:33:00Z"/>
+  <w16cex:commentExtensible w16cex:durableId="24CE415C" w16cex:dateUtc="2026-04-08T20:58:00Z"/>
+  <w16cex:commentExtensible w16cex:durableId="48AD6E8C" w16cex:dateUtc="2026-04-08T21:02:00Z"/>
+  <w16cex:commentExtensible w16cex:durableId="04365E72" w16cex:dateUtc="2026-04-08T21:09:00Z"/>
+  <w16cex:commentExtensible w16cex:durableId="551F1341" w16cex:dateUtc="2026-04-08T20:31:00Z"/>
 </w16cex:commentsExtensible>
 </file>
 
 <file path=word/commentsIds.xml><?xml version="1.0" encoding="utf-8"?>
 <w16cid:commentsIds xmlns:wpc="http://schemas.microsoft.com/office/word/2010/wordprocessingCanvas" xmlns:cx="http://schemas.microsoft.com/office/drawing/2014/chartex" xmlns:cx1="http://schemas.microsoft.com/office/drawing/2015/9/8/chartex" xmlns:cx2="http://schemas.microsoft.com/office/drawing/2015/10/21/chartex" xmlns:cx3="http://schemas.microsoft.com/office/drawing/2016/5/9/chartex" xmlns:cx4="http://schemas.microsoft.com/office/drawing/2016/5/10/chartex" xmlns:cx5="http://schemas.microsoft.com/office/drawing/2016/5/11/chartex" xmlns:cx6="http://schemas.microsoft.com/office/drawing/2016/5/12/chartex" xmlns:cx7="http://schemas.microsoft.com/office/drawing/2016/5/13/chartex" xmlns:cx8="http://schemas.microsoft.com/office/drawing/2016/5/14/chartex" xmlns:mc="http://schemas.openxmlformats.org/markup-compatibility/2006" xmlns:aink="http://schemas.microsoft.com/office/drawing/2016/ink" xmlns:am3d="http://schemas.microsoft.com/office/drawing/2017/model3d" xmlns:o="urn:schemas-microsoft-com:office:office" xmlns:oel="http://schemas.microsoft.com/office/2019/extlst" xmlns:r="http://schemas.openxmlformats.org/officeDocument/2006/relationships" xmlns:m="http://schemas.openxmlformats.org/officeDocument/2006/math" xmlns:v="urn:schemas-microsoft-com:vml" xmlns:wp14="http://schemas.microsoft.com/office/word/2010/wordprocessingDrawing" xmlns:wp="http://schemas.openxmlformats.org/drawingml/2006/wordprocessingDrawing" xmlns:w10="urn:schemas-microsoft-com:office:word" xmlns:w="http://schemas.openxmlformats.org/wordprocessingml/2006/main" xmlns:w14="http://schemas.microsoft.com/office/word/2010/wordml" xmlns:w15="http://schemas.microsoft.com/office/word/2012/wordml" xmlns:w16cex="http://schemas.microsoft.com/office/word/2018/wordml/cex" xmlns:w16cid="http://schemas.microsoft.com/office/word/2016/wordml/cid" xmlns:w16="http://schemas.microsoft.com/office/word/2018/wordml" xmlns:w16du="http://schemas.microsoft.com/office/word/2023/wordml/word16du" xmlns:w16sdtdh="http://schemas.microsoft.com/office/word/2020/wordml/sdtdatahash" xmlns:w16sdtfl="http://schemas.microsoft.com/office/word/2024/wordml/sdtformatlock" xmlns:w16se="http://schemas.microsoft.com/office/word/2015/wordml/symex" xmlns:wpg="http://schemas.microsoft.com/office/word/2010/wordprocessingGroup" xmlns:wpi="http://schemas.microsoft.com/office/word/2010/wordprocessingInk" xmlns:wne="http://schemas.microsoft.com/office/word/2006/wordml" xmlns:wps="http://schemas.microsoft.com/office/word/2010/wordprocessingShape" mc:Ignorable="w14 w15 w16se w16cid w16 w16cex w16sdtdh w16sdtfl w16du wp14">
+  <w16cid:commentId w16cid:paraId="4E5EDC12" w16cid:durableId="3AE90DB4"/>
   <w16cid:commentId w16cid:paraId="0DF033E9" w16cid:durableId="00F6496F"/>
   <w16cid:commentId w16cid:paraId="53043B99" w16cid:durableId="4AF9A8E3"/>
+  <w16cid:commentId w16cid:paraId="6AD9E0AF" w16cid:durableId="1544030D"/>
+  <w16cid:commentId w16cid:paraId="39D0AD00" w16cid:durableId="43DE5E3E"/>
   <w16cid:commentId w16cid:paraId="646F4122" w16cid:durableId="5246D4EC"/>
   <w16cid:commentId w16cid:paraId="1B22AC6A" w16cid:durableId="181327B7"/>
   <w16cid:commentId w16cid:paraId="74980A83" w16cid:durableId="70187797"/>
-  <w16cid:commentId w16cid:paraId="1C3D2A0A" w16cid:durableId="5441F447"/>
-  <w16cid:commentId w16cid:paraId="718278B4" w16cid:durableId="2129AE12"/>
+  <w16cid:commentId w16cid:paraId="4411D633" w16cid:durableId="0658C33A"/>
+  <w16cid:commentId w16cid:paraId="18303980" w16cid:durableId="18BAC34D"/>
   <w16cid:commentId w16cid:paraId="355D7EA3" w16cid:durableId="24163507"/>
-  <w16cid:commentId w16cid:paraId="5ED0069C" w16cid:durableId="4643176E"/>
-  <w16cid:commentId w16cid:paraId="722814D3" w16cid:durableId="03622969"/>
-  <w16cid:commentId w16cid:paraId="6D9A6EE1" w16cid:durableId="6D1D4A8C"/>
+  <w16cid:commentId w16cid:paraId="58F21617" w16cid:durableId="24E83D0C"/>
+  <w16cid:commentId w16cid:paraId="224448C2" w16cid:durableId="7DCA3C0F"/>
+  <w16cid:commentId w16cid:paraId="2BA825D7" w16cid:durableId="24CE415C"/>
+  <w16cid:commentId w16cid:paraId="6E680B7D" w16cid:durableId="48AD6E8C"/>
+  <w16cid:commentId w16cid:paraId="37A303D0" w16cid:durableId="04365E72"/>
+  <w16cid:commentId w16cid:paraId="7CDF3A25" w16cid:durableId="551F1341"/>
 </w16cid:commentsIds>
 </file>
 
@@ -4212,11 +6919,11 @@
 
 <file path=word/people.xml><?xml version="1.0" encoding="utf-8"?>
 <w15:people xmlns:wpc="http://schemas.microsoft.com/office/word/2010/wordprocessingCanvas" xmlns:cx="http://schemas.microsoft.com/office/drawing/2014/chartex" xmlns:cx1="http://schemas.microsoft.com/office/drawing/2015/9/8/chartex" xmlns:cx2="http://schemas.microsoft.com/office/drawing/2015/10/21/chartex" xmlns:cx3="http://schemas.microsoft.com/office/drawing/2016/5/9/chartex" xmlns:cx4="http://schemas.microsoft.com/office/drawing/2016/5/10/chartex" xmlns:cx5="http://schemas.microsoft.com/office/drawing/2016/5/11/chartex" xmlns:cx6="http://schemas.microsoft.com/office/drawing/2016/5/12/chartex" xmlns:cx7="http://schemas.microsoft.com/office/drawing/2016/5/13/chartex" xmlns:cx8="http://schemas.microsoft.com/office/drawing/2016/5/14/chartex" xmlns:mc="http://schemas.openxmlformats.org/markup-compatibility/2006" xmlns:aink="http://schemas.microsoft.com/office/drawing/2016/ink" xmlns:am3d="http://schemas.microsoft.com/office/drawing/2017/model3d" xmlns:o="urn:schemas-microsoft-com:office:office" xmlns:oel="http://schemas.microsoft.com/office/2019/extlst" xmlns:r="http://schemas.openxmlformats.org/officeDocument/2006/relationships" xmlns:m="http://schemas.openxmlformats.org/officeDocument/2006/math" xmlns:v="urn:schemas-microsoft-com:vml" xmlns:wp14="http://schemas.microsoft.com/office/word/2010/wordprocessingDrawing" xmlns:wp="http://schemas.openxmlformats.org/drawingml/2006/wordprocessingDrawing" xmlns:w10="urn:schemas-microsoft-com:office:word" xmlns:w="http://schemas.openxmlformats.org/wordprocessingml/2006/main" xmlns:w14="http://schemas.microsoft.com/office/word/2010/wordml" xmlns:w15="http://schemas.microsoft.com/office/word/2012/wordml" xmlns:w16cex="http://schemas.microsoft.com/office/word/2018/wordml/cex" xmlns:w16cid="http://schemas.microsoft.com/office/word/2016/wordml/cid" xmlns:w16="http://schemas.microsoft.com/office/word/2018/wordml" xmlns:w16du="http://schemas.microsoft.com/office/word/2023/wordml/word16du" xmlns:w16sdtdh="http://schemas.microsoft.com/office/word/2020/wordml/sdtdatahash" xmlns:w16sdtfl="http://schemas.microsoft.com/office/word/2024/wordml/sdtformatlock" xmlns:w16se="http://schemas.microsoft.com/office/word/2015/wordml/symex" xmlns:wpg="http://schemas.microsoft.com/office/word/2010/wordprocessingGroup" xmlns:wpi="http://schemas.microsoft.com/office/word/2010/wordprocessingInk" xmlns:wne="http://schemas.microsoft.com/office/word/2006/wordml" xmlns:wps="http://schemas.microsoft.com/office/word/2010/wordprocessingShape" mc:Ignorable="w14 w15 w16se w16cid w16 w16cex w16sdtdh w16sdtfl w16du wp14">
+  <w15:person w15:author="Kelsey McCune">
+    <w15:presenceInfo w15:providerId="None" w15:userId="Kelsey McCune"/>
+  </w15:person>
   <w15:person w15:author="Alex Fisher">
     <w15:presenceInfo w15:providerId="AD" w15:userId="S::amf0080@auburn.edu::18480bde-8768-4851-bd71-24a6dd2d4725"/>
-  </w15:person>
-  <w15:person w15:author="Kelsey McCune">
-    <w15:presenceInfo w15:providerId="None" w15:userId="Kelsey McCune"/>
   </w15:person>
 </w15:people>
 </file>
@@ -4736,6 +7443,7 @@
   <w:style w:type="character" w:default="1" w:styleId="DefaultParagraphFont">
     <w:name w:val="Default Paragraph Font"/>
     <w:uiPriority w:val="1"/>
+    <w:semiHidden/>
     <w:unhideWhenUsed/>
   </w:style>
   <w:style w:type="table" w:default="1" w:styleId="TableNormal">

</xml_diff>

<commit_message>
updated doc's added survey templates
</commit_message>
<xml_diff>
--- a/Documents /AlexFisher.2026_Full_Research_Proposal AAV.docx
+++ b/Documents /AlexFisher.2026_Full_Research_Proposal AAV.docx
@@ -3295,23 +3295,7 @@
           <w:sz w:val="22"/>
           <w:szCs w:val="22"/>
         </w:rPr>
-        <w:t xml:space="preserve">While many </w:t>
-      </w:r>
-      <w:proofErr w:type="gramStart"/>
-      <w:r>
-        <w:rPr>
-          <w:sz w:val="22"/>
-          <w:szCs w:val="22"/>
-        </w:rPr>
-        <w:t>bird</w:t>
-      </w:r>
-      <w:proofErr w:type="gramEnd"/>
-      <w:r>
-        <w:rPr>
-          <w:sz w:val="22"/>
-          <w:szCs w:val="22"/>
-        </w:rPr>
-        <w:t xml:space="preserve"> species have adapted to survive and even depend on human-modified landscapes, the ecological impacts of these co-adaptations, and how long-term proximity to humans, domestic animals, and shared resources </w:t>
+        <w:t xml:space="preserve">While many bird species have adapted to survive and even depend on human-modified landscapes, the ecological impacts of these co-adaptations, and how long-term proximity to humans, domestic animals, and shared resources </w:t>
       </w:r>
       <w:r>
         <w:rPr>
@@ -7100,23 +7084,7 @@
           <w:sz w:val="22"/>
           <w:szCs w:val="22"/>
         </w:rPr>
-        <w:t xml:space="preserve">Barbett, Lea, Edward </w:t>
-      </w:r>
-      <w:proofErr w:type="spellStart"/>
-      <w:r>
-        <w:rPr>
-          <w:sz w:val="22"/>
-          <w:szCs w:val="22"/>
-        </w:rPr>
-        <w:t>Stupple</w:t>
-      </w:r>
-      <w:proofErr w:type="spellEnd"/>
-      <w:r>
-        <w:rPr>
-          <w:sz w:val="22"/>
-          <w:szCs w:val="22"/>
-        </w:rPr>
-        <w:t xml:space="preserve">, Michael Sweet, Malcolm Schofield, and Miles Richardson. “Measuring Actions for Nature—Development and Validation of a Pro-Nature Conservation </w:t>
+        <w:t xml:space="preserve">Barbett, Lea, Edward Stupple, Michael Sweet, Malcolm Schofield, and Miles Richardson. “Measuring Actions for Nature—Development and Validation of a Pro-Nature Conservation </w:t>
       </w:r>
       <w:proofErr w:type="spellStart"/>
       <w:r>
@@ -7532,31 +7500,7 @@
             <w:sz w:val="22"/>
             <w:szCs w:val="22"/>
           </w:rPr>
-          <w:t>https://</w:t>
-        </w:r>
-        <w:r>
-          <w:rPr>
-            <w:rStyle w:val="Hyperlink"/>
-            <w:sz w:val="22"/>
-            <w:szCs w:val="22"/>
-          </w:rPr>
-          <w:t>doi</w:t>
-        </w:r>
-        <w:r>
-          <w:rPr>
-            <w:rStyle w:val="Hyperlink"/>
-            <w:sz w:val="22"/>
-            <w:szCs w:val="22"/>
-          </w:rPr>
-          <w:t>.org/</w:t>
-        </w:r>
-        <w:r>
-          <w:rPr>
-            <w:rStyle w:val="Hyperlink"/>
-            <w:sz w:val="22"/>
-            <w:szCs w:val="22"/>
-          </w:rPr>
-          <w:t>10.1111/2041-210X.12504</w:t>
+          <w:t>https://doi.org/10.1111/2041-210X.12504</w:t>
         </w:r>
       </w:hyperlink>
       <w:r>
@@ -7659,23 +7603,7 @@
           <w:sz w:val="22"/>
           <w:szCs w:val="22"/>
         </w:rPr>
-        <w:t xml:space="preserve">, 1st ed., edited by Jennifer C. Owen, Dana M. Hawley, and Kathryn P. </w:t>
-      </w:r>
-      <w:proofErr w:type="spellStart"/>
-      <w:r>
-        <w:rPr>
-          <w:sz w:val="22"/>
-          <w:szCs w:val="22"/>
-        </w:rPr>
-        <w:t>Huyvaert</w:t>
-      </w:r>
-      <w:proofErr w:type="spellEnd"/>
-      <w:r>
-        <w:rPr>
-          <w:sz w:val="22"/>
-          <w:szCs w:val="22"/>
-        </w:rPr>
-        <w:t xml:space="preserve">. Oxford University </w:t>
+        <w:t xml:space="preserve">, 1st ed., edited by Jennifer C. Owen, Dana M. Hawley, and Kathryn P. Huyvaert. Oxford University </w:t>
       </w:r>
       <w:proofErr w:type="spellStart"/>
       <w:r>
@@ -7731,23 +7659,7 @@
           <w:sz w:val="22"/>
           <w:szCs w:val="22"/>
         </w:rPr>
-        <w:t xml:space="preserve">Hassell, James M., Michael </w:t>
-      </w:r>
-      <w:proofErr w:type="spellStart"/>
-      <w:r>
-        <w:rPr>
-          <w:sz w:val="22"/>
-          <w:szCs w:val="22"/>
-        </w:rPr>
-        <w:t>Begon</w:t>
-      </w:r>
-      <w:proofErr w:type="spellEnd"/>
-      <w:r>
-        <w:rPr>
-          <w:sz w:val="22"/>
-          <w:szCs w:val="22"/>
-        </w:rPr>
-        <w:t xml:space="preserve">, Melissa J. Ward, and Eric M. Fèvre. “Urbanization and Disease Emergence: Dynamics at the Wildlife–Livestock–Human Interface.” </w:t>
+        <w:t xml:space="preserve">Hassell, James M., Michael Begon, Melissa J. Ward, and Eric M. Fèvre. “Urbanization and Disease Emergence: Dynamics at the Wildlife–Livestock–Human Interface.” </w:t>
       </w:r>
       <w:r>
         <w:rPr>
@@ -7796,23 +7708,7 @@
           <w:sz w:val="22"/>
           <w:szCs w:val="22"/>
         </w:rPr>
-        <w:t xml:space="preserve">Hotez, Peter J., Kristy O. Murray, and Pierre </w:t>
-      </w:r>
-      <w:proofErr w:type="spellStart"/>
-      <w:r>
-        <w:rPr>
-          <w:sz w:val="22"/>
-          <w:szCs w:val="22"/>
-        </w:rPr>
-        <w:t>Buekens</w:t>
-      </w:r>
-      <w:proofErr w:type="spellEnd"/>
-      <w:r>
-        <w:rPr>
-          <w:sz w:val="22"/>
-          <w:szCs w:val="22"/>
-        </w:rPr>
-        <w:t xml:space="preserve">. “The Gulf Coast: A New American Underbelly of Tropical Diseases and Poverty.” </w:t>
+        <w:t xml:space="preserve">Hotez, Peter J., Kristy O. Murray, and Pierre Buekens. “The Gulf Coast: A New American Underbelly of Tropical Diseases and Poverty.” </w:t>
       </w:r>
       <w:proofErr w:type="spellStart"/>
       <w:r>
@@ -8131,23 +8027,7 @@
           <w:sz w:val="22"/>
           <w:szCs w:val="22"/>
         </w:rPr>
-        <w:t xml:space="preserve">Edited by Jennifer C. Owen, Dana M. Hawley, and Kathryn P. </w:t>
-      </w:r>
-      <w:proofErr w:type="spellStart"/>
-      <w:r>
-        <w:rPr>
-          <w:sz w:val="22"/>
-          <w:szCs w:val="22"/>
-        </w:rPr>
-        <w:t>Huyvaert</w:t>
-      </w:r>
-      <w:proofErr w:type="spellEnd"/>
-      <w:r>
-        <w:rPr>
-          <w:sz w:val="22"/>
-          <w:szCs w:val="22"/>
-        </w:rPr>
-        <w:t>. Oxford: Oxford University Press, 2021.</w:t>
+        <w:t>Edited by Jennifer C. Owen, Dana M. Hawley, and Kathryn P. Huyvaert. Oxford: Oxford University Press, 2021.</w:t>
       </w:r>
     </w:p>
     <w:p>
@@ -8412,23 +8292,7 @@
           <w:sz w:val="22"/>
           <w:szCs w:val="22"/>
         </w:rPr>
-        <w:t xml:space="preserve">Pocock, Michael J. O., Iain Hamlin, Jennifer </w:t>
-      </w:r>
-      <w:proofErr w:type="spellStart"/>
-      <w:r>
-        <w:rPr>
-          <w:sz w:val="22"/>
-          <w:szCs w:val="22"/>
-        </w:rPr>
-        <w:t>Christelow</w:t>
-      </w:r>
-      <w:proofErr w:type="spellEnd"/>
-      <w:r>
-        <w:rPr>
-          <w:sz w:val="22"/>
-          <w:szCs w:val="22"/>
-        </w:rPr>
-        <w:t xml:space="preserve">, Holli‐Anne Passmore, and Miles Richardson. “The Benefits of Citizen Science and Nature‐noticing Activities for Well‐being, Nature Connectedness and Pro‐nature Conservation </w:t>
+        <w:t xml:space="preserve">Pocock, Michael J. O., Iain Hamlin, Jennifer Christelow, Holli‐Anne Passmore, and Miles Richardson. “The Benefits of Citizen Science and Nature‐noticing Activities for Well‐being, Nature Connectedness and Pro‐nature Conservation </w:t>
       </w:r>
       <w:proofErr w:type="spellStart"/>
       <w:r>
@@ -8575,21 +8439,12 @@
           <w:szCs w:val="22"/>
         </w:rPr>
       </w:pPr>
-      <w:proofErr w:type="spellStart"/>
-      <w:r>
-        <w:rPr>
-          <w:sz w:val="22"/>
-          <w:szCs w:val="22"/>
-        </w:rPr>
-        <w:t>Şekercioğlu</w:t>
-      </w:r>
-      <w:proofErr w:type="spellEnd"/>
-      <w:r>
-        <w:rPr>
-          <w:sz w:val="22"/>
-          <w:szCs w:val="22"/>
-        </w:rPr>
-        <w:t xml:space="preserve">, </w:t>
+      <w:r>
+        <w:rPr>
+          <w:sz w:val="22"/>
+          <w:szCs w:val="22"/>
+        </w:rPr>
+        <w:t xml:space="preserve">Şekercioğlu, </w:t>
       </w:r>
       <w:proofErr w:type="spellStart"/>
       <w:r>
@@ -8716,23 +8571,7 @@
           <w:sz w:val="22"/>
           <w:szCs w:val="22"/>
         </w:rPr>
-        <w:t xml:space="preserve">Van De </w:t>
-      </w:r>
-      <w:proofErr w:type="spellStart"/>
-      <w:r>
-        <w:rPr>
-          <w:sz w:val="22"/>
-          <w:szCs w:val="22"/>
-        </w:rPr>
-        <w:t>Vuurst</w:t>
-      </w:r>
-      <w:proofErr w:type="spellEnd"/>
-      <w:r>
-        <w:rPr>
-          <w:sz w:val="22"/>
-          <w:szCs w:val="22"/>
-        </w:rPr>
-        <w:t xml:space="preserve">, Paige, and Luis E. Escobar. “Climate Change and Infectious Disease: A Review of Evidence and Research Trends.” </w:t>
+        <w:t xml:space="preserve">Van De Vuurst, Paige, and Luis E. Escobar. “Climate Change and Infectious Disease: A Review of Evidence and Research Trends.” </w:t>
       </w:r>
       <w:r>
         <w:rPr>
@@ -10971,7 +10810,26 @@
           <w:sz w:val="22"/>
           <w:szCs w:val="22"/>
         </w:rPr>
-        <w:t xml:space="preserve"> | Science of Nature I/II Lab, Auburn University | Fall 2025 – Present Teaching assistant for undergraduate biology laboratory sections under the supervision of Dr. Amy Counterman.</w:t>
+        <w:t xml:space="preserve"> | Science of Nature I/II Lab, Auburn University | Fall 2025 – Present </w:t>
+      </w:r>
+    </w:p>
+    <w:p>
+      <w:pPr>
+        <w:widowControl w:val="0"/>
+        <w:jc w:val="both"/>
+        <w:rPr>
+          <w:color w:val="000000" w:themeColor="text1"/>
+          <w:sz w:val="22"/>
+          <w:szCs w:val="22"/>
+        </w:rPr>
+      </w:pPr>
+      <w:r>
+        <w:rPr>
+          <w:color w:val="000000" w:themeColor="text1"/>
+          <w:sz w:val="22"/>
+          <w:szCs w:val="22"/>
+        </w:rPr>
+        <w:t>Teaching assistant for undergraduate biology laboratory sections under the supervision of Dr. Amy Counterman.</w:t>
       </w:r>
     </w:p>
     <w:p>

</xml_diff>